<commit_message>
bai tap tuan 3. cau 1 va cau 2
</commit_message>
<xml_diff>
--- a/Tuan2/NguyenTrongNghia_22646031_Tuan02.docx
+++ b/Tuan2/NguyenTrongNghia_22646031_Tuan02.docx
@@ -1,6 +1,6 @@
 
 <file path=word/document.xml><?xml version="1.0" encoding="utf-8"?>
-<w:document xmlns:wpc="http://schemas.microsoft.com/office/word/2010/wordprocessingCanvas" xmlns:cx="http://schemas.microsoft.com/office/drawing/2014/chartex" xmlns:cx1="http://schemas.microsoft.com/office/drawing/2015/9/8/chartex" xmlns:cx2="http://schemas.microsoft.com/office/drawing/2015/10/21/chartex" xmlns:cx3="http://schemas.microsoft.com/office/drawing/2016/5/9/chartex" xmlns:cx4="http://schemas.microsoft.com/office/drawing/2016/5/10/chartex" xmlns:cx5="http://schemas.microsoft.com/office/drawing/2016/5/11/chartex" xmlns:cx6="http://schemas.microsoft.com/office/drawing/2016/5/12/chartex" xmlns:cx7="http://schemas.microsoft.com/office/drawing/2016/5/13/chartex" xmlns:cx8="http://schemas.microsoft.com/office/drawing/2016/5/14/chartex" xmlns:mc="http://schemas.openxmlformats.org/markup-compatibility/2006" xmlns:aink="http://schemas.microsoft.com/office/drawing/2016/ink" xmlns:am3d="http://schemas.microsoft.com/office/drawing/2017/model3d" xmlns:o="urn:schemas-microsoft-com:office:office" xmlns:oel="http://schemas.microsoft.com/office/2019/extlst" xmlns:r="http://schemas.openxmlformats.org/officeDocument/2006/relationships" xmlns:m="http://schemas.openxmlformats.org/officeDocument/2006/math" xmlns:v="urn:schemas-microsoft-com:vml" xmlns:wp14="http://schemas.microsoft.com/office/word/2010/wordprocessingDrawing" xmlns:wp="http://schemas.openxmlformats.org/drawingml/2006/wordprocessingDrawing" xmlns:w10="urn:schemas-microsoft-com:office:word" xmlns:w="http://schemas.openxmlformats.org/wordprocessingml/2006/main" xmlns:w14="http://schemas.microsoft.com/office/word/2010/wordml" xmlns:w15="http://schemas.microsoft.com/office/word/2012/wordml" xmlns:w16cex="http://schemas.microsoft.com/office/word/2018/wordml/cex" xmlns:w16cid="http://schemas.microsoft.com/office/word/2016/wordml/cid" xmlns:w16="http://schemas.microsoft.com/office/word/2018/wordml" xmlns:w16sdtdh="http://schemas.microsoft.com/office/word/2020/wordml/sdtdatahash" xmlns:w16se="http://schemas.microsoft.com/office/word/2015/wordml/symex" xmlns:wpg="http://schemas.microsoft.com/office/word/2010/wordprocessingGroup" xmlns:wpi="http://schemas.microsoft.com/office/word/2010/wordprocessingInk" xmlns:wne="http://schemas.microsoft.com/office/word/2006/wordml" xmlns:wps="http://schemas.microsoft.com/office/word/2010/wordprocessingShape" mc:Ignorable="w14 w15 w16se w16cid w16 w16cex w16sdtdh wp14">
+<w:document xmlns:wpc="http://schemas.microsoft.com/office/word/2010/wordprocessingCanvas" xmlns:mc="http://schemas.openxmlformats.org/markup-compatibility/2006" xmlns:o="urn:schemas-microsoft-com:office:office" xmlns:r="http://schemas.openxmlformats.org/officeDocument/2006/relationships" xmlns:m="http://schemas.openxmlformats.org/officeDocument/2006/math" xmlns:v="urn:schemas-microsoft-com:vml" xmlns:wp14="http://schemas.microsoft.com/office/word/2010/wordprocessingDrawing" xmlns:wp="http://schemas.openxmlformats.org/drawingml/2006/wordprocessingDrawing" xmlns:w10="urn:schemas-microsoft-com:office:word" xmlns:w="http://schemas.openxmlformats.org/wordprocessingml/2006/main" xmlns:w14="http://schemas.microsoft.com/office/word/2010/wordml" xmlns:wpg="http://schemas.microsoft.com/office/word/2010/wordprocessingGroup" xmlns:wpi="http://schemas.microsoft.com/office/word/2010/wordprocessingInk" xmlns:wne="http://schemas.microsoft.com/office/word/2006/wordml" xmlns:wps="http://schemas.microsoft.com/office/word/2010/wordprocessingShape" mc:Ignorable="w14 wp14">
   <w:body>
     <w:p>
       <w:pPr>
@@ -94,13 +94,8 @@
         </w:rPr>
       </w:pPr>
       <w:r>
-        <w:t xml:space="preserve">1. Singleton, Factory (method, </w:t>
-      </w:r>
-      <w:proofErr w:type="gramStart"/>
-      <w:r>
-        <w:t>abstract)...</w:t>
-      </w:r>
-      <w:proofErr w:type="gramEnd"/>
+        <w:t>1. Singleton, Factory (method, abstract)...</w:t>
+      </w:r>
     </w:p>
     <w:p>
       <w:pPr>
@@ -131,55 +126,6 @@
             <wp:extent cx="5943600" cy="3422073"/>
             <wp:effectExtent l="0" t="0" r="0" b="6985"/>
             <wp:docPr id="1" name="Picture 1"/>
-            <wp:cNvGraphicFramePr>
-              <a:graphicFrameLocks xmlns:a="http://schemas.openxmlformats.org/drawingml/2006/main" noChangeAspect="1"/>
-            </wp:cNvGraphicFramePr>
-            <a:graphic xmlns:a="http://schemas.openxmlformats.org/drawingml/2006/main">
-              <a:graphicData uri="http://schemas.openxmlformats.org/drawingml/2006/picture">
-                <pic:pic xmlns:pic="http://schemas.openxmlformats.org/drawingml/2006/picture">
-                  <pic:nvPicPr>
-                    <pic:cNvPr id="1" name=""/>
-                    <pic:cNvPicPr/>
-                  </pic:nvPicPr>
-                  <pic:blipFill>
-                    <a:blip r:embed="rId5"/>
-                    <a:stretch>
-                      <a:fillRect/>
-                    </a:stretch>
-                  </pic:blipFill>
-                  <pic:spPr>
-                    <a:xfrm>
-                      <a:off x="0" y="0"/>
-                      <a:ext cx="5949610" cy="3425533"/>
-                    </a:xfrm>
-                    <a:prstGeom prst="rect">
-                      <a:avLst/>
-                    </a:prstGeom>
-                  </pic:spPr>
-                </pic:pic>
-              </a:graphicData>
-            </a:graphic>
-          </wp:inline>
-        </w:drawing>
-      </w:r>
-    </w:p>
-    <w:p>
-      <w:pPr>
-        <w:rPr>
-          <w:lang w:val="vi-VN"/>
-        </w:rPr>
-      </w:pPr>
-      <w:r>
-        <w:rPr>
-          <w:noProof/>
-          <w:lang w:val="vi-VN"/>
-        </w:rPr>
-        <w:lastRenderedPageBreak/>
-        <w:drawing>
-          <wp:inline distT="0" distB="0" distL="0" distR="0" wp14:anchorId="5C60E742" wp14:editId="5F8E83D7">
-            <wp:extent cx="5940868" cy="3241675"/>
-            <wp:effectExtent l="0" t="0" r="3175" b="0"/>
-            <wp:docPr id="2" name="Picture 2"/>
             <wp:cNvGraphicFramePr>
               <a:graphicFrameLocks xmlns:a="http://schemas.openxmlformats.org/drawingml/2006/main" noChangeAspect="1"/>
             </wp:cNvGraphicFramePr>
@@ -199,7 +145,7 @@
                   <pic:spPr>
                     <a:xfrm>
                       <a:off x="0" y="0"/>
-                      <a:ext cx="5966073" cy="3255428"/>
+                      <a:ext cx="5949610" cy="3425533"/>
                     </a:xfrm>
                     <a:prstGeom prst="rect">
                       <a:avLst/>
@@ -218,47 +164,16 @@
           <w:lang w:val="vi-VN"/>
         </w:rPr>
       </w:pPr>
-    </w:p>
-    <w:p>
-      <w:pPr>
-        <w:rPr>
-          <w:lang w:val="vi-VN"/>
-        </w:rPr>
-      </w:pPr>
-      <w:r>
-        <w:rPr>
-          <w:lang w:val="vi-VN"/>
-        </w:rPr>
-        <w:t>Kiểm tra xem instance có cùng vị trí trong bộ nhớ hay không để check xem có instance có khởi tạo nhiều lần</w:t>
-      </w:r>
-    </w:p>
-    <w:p>
-      <w:pPr>
-        <w:rPr>
-          <w:b/>
-          <w:bCs/>
-          <w:lang w:val="vi-VN"/>
-        </w:rPr>
-      </w:pPr>
-      <w:r>
-        <w:rPr>
-          <w:b/>
-          <w:bCs/>
-          <w:lang w:val="vi-VN"/>
-        </w:rPr>
-        <w:t>+ Factory pattern</w:t>
-      </w:r>
-    </w:p>
-    <w:p>
       <w:r>
         <w:rPr>
           <w:noProof/>
         </w:rPr>
+        <w:lastRenderedPageBreak/>
         <w:drawing>
-          <wp:inline distT="0" distB="0" distL="0" distR="0" wp14:anchorId="5FF8E3F9" wp14:editId="6A4EC08A">
-            <wp:extent cx="4058216" cy="1247949"/>
-            <wp:effectExtent l="0" t="0" r="0" b="9525"/>
-            <wp:docPr id="3" name="Picture 3"/>
+          <wp:inline distT="0" distB="0" distL="0" distR="0" wp14:anchorId="5C60E742" wp14:editId="5F8E83D7">
+            <wp:extent cx="5940868" cy="3241675"/>
+            <wp:effectExtent l="0" t="0" r="3175" b="0"/>
+            <wp:docPr id="2" name="Picture 2"/>
             <wp:cNvGraphicFramePr>
               <a:graphicFrameLocks xmlns:a="http://schemas.openxmlformats.org/drawingml/2006/main" noChangeAspect="1"/>
             </wp:cNvGraphicFramePr>
@@ -278,7 +193,7 @@
                   <pic:spPr>
                     <a:xfrm>
                       <a:off x="0" y="0"/>
-                      <a:ext cx="4058216" cy="1247949"/>
+                      <a:ext cx="5966073" cy="3255428"/>
                     </a:xfrm>
                     <a:prstGeom prst="rect">
                       <a:avLst/>
@@ -292,16 +207,52 @@
       </w:r>
     </w:p>
     <w:p>
+      <w:pPr>
+        <w:rPr>
+          <w:lang w:val="vi-VN"/>
+        </w:rPr>
+      </w:pPr>
+    </w:p>
+    <w:p>
+      <w:pPr>
+        <w:rPr>
+          <w:lang w:val="vi-VN"/>
+        </w:rPr>
+      </w:pPr>
+      <w:r>
+        <w:rPr>
+          <w:lang w:val="vi-VN"/>
+        </w:rPr>
+        <w:t>Kiểm tra xem instance có cùng vị trí trong bộ nhớ hay không để check xem có instance có khởi tạo nhiều lần</w:t>
+      </w:r>
+    </w:p>
+    <w:p>
+      <w:pPr>
+        <w:rPr>
+          <w:b/>
+          <w:bCs/>
+          <w:lang w:val="vi-VN"/>
+        </w:rPr>
+      </w:pPr>
+      <w:r>
+        <w:rPr>
+          <w:b/>
+          <w:bCs/>
+          <w:lang w:val="vi-VN"/>
+        </w:rPr>
+        <w:t>+ Factory pattern</w:t>
+      </w:r>
+    </w:p>
+    <w:p>
       <w:r>
         <w:rPr>
           <w:noProof/>
         </w:rPr>
-        <w:lastRenderedPageBreak/>
         <w:drawing>
-          <wp:inline distT="0" distB="0" distL="0" distR="0" wp14:anchorId="7EBAA2A3" wp14:editId="69EA6D99">
-            <wp:extent cx="4398818" cy="2544829"/>
-            <wp:effectExtent l="0" t="0" r="1905" b="8255"/>
-            <wp:docPr id="4" name="Picture 4"/>
+          <wp:inline distT="0" distB="0" distL="0" distR="0" wp14:anchorId="5FF8E3F9" wp14:editId="6A4EC08A">
+            <wp:extent cx="4058216" cy="1247949"/>
+            <wp:effectExtent l="0" t="0" r="0" b="9525"/>
+            <wp:docPr id="3" name="Picture 3"/>
             <wp:cNvGraphicFramePr>
               <a:graphicFrameLocks xmlns:a="http://schemas.openxmlformats.org/drawingml/2006/main" noChangeAspect="1"/>
             </wp:cNvGraphicFramePr>
@@ -321,7 +272,7 @@
                   <pic:spPr>
                     <a:xfrm>
                       <a:off x="0" y="0"/>
-                      <a:ext cx="4401264" cy="2546244"/>
+                      <a:ext cx="4058216" cy="1247949"/>
                     </a:xfrm>
                     <a:prstGeom prst="rect">
                       <a:avLst/>
@@ -339,11 +290,12 @@
         <w:rPr>
           <w:noProof/>
         </w:rPr>
+        <w:lastRenderedPageBreak/>
         <w:drawing>
-          <wp:inline distT="0" distB="0" distL="0" distR="0" wp14:anchorId="41F7E513" wp14:editId="1345BB5F">
-            <wp:extent cx="4361902" cy="2355272"/>
-            <wp:effectExtent l="0" t="0" r="635" b="6985"/>
-            <wp:docPr id="5" name="Picture 5"/>
+          <wp:inline distT="0" distB="0" distL="0" distR="0" wp14:anchorId="7EBAA2A3" wp14:editId="69EA6D99">
+            <wp:extent cx="4398818" cy="2544829"/>
+            <wp:effectExtent l="0" t="0" r="1905" b="8255"/>
+            <wp:docPr id="4" name="Picture 4"/>
             <wp:cNvGraphicFramePr>
               <a:graphicFrameLocks xmlns:a="http://schemas.openxmlformats.org/drawingml/2006/main" noChangeAspect="1"/>
             </wp:cNvGraphicFramePr>
@@ -363,7 +315,7 @@
                   <pic:spPr>
                     <a:xfrm>
                       <a:off x="0" y="0"/>
-                      <a:ext cx="4379737" cy="2364902"/>
+                      <a:ext cx="4401264" cy="2546244"/>
                     </a:xfrm>
                     <a:prstGeom prst="rect">
                       <a:avLst/>
@@ -382,10 +334,10 @@
           <w:noProof/>
         </w:rPr>
         <w:drawing>
-          <wp:inline distT="0" distB="0" distL="0" distR="0" wp14:anchorId="19FA1B29" wp14:editId="61C66C57">
-            <wp:extent cx="4350327" cy="2694192"/>
-            <wp:effectExtent l="0" t="0" r="0" b="0"/>
-            <wp:docPr id="6" name="Picture 6"/>
+          <wp:inline distT="0" distB="0" distL="0" distR="0" wp14:anchorId="41F7E513" wp14:editId="1345BB5F">
+            <wp:extent cx="4361902" cy="2355272"/>
+            <wp:effectExtent l="0" t="0" r="635" b="6985"/>
+            <wp:docPr id="5" name="Picture 5"/>
             <wp:cNvGraphicFramePr>
               <a:graphicFrameLocks xmlns:a="http://schemas.openxmlformats.org/drawingml/2006/main" noChangeAspect="1"/>
             </wp:cNvGraphicFramePr>
@@ -405,7 +357,7 @@
                   <pic:spPr>
                     <a:xfrm>
                       <a:off x="0" y="0"/>
-                      <a:ext cx="4359675" cy="2699981"/>
+                      <a:ext cx="4379737" cy="2364902"/>
                     </a:xfrm>
                     <a:prstGeom prst="rect">
                       <a:avLst/>
@@ -418,17 +370,16 @@
         </w:drawing>
       </w:r>
     </w:p>
-    <w:p/>
     <w:p>
       <w:r>
         <w:rPr>
           <w:noProof/>
         </w:rPr>
         <w:drawing>
-          <wp:inline distT="0" distB="0" distL="0" distR="0" wp14:anchorId="5AB20234" wp14:editId="7A11D5C7">
-            <wp:extent cx="5223164" cy="1295400"/>
+          <wp:inline distT="0" distB="0" distL="0" distR="0" wp14:anchorId="19FA1B29" wp14:editId="61C66C57">
+            <wp:extent cx="4350327" cy="2694192"/>
             <wp:effectExtent l="0" t="0" r="0" b="0"/>
-            <wp:docPr id="7" name="Picture 7"/>
+            <wp:docPr id="6" name="Picture 6"/>
             <wp:cNvGraphicFramePr>
               <a:graphicFrameLocks xmlns:a="http://schemas.openxmlformats.org/drawingml/2006/main" noChangeAspect="1"/>
             </wp:cNvGraphicFramePr>
@@ -448,7 +399,7 @@
                   <pic:spPr>
                     <a:xfrm>
                       <a:off x="0" y="0"/>
-                      <a:ext cx="5229115" cy="1296876"/>
+                      <a:ext cx="4359675" cy="2699981"/>
                     </a:xfrm>
                     <a:prstGeom prst="rect">
                       <a:avLst/>
@@ -461,16 +412,17 @@
         </w:drawing>
       </w:r>
     </w:p>
+    <w:p/>
     <w:p>
       <w:r>
         <w:rPr>
           <w:noProof/>
         </w:rPr>
         <w:drawing>
-          <wp:inline distT="0" distB="0" distL="0" distR="0" wp14:anchorId="5E415DBC" wp14:editId="0CB5D0F0">
-            <wp:extent cx="5239481" cy="1781424"/>
-            <wp:effectExtent l="0" t="0" r="0" b="9525"/>
-            <wp:docPr id="8" name="Picture 8"/>
+          <wp:inline distT="0" distB="0" distL="0" distR="0" wp14:anchorId="5AB20234" wp14:editId="7A11D5C7">
+            <wp:extent cx="5223164" cy="1295400"/>
+            <wp:effectExtent l="0" t="0" r="0" b="0"/>
+            <wp:docPr id="7" name="Picture 7"/>
             <wp:cNvGraphicFramePr>
               <a:graphicFrameLocks xmlns:a="http://schemas.openxmlformats.org/drawingml/2006/main" noChangeAspect="1"/>
             </wp:cNvGraphicFramePr>
@@ -490,7 +442,7 @@
                   <pic:spPr>
                     <a:xfrm>
                       <a:off x="0" y="0"/>
-                      <a:ext cx="5239481" cy="1781424"/>
+                      <a:ext cx="5229115" cy="1296876"/>
                     </a:xfrm>
                     <a:prstGeom prst="rect">
                       <a:avLst/>
@@ -509,10 +461,10 @@
           <w:noProof/>
         </w:rPr>
         <w:drawing>
-          <wp:inline distT="0" distB="0" distL="0" distR="0" wp14:anchorId="244ACC07" wp14:editId="22A94801">
-            <wp:extent cx="5244762" cy="1967346"/>
-            <wp:effectExtent l="0" t="0" r="0" b="0"/>
-            <wp:docPr id="9" name="Picture 9"/>
+          <wp:inline distT="0" distB="0" distL="0" distR="0" wp14:anchorId="5E415DBC" wp14:editId="0CB5D0F0">
+            <wp:extent cx="5239481" cy="1781424"/>
+            <wp:effectExtent l="0" t="0" r="0" b="9525"/>
+            <wp:docPr id="8" name="Picture 8"/>
             <wp:cNvGraphicFramePr>
               <a:graphicFrameLocks xmlns:a="http://schemas.openxmlformats.org/drawingml/2006/main" noChangeAspect="1"/>
             </wp:cNvGraphicFramePr>
@@ -532,7 +484,7 @@
                   <pic:spPr>
                     <a:xfrm>
                       <a:off x="0" y="0"/>
-                      <a:ext cx="5264867" cy="1974887"/>
+                      <a:ext cx="5239481" cy="1781424"/>
                     </a:xfrm>
                     <a:prstGeom prst="rect">
                       <a:avLst/>
@@ -545,174 +497,16 @@
         </w:drawing>
       </w:r>
     </w:p>
-    <w:p/>
-    <w:p>
-      <w:pPr>
-        <w:rPr>
-          <w:b/>
-          <w:bCs/>
-          <w:lang w:val="vi-VN"/>
-        </w:rPr>
-      </w:pPr>
-      <w:r>
-        <w:rPr>
-          <w:b/>
-          <w:bCs/>
-        </w:rPr>
-        <w:t>2. State, Strategy, Decorator</w:t>
-      </w:r>
-    </w:p>
-    <w:p>
-      <w:pPr>
-        <w:rPr>
-          <w:lang w:val="vi-VN"/>
-        </w:rPr>
-      </w:pPr>
-      <w:r>
-        <w:rPr>
-          <w:lang w:val="vi-VN"/>
-        </w:rPr>
-        <w:t xml:space="preserve">Đề bài: </w:t>
-      </w:r>
-      <w:r>
-        <w:t>1. Tạo một hệ thống quản lý đơn hàng có các trạng thái như: Mới tạo, Đang xử lý, Đã giao, và Hủy</w:t>
-      </w:r>
-    </w:p>
-    <w:p>
-      <w:pPr>
-        <w:rPr>
-          <w:lang w:val="vi-VN"/>
-        </w:rPr>
-      </w:pPr>
-      <w:r>
-        <w:t>Mỗi trạng thái sẽ có các hành vi khác nhau. Ví dụ:</w:t>
-      </w:r>
-    </w:p>
-    <w:p>
-      <w:pPr>
-        <w:ind w:firstLine="720"/>
-        <w:rPr>
-          <w:lang w:val="vi-VN"/>
-        </w:rPr>
-      </w:pPr>
-      <w:r>
-        <w:rPr>
-          <w:lang w:val="vi-VN"/>
-        </w:rPr>
-        <w:t xml:space="preserve">+ </w:t>
-      </w:r>
-      <w:r>
-        <w:t>Mới tạo: Kiểm tra thông tin đơn hàng.</w:t>
-      </w:r>
-    </w:p>
-    <w:p>
-      <w:pPr>
-        <w:ind w:firstLine="720"/>
-        <w:rPr>
-          <w:lang w:val="vi-VN"/>
-        </w:rPr>
-      </w:pPr>
-      <w:r>
-        <w:rPr>
-          <w:lang w:val="vi-VN"/>
-        </w:rPr>
-        <w:t xml:space="preserve">+ </w:t>
-      </w:r>
-      <w:r>
-        <w:t>Đang xử lý: Đóng gói và vận chuyển</w:t>
-      </w:r>
-    </w:p>
-    <w:p>
-      <w:pPr>
-        <w:ind w:firstLine="720"/>
-        <w:rPr>
-          <w:lang w:val="vi-VN"/>
-        </w:rPr>
-      </w:pPr>
-      <w:r>
-        <w:rPr>
-          <w:lang w:val="vi-VN"/>
-        </w:rPr>
-        <w:t xml:space="preserve">+ </w:t>
-      </w:r>
-      <w:r>
-        <w:t>Đã giao: Cập nhật trạng thái đơn hàng là đã giao.</w:t>
-      </w:r>
-    </w:p>
-    <w:p>
-      <w:pPr>
-        <w:ind w:firstLine="720"/>
-        <w:rPr>
-          <w:lang w:val="vi-VN"/>
-        </w:rPr>
-      </w:pPr>
-      <w:r>
-        <w:rPr>
-          <w:lang w:val="vi-VN"/>
-        </w:rPr>
-        <w:lastRenderedPageBreak/>
-        <w:t xml:space="preserve">+ </w:t>
-      </w:r>
-      <w:r>
-        <w:t>Hủy: Hủy đơn hàng và hoàn tiền.</w:t>
-      </w:r>
-    </w:p>
-    <w:p>
-      <w:pPr>
-        <w:pStyle w:val="ListParagraph"/>
-        <w:numPr>
-          <w:ilvl w:val="0"/>
-          <w:numId w:val="1"/>
-        </w:numPr>
-      </w:pPr>
-      <w:r>
-        <w:t>State Pattern</w:t>
-      </w:r>
-    </w:p>
-    <w:p>
-      <w:pPr>
-        <w:pStyle w:val="ListParagraph"/>
-        <w:numPr>
-          <w:ilvl w:val="0"/>
-          <w:numId w:val="2"/>
-        </w:numPr>
-        <w:rPr>
-          <w:b/>
-          <w:bCs/>
-          <w:lang w:val="vi-VN"/>
-        </w:rPr>
-      </w:pPr>
-      <w:r>
-        <w:rPr>
-          <w:b/>
-          <w:bCs/>
-        </w:rPr>
-        <w:t>Tạo</w:t>
-      </w:r>
-      <w:r>
-        <w:rPr>
-          <w:b/>
-          <w:bCs/>
-          <w:lang w:val="vi-VN"/>
-        </w:rPr>
-        <w:t xml:space="preserve"> Interface State </w:t>
-      </w:r>
-    </w:p>
-    <w:p>
-      <w:pPr>
-        <w:rPr>
-          <w:lang w:val="vi-VN"/>
-        </w:rPr>
-      </w:pPr>
+    <w:p>
       <w:r>
         <w:rPr>
           <w:noProof/>
         </w:rPr>
         <w:drawing>
-          <wp:inline distT="0" distB="0" distL="0" distR="0" wp14:anchorId="4606E609" wp14:editId="47C6EBFD">
-            <wp:extent cx="5015230" cy="983673"/>
-            <wp:effectExtent l="0" t="0" r="0" b="6985"/>
-            <wp:docPr id="10" name="Picture 10"/>
+          <wp:inline distT="0" distB="0" distL="0" distR="0" wp14:anchorId="244ACC07" wp14:editId="22A94801">
+            <wp:extent cx="5244762" cy="1967346"/>
+            <wp:effectExtent l="0" t="0" r="0" b="0"/>
+            <wp:docPr id="9" name="Picture 9"/>
             <wp:cNvGraphicFramePr>
               <a:graphicFrameLocks xmlns:a="http://schemas.openxmlformats.org/drawingml/2006/main" noChangeAspect="1"/>
             </wp:cNvGraphicFramePr>
@@ -732,7 +526,7 @@
                   <pic:spPr>
                     <a:xfrm>
                       <a:off x="0" y="0"/>
-                      <a:ext cx="5022333" cy="985066"/>
+                      <a:ext cx="5264867" cy="1974887"/>
                     </a:xfrm>
                     <a:prstGeom prst="rect">
                       <a:avLst/>
@@ -745,44 +539,161 @@
         </w:drawing>
       </w:r>
     </w:p>
+    <w:p/>
+    <w:p>
+      <w:pPr>
+        <w:rPr>
+          <w:b/>
+          <w:bCs/>
+          <w:lang w:val="vi-VN"/>
+        </w:rPr>
+      </w:pPr>
+      <w:r>
+        <w:rPr>
+          <w:b/>
+          <w:bCs/>
+        </w:rPr>
+        <w:t>2. State, Strategy, Decorator</w:t>
+      </w:r>
+    </w:p>
+    <w:p>
+      <w:pPr>
+        <w:rPr>
+          <w:lang w:val="vi-VN"/>
+        </w:rPr>
+      </w:pPr>
+      <w:r>
+        <w:rPr>
+          <w:lang w:val="vi-VN"/>
+        </w:rPr>
+        <w:t xml:space="preserve">Đề bài: </w:t>
+      </w:r>
+      <w:r>
+        <w:t>1. Tạo một hệ thống quản lý đơn hàng có các trạng thái như: Mới tạo, Đang xử lý, Đã giao, và Hủy</w:t>
+      </w:r>
+    </w:p>
+    <w:p>
+      <w:pPr>
+        <w:rPr>
+          <w:lang w:val="vi-VN"/>
+        </w:rPr>
+      </w:pPr>
+      <w:r>
+        <w:t>Mỗi trạng thái sẽ có các hành vi khác nhau. Ví dụ:</w:t>
+      </w:r>
+    </w:p>
+    <w:p>
+      <w:pPr>
+        <w:ind w:firstLine="720"/>
+        <w:rPr>
+          <w:lang w:val="vi-VN"/>
+        </w:rPr>
+      </w:pPr>
+      <w:r>
+        <w:rPr>
+          <w:lang w:val="vi-VN"/>
+        </w:rPr>
+        <w:t xml:space="preserve">+ </w:t>
+      </w:r>
+      <w:r>
+        <w:t>Mới tạo: Kiểm tra thông tin đơn hàng.</w:t>
+      </w:r>
+    </w:p>
+    <w:p>
+      <w:pPr>
+        <w:ind w:firstLine="720"/>
+        <w:rPr>
+          <w:lang w:val="vi-VN"/>
+        </w:rPr>
+      </w:pPr>
+      <w:r>
+        <w:rPr>
+          <w:lang w:val="vi-VN"/>
+        </w:rPr>
+        <w:t xml:space="preserve">+ </w:t>
+      </w:r>
+      <w:r>
+        <w:t>Đang xử lý: Đóng gói và vận chuyển</w:t>
+      </w:r>
+    </w:p>
+    <w:p>
+      <w:pPr>
+        <w:ind w:firstLine="720"/>
+        <w:rPr>
+          <w:lang w:val="vi-VN"/>
+        </w:rPr>
+      </w:pPr>
+      <w:r>
+        <w:rPr>
+          <w:lang w:val="vi-VN"/>
+        </w:rPr>
+        <w:t xml:space="preserve">+ </w:t>
+      </w:r>
+      <w:r>
+        <w:t>Đã giao: Cập nhật trạng thái đơn hàng là đã giao.</w:t>
+      </w:r>
+    </w:p>
+    <w:p>
+      <w:pPr>
+        <w:ind w:firstLine="720"/>
+        <w:rPr>
+          <w:lang w:val="vi-VN"/>
+        </w:rPr>
+      </w:pPr>
+      <w:r>
+        <w:rPr>
+          <w:lang w:val="vi-VN"/>
+        </w:rPr>
+        <w:lastRenderedPageBreak/>
+        <w:t xml:space="preserve">+ </w:t>
+      </w:r>
+      <w:r>
+        <w:t>Hủy: Hủy đơn hàng và hoàn tiền.</w:t>
+      </w:r>
+    </w:p>
     <w:p>
       <w:pPr>
         <w:pStyle w:val="ListParagraph"/>
         <w:numPr>
           <w:ilvl w:val="0"/>
-          <w:numId w:val="2"/>
+          <w:numId w:val="1"/>
         </w:numPr>
-        <w:rPr>
-          <w:b/>
-          <w:bCs/>
-          <w:lang w:val="vi-VN"/>
-        </w:rPr>
-      </w:pPr>
-      <w:r>
-        <w:rPr>
-          <w:b/>
-          <w:bCs/>
-          <w:lang w:val="vi-VN"/>
-        </w:rPr>
-        <w:t>Implement state</w:t>
-      </w:r>
-    </w:p>
-    <w:p>
-      <w:pPr>
-        <w:rPr>
-          <w:lang w:val="vi-VN"/>
-        </w:rPr>
+      </w:pPr>
+      <w:r>
+        <w:t>State Pattern</w:t>
+      </w:r>
+    </w:p>
+    <w:p>
+      <w:pPr>
+        <w:pStyle w:val="ListParagraph"/>
+        <w:numPr>
+          <w:ilvl w:val="0"/>
+          <w:numId w:val="1"/>
+        </w:numPr>
+      </w:pPr>
+      <w:r>
+        <w:t>Sơ</w:t>
+      </w:r>
+      <w:r>
+        <w:rPr>
+          <w:lang w:val="vi-VN"/>
+        </w:rPr>
+        <w:t xml:space="preserve"> đồ: </w:t>
+      </w:r>
+    </w:p>
+    <w:p>
+      <w:pPr>
+        <w:pStyle w:val="NormalWeb"/>
       </w:pPr>
       <w:r>
         <w:rPr>
           <w:noProof/>
-          <w:lang w:val="vi-VN"/>
         </w:rPr>
         <w:drawing>
-          <wp:inline distT="0" distB="0" distL="0" distR="0" wp14:anchorId="4E544A6B" wp14:editId="41B13DD8">
-            <wp:extent cx="5943600" cy="2611582"/>
-            <wp:effectExtent l="0" t="0" r="0" b="0"/>
-            <wp:docPr id="11" name="Picture 11"/>
+          <wp:inline distT="0" distB="0" distL="0" distR="0" wp14:anchorId="2450AC5E" wp14:editId="4391985B">
+            <wp:extent cx="5943600" cy="2716530"/>
+            <wp:effectExtent l="0" t="0" r="0" b="7620"/>
+            <wp:docPr id="30" name="Picture 30"/>
             <wp:cNvGraphicFramePr>
               <a:graphicFrameLocks xmlns:a="http://schemas.openxmlformats.org/drawingml/2006/main" noChangeAspect="1"/>
             </wp:cNvGraphicFramePr>
@@ -790,23 +701,36 @@
               <a:graphicData uri="http://schemas.openxmlformats.org/drawingml/2006/picture">
                 <pic:pic xmlns:pic="http://schemas.openxmlformats.org/drawingml/2006/picture">
                   <pic:nvPicPr>
-                    <pic:cNvPr id="1" name=""/>
-                    <pic:cNvPicPr/>
+                    <pic:cNvPr id="0" name="Picture 11"/>
+                    <pic:cNvPicPr>
+                      <a:picLocks noChangeAspect="1" noChangeArrowheads="1"/>
+                    </pic:cNvPicPr>
                   </pic:nvPicPr>
                   <pic:blipFill>
-                    <a:blip r:embed="rId15"/>
+                    <a:blip r:embed="rId15" cstate="print">
+                      <a:extLst>
+                        <a:ext uri="{28A0092B-C50C-407E-A947-70E740481C1C}">
+                          <a14:useLocalDpi xmlns:a14="http://schemas.microsoft.com/office/drawing/2010/main" val="0"/>
+                        </a:ext>
+                      </a:extLst>
+                    </a:blip>
+                    <a:srcRect/>
                     <a:stretch>
                       <a:fillRect/>
                     </a:stretch>
                   </pic:blipFill>
-                  <pic:spPr>
+                  <pic:spPr bwMode="auto">
                     <a:xfrm>
                       <a:off x="0" y="0"/>
-                      <a:ext cx="5975793" cy="2625728"/>
+                      <a:ext cx="5943600" cy="2716530"/>
                     </a:xfrm>
                     <a:prstGeom prst="rect">
                       <a:avLst/>
                     </a:prstGeom>
+                    <a:noFill/>
+                    <a:ln>
+                      <a:noFill/>
+                    </a:ln>
                   </pic:spPr>
                 </pic:pic>
               </a:graphicData>
@@ -817,6 +741,13 @@
     </w:p>
     <w:p>
       <w:pPr>
+        <w:rPr>
+          <w:lang w:val="vi-VN"/>
+        </w:rPr>
+      </w:pPr>
+    </w:p>
+    <w:p>
+      <w:pPr>
         <w:pStyle w:val="ListParagraph"/>
         <w:numPr>
           <w:ilvl w:val="0"/>
@@ -832,31 +763,33 @@
         <w:rPr>
           <w:b/>
           <w:bCs/>
-          <w:lang w:val="vi-VN"/>
-        </w:rPr>
-        <w:t>Triển khai vào state chính</w:t>
-      </w:r>
-    </w:p>
-    <w:p>
-      <w:pPr>
-        <w:rPr>
-          <w:b/>
-          <w:bCs/>
-          <w:lang w:val="vi-VN"/>
-        </w:rPr>
-      </w:pPr>
-      <w:r>
-        <w:rPr>
-          <w:b/>
-          <w:bCs/>
+        </w:rPr>
+        <w:t>Tạo</w:t>
+      </w:r>
+      <w:r>
+        <w:rPr>
+          <w:b/>
+          <w:bCs/>
+          <w:lang w:val="vi-VN"/>
+        </w:rPr>
+        <w:t xml:space="preserve"> Interface State </w:t>
+      </w:r>
+    </w:p>
+    <w:p>
+      <w:pPr>
+        <w:rPr>
+          <w:lang w:val="vi-VN"/>
+        </w:rPr>
+      </w:pPr>
+      <w:r>
+        <w:rPr>
           <w:noProof/>
-          <w:lang w:val="vi-VN"/>
         </w:rPr>
         <w:drawing>
-          <wp:inline distT="0" distB="0" distL="0" distR="0" wp14:anchorId="48890702" wp14:editId="42886350">
-            <wp:extent cx="5943600" cy="2625437"/>
-            <wp:effectExtent l="0" t="0" r="0" b="3810"/>
-            <wp:docPr id="12" name="Picture 12"/>
+          <wp:inline distT="0" distB="0" distL="0" distR="0" wp14:anchorId="4606E609" wp14:editId="47C6EBFD">
+            <wp:extent cx="5015230" cy="983673"/>
+            <wp:effectExtent l="0" t="0" r="0" b="6985"/>
+            <wp:docPr id="10" name="Picture 10"/>
             <wp:cNvGraphicFramePr>
               <a:graphicFrameLocks xmlns:a="http://schemas.openxmlformats.org/drawingml/2006/main" noChangeAspect="1"/>
             </wp:cNvGraphicFramePr>
@@ -876,7 +809,7 @@
                   <pic:spPr>
                     <a:xfrm>
                       <a:off x="0" y="0"/>
-                      <a:ext cx="5964084" cy="2634485"/>
+                      <a:ext cx="5022333" cy="985066"/>
                     </a:xfrm>
                     <a:prstGeom prst="rect">
                       <a:avLst/>
@@ -891,15 +824,6 @@
     </w:p>
     <w:p>
       <w:pPr>
-        <w:rPr>
-          <w:b/>
-          <w:bCs/>
-          <w:lang w:val="vi-VN"/>
-        </w:rPr>
-      </w:pPr>
-    </w:p>
-    <w:p>
-      <w:pPr>
         <w:pStyle w:val="ListParagraph"/>
         <w:numPr>
           <w:ilvl w:val="0"/>
@@ -917,29 +841,25 @@
           <w:bCs/>
           <w:lang w:val="vi-VN"/>
         </w:rPr>
-        <w:t>Thực thi và Kết quả :</w:t>
-      </w:r>
-    </w:p>
-    <w:p>
-      <w:pPr>
-        <w:rPr>
-          <w:b/>
-          <w:bCs/>
-          <w:lang w:val="vi-VN"/>
-        </w:rPr>
-      </w:pPr>
-      <w:r>
-        <w:rPr>
-          <w:b/>
-          <w:bCs/>
+        <w:t>Implement state</w:t>
+      </w:r>
+    </w:p>
+    <w:p>
+      <w:pPr>
+        <w:rPr>
+          <w:lang w:val="vi-VN"/>
+        </w:rPr>
+      </w:pPr>
+      <w:r>
+        <w:rPr>
           <w:noProof/>
-          <w:lang w:val="vi-VN"/>
-        </w:rPr>
+        </w:rPr>
+        <w:lastRenderedPageBreak/>
         <w:drawing>
-          <wp:inline distT="0" distB="0" distL="0" distR="0" wp14:anchorId="6C8D1C12" wp14:editId="30787A23">
-            <wp:extent cx="5943600" cy="1239982"/>
+          <wp:inline distT="0" distB="0" distL="0" distR="0" wp14:anchorId="4E544A6B" wp14:editId="41B13DD8">
+            <wp:extent cx="5943600" cy="2611582"/>
             <wp:effectExtent l="0" t="0" r="0" b="0"/>
-            <wp:docPr id="14" name="Picture 14"/>
+            <wp:docPr id="11" name="Picture 11"/>
             <wp:cNvGraphicFramePr>
               <a:graphicFrameLocks xmlns:a="http://schemas.openxmlformats.org/drawingml/2006/main" noChangeAspect="1"/>
             </wp:cNvGraphicFramePr>
@@ -959,7 +879,7 @@
                   <pic:spPr>
                     <a:xfrm>
                       <a:off x="0" y="0"/>
-                      <a:ext cx="5950721" cy="1241468"/>
+                      <a:ext cx="5975793" cy="2625728"/>
                     </a:xfrm>
                     <a:prstGeom prst="rect">
                       <a:avLst/>
@@ -974,6 +894,28 @@
     </w:p>
     <w:p>
       <w:pPr>
+        <w:pStyle w:val="ListParagraph"/>
+        <w:numPr>
+          <w:ilvl w:val="0"/>
+          <w:numId w:val="2"/>
+        </w:numPr>
+        <w:rPr>
+          <w:b/>
+          <w:bCs/>
+          <w:lang w:val="vi-VN"/>
+        </w:rPr>
+      </w:pPr>
+      <w:r>
+        <w:rPr>
+          <w:b/>
+          <w:bCs/>
+          <w:lang w:val="vi-VN"/>
+        </w:rPr>
+        <w:t>Triển khai vào state chính</w:t>
+      </w:r>
+    </w:p>
+    <w:p>
+      <w:pPr>
         <w:rPr>
           <w:b/>
           <w:bCs/>
@@ -985,13 +927,12 @@
           <w:b/>
           <w:bCs/>
           <w:noProof/>
-          <w:lang w:val="vi-VN"/>
         </w:rPr>
         <w:drawing>
-          <wp:inline distT="0" distB="0" distL="0" distR="0" wp14:anchorId="226456B2" wp14:editId="6A8A83AA">
-            <wp:extent cx="5943600" cy="1133475"/>
-            <wp:effectExtent l="0" t="0" r="0" b="9525"/>
-            <wp:docPr id="13" name="Picture 13"/>
+          <wp:inline distT="0" distB="0" distL="0" distR="0" wp14:anchorId="48890702" wp14:editId="42886350">
+            <wp:extent cx="5943600" cy="2625437"/>
+            <wp:effectExtent l="0" t="0" r="0" b="3810"/>
+            <wp:docPr id="12" name="Picture 12"/>
             <wp:cNvGraphicFramePr>
               <a:graphicFrameLocks xmlns:a="http://schemas.openxmlformats.org/drawingml/2006/main" noChangeAspect="1"/>
             </wp:cNvGraphicFramePr>
@@ -1011,7 +952,7 @@
                   <pic:spPr>
                     <a:xfrm>
                       <a:off x="0" y="0"/>
-                      <a:ext cx="5943600" cy="1133475"/>
+                      <a:ext cx="5964084" cy="2634485"/>
                     </a:xfrm>
                     <a:prstGeom prst="rect">
                       <a:avLst/>
@@ -1024,120 +965,56 @@
         </w:drawing>
       </w:r>
     </w:p>
-    <w:p/>
+    <w:p>
+      <w:pPr>
+        <w:rPr>
+          <w:b/>
+          <w:bCs/>
+          <w:lang w:val="vi-VN"/>
+        </w:rPr>
+      </w:pPr>
+    </w:p>
     <w:p>
       <w:pPr>
         <w:pStyle w:val="ListParagraph"/>
         <w:numPr>
           <w:ilvl w:val="0"/>
-          <w:numId w:val="1"/>
+          <w:numId w:val="2"/>
         </w:numPr>
         <w:rPr>
           <w:b/>
           <w:bCs/>
-        </w:rPr>
-      </w:pPr>
-      <w:r>
-        <w:rPr>
-          <w:b/>
-          <w:bCs/>
-        </w:rPr>
-        <w:t>Strategy Pattern</w:t>
-      </w:r>
-    </w:p>
-    <w:p>
-      <w:pPr>
-        <w:rPr>
-          <w:lang w:val="vi-VN"/>
-        </w:rPr>
-      </w:pPr>
-      <w:r>
-        <w:t xml:space="preserve">Tính toán thuế cho sản </w:t>
-      </w:r>
-      <w:r>
-        <w:t>phẩm</w:t>
-      </w:r>
-      <w:r>
-        <w:rPr>
-          <w:lang w:val="vi-VN"/>
-        </w:rPr>
-        <w:t xml:space="preserve">. </w:t>
-      </w:r>
-      <w:r>
-        <w:t>Mô tả:</w:t>
-      </w:r>
-      <w:r>
-        <w:rPr>
-          <w:lang w:val="vi-VN"/>
-        </w:rPr>
-        <w:t xml:space="preserve"> </w:t>
-      </w:r>
-      <w:r>
-        <w:t>Giả sử bạn có một hệ thống bán hàng và muốn tính toán thuế cho các sản phẩm khác nhau.</w:t>
-      </w:r>
-      <w:r>
-        <w:rPr>
-          <w:kern w:val="0"/>
-          <w14:ligatures w14:val="none"/>
-        </w:rPr>
-        <w:t xml:space="preserve"> </w:t>
-      </w:r>
-      <w:r>
-        <w:t>Các sản phẩm có thể áp dụng các loại thuế khác nhau, ví dụ như thuế tiêu thụ, thuế giá trị gia tăng (VAT), hoặc thuế đặc biệt cho các sản phẩm xa xỉ.</w:t>
-      </w:r>
-    </w:p>
-    <w:p>
-      <w:pPr>
-        <w:pStyle w:val="ListParagraph"/>
-        <w:numPr>
-          <w:ilvl w:val="1"/>
-          <w:numId w:val="1"/>
-        </w:numPr>
-        <w:rPr>
-          <w:b/>
-          <w:bCs/>
-          <w:lang w:val="vi-VN"/>
-        </w:rPr>
-      </w:pPr>
-      <w:r>
-        <w:rPr>
-          <w:b/>
-          <w:bCs/>
-        </w:rPr>
-        <w:t>Tạo</w:t>
-      </w:r>
-      <w:r>
-        <w:rPr>
-          <w:b/>
-          <w:bCs/>
-          <w:lang w:val="vi-VN"/>
-        </w:rPr>
-        <w:t xml:space="preserve"> Interface </w:t>
-      </w:r>
-      <w:r>
-        <w:rPr>
-          <w:b/>
-          <w:bCs/>
-          <w:lang w:val="vi-VN"/>
-        </w:rPr>
-        <w:t>Strategy</w:t>
-      </w:r>
-    </w:p>
-    <w:p>
-      <w:pPr>
-        <w:rPr>
-          <w:lang w:val="vi-VN"/>
-        </w:rPr>
-      </w:pPr>
-      <w:r>
-        <w:rPr>
-          <w:lang w:val="vi-VN"/>
+          <w:lang w:val="vi-VN"/>
+        </w:rPr>
+      </w:pPr>
+      <w:r>
+        <w:rPr>
+          <w:b/>
+          <w:bCs/>
+          <w:lang w:val="vi-VN"/>
+        </w:rPr>
+        <w:t>Thực thi và Kết quả :</w:t>
+      </w:r>
+    </w:p>
+    <w:p>
+      <w:pPr>
+        <w:rPr>
+          <w:b/>
+          <w:bCs/>
+          <w:lang w:val="vi-VN"/>
+        </w:rPr>
+      </w:pPr>
+      <w:r>
+        <w:rPr>
+          <w:b/>
+          <w:bCs/>
+          <w:noProof/>
         </w:rPr>
         <w:drawing>
-          <wp:inline distT="0" distB="0" distL="0" distR="0" wp14:anchorId="1463DD8C" wp14:editId="14C43AB3">
-            <wp:extent cx="5943600" cy="971550"/>
+          <wp:inline distT="0" distB="0" distL="0" distR="0" wp14:anchorId="6C8D1C12" wp14:editId="30787A23">
+            <wp:extent cx="5943600" cy="1239982"/>
             <wp:effectExtent l="0" t="0" r="0" b="0"/>
-            <wp:docPr id="15" name="Picture 15"/>
+            <wp:docPr id="14" name="Picture 14"/>
             <wp:cNvGraphicFramePr>
               <a:graphicFrameLocks xmlns:a="http://schemas.openxmlformats.org/drawingml/2006/main" noChangeAspect="1"/>
             </wp:cNvGraphicFramePr>
@@ -1157,7 +1034,7 @@
                   <pic:spPr>
                     <a:xfrm>
                       <a:off x="0" y="0"/>
-                      <a:ext cx="5943600" cy="971550"/>
+                      <a:ext cx="5950721" cy="1241468"/>
                     </a:xfrm>
                     <a:prstGeom prst="rect">
                       <a:avLst/>
@@ -1172,52 +1049,23 @@
     </w:p>
     <w:p>
       <w:pPr>
-        <w:pStyle w:val="ListParagraph"/>
-        <w:numPr>
-          <w:ilvl w:val="0"/>
-          <w:numId w:val="4"/>
-        </w:numPr>
-        <w:rPr>
-          <w:b/>
-          <w:bCs/>
-          <w:lang w:val="vi-VN"/>
-        </w:rPr>
-      </w:pPr>
-      <w:r>
-        <w:rPr>
-          <w:b/>
-          <w:bCs/>
-        </w:rPr>
-        <w:t>Implement</w:t>
-      </w:r>
-      <w:r>
-        <w:rPr>
-          <w:b/>
-          <w:bCs/>
-          <w:lang w:val="vi-VN"/>
-        </w:rPr>
-        <w:t xml:space="preserve"> strategy cho từng chiến lược</w:t>
-      </w:r>
-    </w:p>
-    <w:p>
-      <w:pPr>
-        <w:rPr>
-          <w:b/>
-          <w:bCs/>
-          <w:lang w:val="vi-VN"/>
-        </w:rPr>
-      </w:pPr>
-      <w:r>
-        <w:rPr>
-          <w:b/>
-          <w:bCs/>
-          <w:lang w:val="vi-VN"/>
-        </w:rPr>
+        <w:rPr>
+          <w:b/>
+          <w:bCs/>
+        </w:rPr>
+      </w:pPr>
+      <w:r>
+        <w:rPr>
+          <w:b/>
+          <w:bCs/>
+          <w:noProof/>
+        </w:rPr>
+        <w:lastRenderedPageBreak/>
         <w:drawing>
-          <wp:inline distT="0" distB="0" distL="0" distR="0" wp14:anchorId="258F1DE6" wp14:editId="1CDC4ED7">
-            <wp:extent cx="5572124" cy="1052946"/>
-            <wp:effectExtent l="0" t="0" r="0" b="0"/>
-            <wp:docPr id="16" name="Picture 16"/>
+          <wp:inline distT="0" distB="0" distL="0" distR="0" wp14:anchorId="226456B2" wp14:editId="6A8A83AA">
+            <wp:extent cx="5943600" cy="1133475"/>
+            <wp:effectExtent l="0" t="0" r="0" b="9525"/>
+            <wp:docPr id="13" name="Picture 13"/>
             <wp:cNvGraphicFramePr>
               <a:graphicFrameLocks xmlns:a="http://schemas.openxmlformats.org/drawingml/2006/main" noChangeAspect="1"/>
             </wp:cNvGraphicFramePr>
@@ -1237,7 +1085,7 @@
                   <pic:spPr>
                     <a:xfrm>
                       <a:off x="0" y="0"/>
-                      <a:ext cx="5589431" cy="1056216"/>
+                      <a:ext cx="5943600" cy="1133475"/>
                     </a:xfrm>
                     <a:prstGeom prst="rect">
                       <a:avLst/>
@@ -1252,24 +1100,130 @@
     </w:p>
     <w:p>
       <w:pPr>
-        <w:rPr>
-          <w:b/>
-          <w:bCs/>
-          <w:lang w:val="vi-VN"/>
-        </w:rPr>
-      </w:pPr>
-      <w:r>
-        <w:rPr>
-          <w:b/>
-          <w:bCs/>
-          <w:lang w:val="vi-VN"/>
-        </w:rPr>
-        <w:lastRenderedPageBreak/>
+        <w:pStyle w:val="ListParagraph"/>
+        <w:numPr>
+          <w:ilvl w:val="0"/>
+          <w:numId w:val="1"/>
+        </w:numPr>
+        <w:rPr>
+          <w:b/>
+          <w:bCs/>
+        </w:rPr>
+      </w:pPr>
+      <w:r>
+        <w:rPr>
+          <w:b/>
+          <w:bCs/>
+        </w:rPr>
+        <w:t>Strategy Pattern</w:t>
+      </w:r>
+    </w:p>
+    <w:p>
+      <w:pPr>
+        <w:rPr>
+          <w:lang w:val="vi-VN"/>
+        </w:rPr>
+      </w:pPr>
+      <w:r>
+        <w:t xml:space="preserve">Tính toán thuế cho sản </w:t>
+      </w:r>
+      <w:r>
+        <w:t>phẩm</w:t>
+      </w:r>
+      <w:r>
+        <w:rPr>
+          <w:lang w:val="vi-VN"/>
+        </w:rPr>
+        <w:t xml:space="preserve">. </w:t>
+      </w:r>
+      <w:r>
+        <w:t>Mô tả:</w:t>
+      </w:r>
+      <w:r>
+        <w:rPr>
+          <w:lang w:val="vi-VN"/>
+        </w:rPr>
+        <w:t xml:space="preserve"> </w:t>
+      </w:r>
+      <w:r>
+        <w:t>Giả sử bạn có một hệ thống bán hàng và muốn tính toán thuế cho các sản phẩm khác nhau.</w:t>
+      </w:r>
+      <w:r>
+        <w:rPr>
+          <w:kern w:val="0"/>
+          <w14:ligatures w14:val="none"/>
+        </w:rPr>
+        <w:t xml:space="preserve"> </w:t>
+      </w:r>
+      <w:r>
+        <w:t>Các sản phẩm có thể áp dụng các loại thuế khác nhau, ví dụ như thuế tiêu thụ, thuế giá trị gia tăng (VAT), hoặc thuế đặc biệt cho các sản phẩm xa xỉ.</w:t>
+      </w:r>
+    </w:p>
+    <w:p>
+      <w:pPr>
+        <w:rPr>
+          <w:lang w:val="vi-VN"/>
+        </w:rPr>
+      </w:pPr>
+      <w:r>
+        <w:rPr>
+          <w:lang w:val="vi-VN"/>
+        </w:rPr>
+        <w:t xml:space="preserve">state: </w:t>
+      </w:r>
+    </w:p>
+    <w:p>
+      <w:pPr>
+        <w:pStyle w:val="ListParagraph"/>
+        <w:numPr>
+          <w:ilvl w:val="1"/>
+          <w:numId w:val="1"/>
+        </w:numPr>
+        <w:rPr>
+          <w:b/>
+          <w:bCs/>
+          <w:lang w:val="vi-VN"/>
+        </w:rPr>
+      </w:pPr>
+      <w:r>
+        <w:rPr>
+          <w:b/>
+          <w:bCs/>
+        </w:rPr>
+        <w:t>Tạo</w:t>
+      </w:r>
+      <w:r>
+        <w:rPr>
+          <w:b/>
+          <w:bCs/>
+          <w:lang w:val="vi-VN"/>
+        </w:rPr>
+        <w:t xml:space="preserve"> Interface </w:t>
+      </w:r>
+      <w:r>
+        <w:rPr>
+          <w:b/>
+          <w:bCs/>
+          <w:lang w:val="vi-VN"/>
+        </w:rPr>
+        <w:t>Strategy</w:t>
+      </w:r>
+    </w:p>
+    <w:p>
+      <w:pPr>
+        <w:rPr>
+          <w:lang w:val="vi-VN"/>
+        </w:rPr>
+      </w:pPr>
+      <w:r>
+        <w:rPr>
+          <w:noProof/>
+        </w:rPr>
         <w:drawing>
-          <wp:inline distT="0" distB="0" distL="0" distR="0" wp14:anchorId="74303363" wp14:editId="2B59CBDB">
-            <wp:extent cx="5943600" cy="1205865"/>
+          <wp:inline distT="0" distB="0" distL="0" distR="0" wp14:anchorId="1463DD8C" wp14:editId="14C43AB3">
+            <wp:extent cx="5943600" cy="971550"/>
             <wp:effectExtent l="0" t="0" r="0" b="0"/>
-            <wp:docPr id="17" name="Picture 17"/>
+            <wp:docPr id="15" name="Picture 15"/>
             <wp:cNvGraphicFramePr>
               <a:graphicFrameLocks xmlns:a="http://schemas.openxmlformats.org/drawingml/2006/main" noChangeAspect="1"/>
             </wp:cNvGraphicFramePr>
@@ -1289,7 +1243,7 @@
                   <pic:spPr>
                     <a:xfrm>
                       <a:off x="0" y="0"/>
-                      <a:ext cx="5943600" cy="1205865"/>
+                      <a:ext cx="5943600" cy="971550"/>
                     </a:xfrm>
                     <a:prstGeom prst="rect">
                       <a:avLst/>
@@ -1304,23 +1258,52 @@
     </w:p>
     <w:p>
       <w:pPr>
-        <w:rPr>
-          <w:b/>
-          <w:bCs/>
-          <w:lang w:val="vi-VN"/>
-        </w:rPr>
-      </w:pPr>
-      <w:r>
-        <w:rPr>
-          <w:b/>
-          <w:bCs/>
-          <w:lang w:val="vi-VN"/>
+        <w:pStyle w:val="ListParagraph"/>
+        <w:numPr>
+          <w:ilvl w:val="0"/>
+          <w:numId w:val="4"/>
+        </w:numPr>
+        <w:rPr>
+          <w:b/>
+          <w:bCs/>
+          <w:lang w:val="vi-VN"/>
+        </w:rPr>
+      </w:pPr>
+      <w:r>
+        <w:rPr>
+          <w:b/>
+          <w:bCs/>
+        </w:rPr>
+        <w:t>Implement</w:t>
+      </w:r>
+      <w:r>
+        <w:rPr>
+          <w:b/>
+          <w:bCs/>
+          <w:lang w:val="vi-VN"/>
+        </w:rPr>
+        <w:t xml:space="preserve"> strategy cho từng chiến lược</w:t>
+      </w:r>
+    </w:p>
+    <w:p>
+      <w:pPr>
+        <w:rPr>
+          <w:b/>
+          <w:bCs/>
+          <w:lang w:val="vi-VN"/>
+        </w:rPr>
+      </w:pPr>
+      <w:r>
+        <w:rPr>
+          <w:b/>
+          <w:bCs/>
+          <w:noProof/>
         </w:rPr>
         <w:drawing>
-          <wp:inline distT="0" distB="0" distL="0" distR="0" wp14:anchorId="7F359E58" wp14:editId="2F1D3394">
-            <wp:extent cx="5943600" cy="1092835"/>
+          <wp:inline distT="0" distB="0" distL="0" distR="0" wp14:anchorId="258F1DE6" wp14:editId="1CDC4ED7">
+            <wp:extent cx="5572124" cy="1052946"/>
             <wp:effectExtent l="0" t="0" r="0" b="0"/>
-            <wp:docPr id="18" name="Picture 18"/>
+            <wp:docPr id="16" name="Picture 16"/>
             <wp:cNvGraphicFramePr>
               <a:graphicFrameLocks xmlns:a="http://schemas.openxmlformats.org/drawingml/2006/main" noChangeAspect="1"/>
             </wp:cNvGraphicFramePr>
@@ -1340,7 +1323,7 @@
                   <pic:spPr>
                     <a:xfrm>
                       <a:off x="0" y="0"/>
-                      <a:ext cx="5943600" cy="1092835"/>
+                      <a:ext cx="5589431" cy="1056216"/>
                     </a:xfrm>
                     <a:prstGeom prst="rect">
                       <a:avLst/>
@@ -1355,52 +1338,23 @@
     </w:p>
     <w:p>
       <w:pPr>
-        <w:pStyle w:val="ListParagraph"/>
-        <w:numPr>
-          <w:ilvl w:val="0"/>
-          <w:numId w:val="4"/>
-        </w:numPr>
-        <w:rPr>
-          <w:b/>
-          <w:bCs/>
-          <w:lang w:val="vi-VN"/>
-        </w:rPr>
-      </w:pPr>
-      <w:r>
-        <w:rPr>
-          <w:b/>
-          <w:bCs/>
-        </w:rPr>
-        <w:t>Tạo</w:t>
-      </w:r>
-      <w:r>
-        <w:rPr>
-          <w:b/>
-          <w:bCs/>
-          <w:lang w:val="vi-VN"/>
-        </w:rPr>
-        <w:t xml:space="preserve"> context</w:t>
-      </w:r>
-    </w:p>
-    <w:p>
-      <w:pPr>
-        <w:rPr>
-          <w:b/>
-          <w:bCs/>
-          <w:lang w:val="vi-VN"/>
-        </w:rPr>
-      </w:pPr>
-      <w:r>
-        <w:rPr>
-          <w:b/>
-          <w:bCs/>
-          <w:lang w:val="vi-VN"/>
+        <w:rPr>
+          <w:b/>
+          <w:bCs/>
+          <w:lang w:val="vi-VN"/>
+        </w:rPr>
+      </w:pPr>
+      <w:r>
+        <w:rPr>
+          <w:b/>
+          <w:bCs/>
+          <w:noProof/>
         </w:rPr>
         <w:drawing>
-          <wp:inline distT="0" distB="0" distL="0" distR="0" wp14:anchorId="72657373" wp14:editId="53A7BBAD">
-            <wp:extent cx="5943600" cy="2715491"/>
-            <wp:effectExtent l="0" t="0" r="0" b="8890"/>
-            <wp:docPr id="19" name="Picture 19"/>
+          <wp:inline distT="0" distB="0" distL="0" distR="0" wp14:anchorId="74303363" wp14:editId="2B59CBDB">
+            <wp:extent cx="5943600" cy="1205865"/>
+            <wp:effectExtent l="0" t="0" r="0" b="0"/>
+            <wp:docPr id="17" name="Picture 17"/>
             <wp:cNvGraphicFramePr>
               <a:graphicFrameLocks xmlns:a="http://schemas.openxmlformats.org/drawingml/2006/main" noChangeAspect="1"/>
             </wp:cNvGraphicFramePr>
@@ -1420,7 +1374,7 @@
                   <pic:spPr>
                     <a:xfrm>
                       <a:off x="0" y="0"/>
-                      <a:ext cx="5949031" cy="2717972"/>
+                      <a:ext cx="5943600" cy="1205865"/>
                     </a:xfrm>
                     <a:prstGeom prst="rect">
                       <a:avLst/>
@@ -1435,52 +1389,23 @@
     </w:p>
     <w:p>
       <w:pPr>
-        <w:pStyle w:val="ListParagraph"/>
-        <w:numPr>
-          <w:ilvl w:val="0"/>
-          <w:numId w:val="4"/>
-        </w:numPr>
-        <w:rPr>
-          <w:b/>
-          <w:bCs/>
-          <w:lang w:val="vi-VN"/>
-        </w:rPr>
-      </w:pPr>
-      <w:r>
-        <w:rPr>
-          <w:b/>
-          <w:bCs/>
-        </w:rPr>
-        <w:t>Thực</w:t>
-      </w:r>
-      <w:r>
-        <w:rPr>
-          <w:b/>
-          <w:bCs/>
-          <w:lang w:val="vi-VN"/>
-        </w:rPr>
-        <w:t xml:space="preserve"> thi và kết quả</w:t>
-      </w:r>
-    </w:p>
-    <w:p>
-      <w:pPr>
-        <w:rPr>
-          <w:b/>
-          <w:bCs/>
-          <w:lang w:val="vi-VN"/>
-        </w:rPr>
-      </w:pPr>
-      <w:r>
-        <w:rPr>
-          <w:b/>
-          <w:bCs/>
-          <w:lang w:val="vi-VN"/>
+        <w:rPr>
+          <w:b/>
+          <w:bCs/>
+          <w:lang w:val="vi-VN"/>
+        </w:rPr>
+      </w:pPr>
+      <w:r>
+        <w:rPr>
+          <w:b/>
+          <w:bCs/>
+          <w:noProof/>
         </w:rPr>
         <w:drawing>
-          <wp:inline distT="0" distB="0" distL="0" distR="0" wp14:anchorId="2ECE36A1" wp14:editId="5F292CB0">
-            <wp:extent cx="5943600" cy="1894840"/>
+          <wp:inline distT="0" distB="0" distL="0" distR="0" wp14:anchorId="7F359E58" wp14:editId="2F1D3394">
+            <wp:extent cx="5943600" cy="1092835"/>
             <wp:effectExtent l="0" t="0" r="0" b="0"/>
-            <wp:docPr id="20" name="Picture 20"/>
+            <wp:docPr id="18" name="Picture 18"/>
             <wp:cNvGraphicFramePr>
               <a:graphicFrameLocks xmlns:a="http://schemas.openxmlformats.org/drawingml/2006/main" noChangeAspect="1"/>
             </wp:cNvGraphicFramePr>
@@ -1500,7 +1425,7 @@
                   <pic:spPr>
                     <a:xfrm>
                       <a:off x="0" y="0"/>
-                      <a:ext cx="5943600" cy="1894840"/>
+                      <a:ext cx="5943600" cy="1092835"/>
                     </a:xfrm>
                     <a:prstGeom prst="rect">
                       <a:avLst/>
@@ -1518,11 +1443,12 @@
         <w:pStyle w:val="ListParagraph"/>
         <w:numPr>
           <w:ilvl w:val="0"/>
-          <w:numId w:val="1"/>
+          <w:numId w:val="4"/>
         </w:numPr>
         <w:rPr>
           <w:b/>
           <w:bCs/>
+          <w:lang w:val="vi-VN"/>
         </w:rPr>
       </w:pPr>
       <w:r>
@@ -1531,55 +1457,6 @@
           <w:bCs/>
         </w:rPr>
         <w:lastRenderedPageBreak/>
-        <w:t>Decorator</w:t>
-      </w:r>
-      <w:r>
-        <w:rPr>
-          <w:b/>
-          <w:bCs/>
-          <w:lang w:val="vi-VN"/>
-        </w:rPr>
-        <w:t xml:space="preserve"> </w:t>
-      </w:r>
-      <w:r>
-        <w:rPr>
-          <w:b/>
-          <w:bCs/>
-        </w:rPr>
-        <w:t>Pattern</w:t>
-      </w:r>
-    </w:p>
-    <w:p>
-      <w:pPr>
-        <w:rPr>
-          <w:lang w:val="vi-VN"/>
-        </w:rPr>
-      </w:pPr>
-      <w:r>
-        <w:t>T</w:t>
-      </w:r>
-      <w:r>
-        <w:t>ạo một hệ thống thanh toán, nơi bạn có thể thanh toán bằng các phương thức khác nhau như Thẻ tín dụng, PayPal, và có thể thêm các phương thức thanh toán này với các tính năng bổ sung như Phí xử lý, Mã giảm giá.</w:t>
-      </w:r>
-    </w:p>
-    <w:p>
-      <w:pPr>
-        <w:pStyle w:val="ListParagraph"/>
-        <w:numPr>
-          <w:ilvl w:val="1"/>
-          <w:numId w:val="1"/>
-        </w:numPr>
-        <w:rPr>
-          <w:b/>
-          <w:bCs/>
-          <w:lang w:val="vi-VN"/>
-        </w:rPr>
-      </w:pPr>
-      <w:r>
-        <w:rPr>
-          <w:b/>
-          <w:bCs/>
-        </w:rPr>
         <w:t>Tạo</w:t>
       </w:r>
       <w:r>
@@ -1588,40 +1465,28 @@
           <w:bCs/>
           <w:lang w:val="vi-VN"/>
         </w:rPr>
-        <w:t xml:space="preserve"> </w:t>
-      </w:r>
-      <w:r>
-        <w:rPr>
-          <w:b/>
-          <w:bCs/>
-          <w:lang w:val="vi-VN"/>
-        </w:rPr>
-        <w:t>decorator</w:t>
-      </w:r>
-      <w:r>
-        <w:rPr>
-          <w:b/>
-          <w:bCs/>
-          <w:lang w:val="vi-VN"/>
-        </w:rPr>
-        <w:t xml:space="preserve"> và implement</w:t>
-      </w:r>
-    </w:p>
-    <w:p>
-      <w:pPr>
-        <w:rPr>
-          <w:lang w:val="vi-VN"/>
-        </w:rPr>
-      </w:pPr>
-      <w:r>
-        <w:rPr>
-          <w:lang w:val="vi-VN"/>
+        <w:t xml:space="preserve"> context</w:t>
+      </w:r>
+    </w:p>
+    <w:p>
+      <w:pPr>
+        <w:rPr>
+          <w:b/>
+          <w:bCs/>
+          <w:lang w:val="vi-VN"/>
+        </w:rPr>
+      </w:pPr>
+      <w:r>
+        <w:rPr>
+          <w:b/>
+          <w:bCs/>
+          <w:noProof/>
         </w:rPr>
         <w:drawing>
-          <wp:inline distT="0" distB="0" distL="0" distR="0" wp14:anchorId="32E86C2E" wp14:editId="226702A5">
-            <wp:extent cx="5943600" cy="681355"/>
-            <wp:effectExtent l="0" t="0" r="0" b="4445"/>
-            <wp:docPr id="21" name="Picture 21"/>
+          <wp:inline distT="0" distB="0" distL="0" distR="0" wp14:anchorId="72657373" wp14:editId="53A7BBAD">
+            <wp:extent cx="5943600" cy="2715491"/>
+            <wp:effectExtent l="0" t="0" r="0" b="8890"/>
+            <wp:docPr id="19" name="Picture 19"/>
             <wp:cNvGraphicFramePr>
               <a:graphicFrameLocks xmlns:a="http://schemas.openxmlformats.org/drawingml/2006/main" noChangeAspect="1"/>
             </wp:cNvGraphicFramePr>
@@ -1641,7 +1506,7 @@
                   <pic:spPr>
                     <a:xfrm>
                       <a:off x="0" y="0"/>
-                      <a:ext cx="5943600" cy="681355"/>
+                      <a:ext cx="5949031" cy="2717972"/>
                     </a:xfrm>
                     <a:prstGeom prst="rect">
                       <a:avLst/>
@@ -1656,19 +1521,52 @@
     </w:p>
     <w:p>
       <w:pPr>
-        <w:rPr>
-          <w:lang w:val="vi-VN"/>
-        </w:rPr>
-      </w:pPr>
-      <w:r>
-        <w:rPr>
-          <w:lang w:val="vi-VN"/>
+        <w:pStyle w:val="ListParagraph"/>
+        <w:numPr>
+          <w:ilvl w:val="0"/>
+          <w:numId w:val="4"/>
+        </w:numPr>
+        <w:rPr>
+          <w:b/>
+          <w:bCs/>
+          <w:lang w:val="vi-VN"/>
+        </w:rPr>
+      </w:pPr>
+      <w:r>
+        <w:rPr>
+          <w:b/>
+          <w:bCs/>
+        </w:rPr>
+        <w:t>Thực</w:t>
+      </w:r>
+      <w:r>
+        <w:rPr>
+          <w:b/>
+          <w:bCs/>
+          <w:lang w:val="vi-VN"/>
+        </w:rPr>
+        <w:t xml:space="preserve"> thi và kết quả</w:t>
+      </w:r>
+    </w:p>
+    <w:p>
+      <w:pPr>
+        <w:rPr>
+          <w:b/>
+          <w:bCs/>
+          <w:lang w:val="vi-VN"/>
+        </w:rPr>
+      </w:pPr>
+      <w:r>
+        <w:rPr>
+          <w:b/>
+          <w:bCs/>
+          <w:noProof/>
         </w:rPr>
         <w:drawing>
-          <wp:inline distT="0" distB="0" distL="0" distR="0" wp14:anchorId="0FF122B8" wp14:editId="61227C97">
-            <wp:extent cx="5943600" cy="694690"/>
+          <wp:inline distT="0" distB="0" distL="0" distR="0" wp14:anchorId="2ECE36A1" wp14:editId="5F292CB0">
+            <wp:extent cx="5943600" cy="1894840"/>
             <wp:effectExtent l="0" t="0" r="0" b="0"/>
-            <wp:docPr id="22" name="Picture 22"/>
+            <wp:docPr id="20" name="Picture 20"/>
             <wp:cNvGraphicFramePr>
               <a:graphicFrameLocks xmlns:a="http://schemas.openxmlformats.org/drawingml/2006/main" noChangeAspect="1"/>
             </wp:cNvGraphicFramePr>
@@ -1688,7 +1586,7 @@
                   <pic:spPr>
                     <a:xfrm>
                       <a:off x="0" y="0"/>
-                      <a:ext cx="5943600" cy="694690"/>
+                      <a:ext cx="5943600" cy="1894840"/>
                     </a:xfrm>
                     <a:prstGeom prst="rect">
                       <a:avLst/>
@@ -1703,19 +1601,112 @@
     </w:p>
     <w:p>
       <w:pPr>
-        <w:rPr>
-          <w:lang w:val="vi-VN"/>
-        </w:rPr>
-      </w:pPr>
-      <w:r>
-        <w:rPr>
-          <w:lang w:val="vi-VN"/>
+        <w:pStyle w:val="ListParagraph"/>
+        <w:numPr>
+          <w:ilvl w:val="0"/>
+          <w:numId w:val="1"/>
+        </w:numPr>
+        <w:rPr>
+          <w:b/>
+          <w:bCs/>
+        </w:rPr>
+      </w:pPr>
+      <w:r>
+        <w:rPr>
+          <w:b/>
+          <w:bCs/>
+        </w:rPr>
+        <w:t>Decorator</w:t>
+      </w:r>
+      <w:r>
+        <w:rPr>
+          <w:b/>
+          <w:bCs/>
+          <w:lang w:val="vi-VN"/>
+        </w:rPr>
+        <w:t xml:space="preserve"> </w:t>
+      </w:r>
+      <w:r>
+        <w:rPr>
+          <w:b/>
+          <w:bCs/>
+        </w:rPr>
+        <w:t>Pattern</w:t>
+      </w:r>
+    </w:p>
+    <w:p>
+      <w:pPr>
+        <w:rPr>
+          <w:lang w:val="vi-VN"/>
+        </w:rPr>
+      </w:pPr>
+      <w:r>
+        <w:t>T</w:t>
+      </w:r>
+      <w:r>
+        <w:t>ạo một hệ thống thanh toán, nơi bạn có thể thanh toán bằng các phương thức khác nhau như Thẻ tín dụng, PayPal, và có thể thêm các phương thức thanh toán này với các tính năng bổ sung như Phí xử lý, Mã giảm giá.</w:t>
+      </w:r>
+    </w:p>
+    <w:p>
+      <w:pPr>
+        <w:pStyle w:val="ListParagraph"/>
+        <w:numPr>
+          <w:ilvl w:val="1"/>
+          <w:numId w:val="1"/>
+        </w:numPr>
+        <w:rPr>
+          <w:b/>
+          <w:bCs/>
+          <w:lang w:val="vi-VN"/>
+        </w:rPr>
+      </w:pPr>
+      <w:r>
+        <w:rPr>
+          <w:b/>
+          <w:bCs/>
+        </w:rPr>
+        <w:t>Tạo</w:t>
+      </w:r>
+      <w:r>
+        <w:rPr>
+          <w:b/>
+          <w:bCs/>
+          <w:lang w:val="vi-VN"/>
+        </w:rPr>
+        <w:t xml:space="preserve"> </w:t>
+      </w:r>
+      <w:r>
+        <w:rPr>
+          <w:b/>
+          <w:bCs/>
+          <w:lang w:val="vi-VN"/>
+        </w:rPr>
+        <w:t>decorator</w:t>
+      </w:r>
+      <w:r>
+        <w:rPr>
+          <w:b/>
+          <w:bCs/>
+          <w:lang w:val="vi-VN"/>
+        </w:rPr>
+        <w:t xml:space="preserve"> và implement</w:t>
+      </w:r>
+    </w:p>
+    <w:p>
+      <w:pPr>
+        <w:rPr>
+          <w:lang w:val="vi-VN"/>
+        </w:rPr>
+      </w:pPr>
+      <w:r>
+        <w:rPr>
+          <w:noProof/>
         </w:rPr>
         <w:drawing>
-          <wp:inline distT="0" distB="0" distL="0" distR="0" wp14:anchorId="3AB9CF57" wp14:editId="52E8320E">
-            <wp:extent cx="5943600" cy="871220"/>
-            <wp:effectExtent l="0" t="0" r="0" b="5080"/>
-            <wp:docPr id="23" name="Picture 23"/>
+          <wp:inline distT="0" distB="0" distL="0" distR="0" wp14:anchorId="32E86C2E" wp14:editId="226702A5">
+            <wp:extent cx="5943600" cy="681355"/>
+            <wp:effectExtent l="0" t="0" r="0" b="4445"/>
+            <wp:docPr id="21" name="Picture 21"/>
             <wp:cNvGraphicFramePr>
               <a:graphicFrameLocks xmlns:a="http://schemas.openxmlformats.org/drawingml/2006/main" noChangeAspect="1"/>
             </wp:cNvGraphicFramePr>
@@ -1735,7 +1726,7 @@
                   <pic:spPr>
                     <a:xfrm>
                       <a:off x="0" y="0"/>
-                      <a:ext cx="5943600" cy="871220"/>
+                      <a:ext cx="5943600" cy="681355"/>
                     </a:xfrm>
                     <a:prstGeom prst="rect">
                       <a:avLst/>
@@ -1756,13 +1747,14 @@
       </w:pPr>
       <w:r>
         <w:rPr>
-          <w:lang w:val="vi-VN"/>
-        </w:rPr>
+          <w:noProof/>
+        </w:rPr>
+        <w:lastRenderedPageBreak/>
         <w:drawing>
-          <wp:inline distT="0" distB="0" distL="0" distR="0" wp14:anchorId="5B14E0C4" wp14:editId="6D5BB546">
-            <wp:extent cx="5943600" cy="664210"/>
-            <wp:effectExtent l="0" t="0" r="0" b="2540"/>
-            <wp:docPr id="24" name="Picture 24"/>
+          <wp:inline distT="0" distB="0" distL="0" distR="0" wp14:anchorId="0FF122B8" wp14:editId="61227C97">
+            <wp:extent cx="5943600" cy="694690"/>
+            <wp:effectExtent l="0" t="0" r="0" b="0"/>
+            <wp:docPr id="22" name="Picture 22"/>
             <wp:cNvGraphicFramePr>
               <a:graphicFrameLocks xmlns:a="http://schemas.openxmlformats.org/drawingml/2006/main" noChangeAspect="1"/>
             </wp:cNvGraphicFramePr>
@@ -1782,7 +1774,7 @@
                   <pic:spPr>
                     <a:xfrm>
                       <a:off x="0" y="0"/>
-                      <a:ext cx="5943600" cy="664210"/>
+                      <a:ext cx="5943600" cy="694690"/>
                     </a:xfrm>
                     <a:prstGeom prst="rect">
                       <a:avLst/>
@@ -1803,13 +1795,13 @@
       </w:pPr>
       <w:r>
         <w:rPr>
-          <w:lang w:val="vi-VN"/>
+          <w:noProof/>
         </w:rPr>
         <w:drawing>
-          <wp:inline distT="0" distB="0" distL="0" distR="0" wp14:anchorId="54E4EC8A" wp14:editId="134F1C5C">
-            <wp:extent cx="5943600" cy="672465"/>
-            <wp:effectExtent l="0" t="0" r="0" b="0"/>
-            <wp:docPr id="25" name="Picture 25"/>
+          <wp:inline distT="0" distB="0" distL="0" distR="0" wp14:anchorId="3AB9CF57" wp14:editId="52E8320E">
+            <wp:extent cx="5943600" cy="871220"/>
+            <wp:effectExtent l="0" t="0" r="0" b="5080"/>
+            <wp:docPr id="23" name="Picture 23"/>
             <wp:cNvGraphicFramePr>
               <a:graphicFrameLocks xmlns:a="http://schemas.openxmlformats.org/drawingml/2006/main" noChangeAspect="1"/>
             </wp:cNvGraphicFramePr>
@@ -1829,7 +1821,7 @@
                   <pic:spPr>
                     <a:xfrm>
                       <a:off x="0" y="0"/>
-                      <a:ext cx="5943600" cy="672465"/>
+                      <a:ext cx="5943600" cy="871220"/>
                     </a:xfrm>
                     <a:prstGeom prst="rect">
                       <a:avLst/>
@@ -1844,52 +1836,19 @@
     </w:p>
     <w:p>
       <w:pPr>
-        <w:pStyle w:val="ListParagraph"/>
-        <w:numPr>
-          <w:ilvl w:val="0"/>
-          <w:numId w:val="4"/>
-        </w:numPr>
-        <w:rPr>
-          <w:b/>
-          <w:bCs/>
-          <w:lang w:val="vi-VN"/>
-        </w:rPr>
-      </w:pPr>
-      <w:r>
-        <w:rPr>
-          <w:b/>
-          <w:bCs/>
-        </w:rPr>
-        <w:t>Thực</w:t>
-      </w:r>
-      <w:r>
-        <w:rPr>
-          <w:b/>
-          <w:bCs/>
-          <w:lang w:val="vi-VN"/>
-        </w:rPr>
-        <w:t xml:space="preserve"> thi và kết quả</w:t>
-      </w:r>
-    </w:p>
-    <w:p>
-      <w:pPr>
-        <w:rPr>
-          <w:b/>
-          <w:bCs/>
-          <w:lang w:val="vi-VN"/>
-        </w:rPr>
-      </w:pPr>
-      <w:r>
-        <w:rPr>
-          <w:b/>
-          <w:bCs/>
-          <w:lang w:val="vi-VN"/>
+        <w:rPr>
+          <w:lang w:val="vi-VN"/>
+        </w:rPr>
+      </w:pPr>
+      <w:r>
+        <w:rPr>
+          <w:noProof/>
         </w:rPr>
         <w:drawing>
-          <wp:inline distT="0" distB="0" distL="0" distR="0" wp14:anchorId="4540E98A" wp14:editId="677E465B">
-            <wp:extent cx="5942451" cy="1274618"/>
-            <wp:effectExtent l="0" t="0" r="1270" b="1905"/>
-            <wp:docPr id="26" name="Picture 26"/>
+          <wp:inline distT="0" distB="0" distL="0" distR="0" wp14:anchorId="5B14E0C4" wp14:editId="6D5BB546">
+            <wp:extent cx="5943600" cy="664210"/>
+            <wp:effectExtent l="0" t="0" r="0" b="2540"/>
+            <wp:docPr id="24" name="Picture 24"/>
             <wp:cNvGraphicFramePr>
               <a:graphicFrameLocks xmlns:a="http://schemas.openxmlformats.org/drawingml/2006/main" noChangeAspect="1"/>
             </wp:cNvGraphicFramePr>
@@ -1909,7 +1868,7 @@
                   <pic:spPr>
                     <a:xfrm>
                       <a:off x="0" y="0"/>
-                      <a:ext cx="5953544" cy="1276997"/>
+                      <a:ext cx="5943600" cy="664210"/>
                     </a:xfrm>
                     <a:prstGeom prst="rect">
                       <a:avLst/>
@@ -1925,22 +1884,18 @@
     <w:p>
       <w:pPr>
         <w:rPr>
-          <w:b/>
-          <w:bCs/>
-          <w:lang w:val="vi-VN"/>
-        </w:rPr>
-      </w:pPr>
-      <w:r>
-        <w:rPr>
-          <w:b/>
-          <w:bCs/>
-          <w:lang w:val="vi-VN"/>
+          <w:lang w:val="vi-VN"/>
+        </w:rPr>
+      </w:pPr>
+      <w:r>
+        <w:rPr>
+          <w:noProof/>
         </w:rPr>
         <w:drawing>
-          <wp:inline distT="0" distB="0" distL="0" distR="0" wp14:anchorId="24F6EA85" wp14:editId="1481E707">
-            <wp:extent cx="5943600" cy="707390"/>
+          <wp:inline distT="0" distB="0" distL="0" distR="0" wp14:anchorId="54E4EC8A" wp14:editId="134F1C5C">
+            <wp:extent cx="5943600" cy="672465"/>
             <wp:effectExtent l="0" t="0" r="0" b="0"/>
-            <wp:docPr id="27" name="Picture 27"/>
+            <wp:docPr id="25" name="Picture 25"/>
             <wp:cNvGraphicFramePr>
               <a:graphicFrameLocks xmlns:a="http://schemas.openxmlformats.org/drawingml/2006/main" noChangeAspect="1"/>
             </wp:cNvGraphicFramePr>
@@ -1960,6 +1915,136 @@
                   <pic:spPr>
                     <a:xfrm>
                       <a:off x="0" y="0"/>
+                      <a:ext cx="5943600" cy="672465"/>
+                    </a:xfrm>
+                    <a:prstGeom prst="rect">
+                      <a:avLst/>
+                    </a:prstGeom>
+                  </pic:spPr>
+                </pic:pic>
+              </a:graphicData>
+            </a:graphic>
+          </wp:inline>
+        </w:drawing>
+      </w:r>
+    </w:p>
+    <w:p>
+      <w:pPr>
+        <w:pStyle w:val="ListParagraph"/>
+        <w:numPr>
+          <w:ilvl w:val="0"/>
+          <w:numId w:val="4"/>
+        </w:numPr>
+        <w:rPr>
+          <w:b/>
+          <w:bCs/>
+          <w:lang w:val="vi-VN"/>
+        </w:rPr>
+      </w:pPr>
+      <w:r>
+        <w:rPr>
+          <w:b/>
+          <w:bCs/>
+        </w:rPr>
+        <w:t>Thực</w:t>
+      </w:r>
+      <w:r>
+        <w:rPr>
+          <w:b/>
+          <w:bCs/>
+          <w:lang w:val="vi-VN"/>
+        </w:rPr>
+        <w:t xml:space="preserve"> thi và kết quả</w:t>
+      </w:r>
+    </w:p>
+    <w:p>
+      <w:pPr>
+        <w:rPr>
+          <w:b/>
+          <w:bCs/>
+          <w:lang w:val="vi-VN"/>
+        </w:rPr>
+      </w:pPr>
+      <w:r>
+        <w:rPr>
+          <w:b/>
+          <w:bCs/>
+          <w:noProof/>
+        </w:rPr>
+        <w:drawing>
+          <wp:inline distT="0" distB="0" distL="0" distR="0" wp14:anchorId="4540E98A" wp14:editId="677E465B">
+            <wp:extent cx="5942451" cy="1274618"/>
+            <wp:effectExtent l="0" t="0" r="1270" b="1905"/>
+            <wp:docPr id="26" name="Picture 26"/>
+            <wp:cNvGraphicFramePr>
+              <a:graphicFrameLocks xmlns:a="http://schemas.openxmlformats.org/drawingml/2006/main" noChangeAspect="1"/>
+            </wp:cNvGraphicFramePr>
+            <a:graphic xmlns:a="http://schemas.openxmlformats.org/drawingml/2006/main">
+              <a:graphicData uri="http://schemas.openxmlformats.org/drawingml/2006/picture">
+                <pic:pic xmlns:pic="http://schemas.openxmlformats.org/drawingml/2006/picture">
+                  <pic:nvPicPr>
+                    <pic:cNvPr id="1" name=""/>
+                    <pic:cNvPicPr/>
+                  </pic:nvPicPr>
+                  <pic:blipFill>
+                    <a:blip r:embed="rId32"/>
+                    <a:stretch>
+                      <a:fillRect/>
+                    </a:stretch>
+                  </pic:blipFill>
+                  <pic:spPr>
+                    <a:xfrm>
+                      <a:off x="0" y="0"/>
+                      <a:ext cx="5953544" cy="1276997"/>
+                    </a:xfrm>
+                    <a:prstGeom prst="rect">
+                      <a:avLst/>
+                    </a:prstGeom>
+                  </pic:spPr>
+                </pic:pic>
+              </a:graphicData>
+            </a:graphic>
+          </wp:inline>
+        </w:drawing>
+      </w:r>
+    </w:p>
+    <w:p>
+      <w:pPr>
+        <w:rPr>
+          <w:b/>
+          <w:bCs/>
+        </w:rPr>
+      </w:pPr>
+      <w:r>
+        <w:rPr>
+          <w:b/>
+          <w:bCs/>
+          <w:noProof/>
+        </w:rPr>
+        <w:drawing>
+          <wp:inline distT="0" distB="0" distL="0" distR="0" wp14:anchorId="24F6EA85" wp14:editId="1481E707">
+            <wp:extent cx="5943600" cy="707390"/>
+            <wp:effectExtent l="0" t="0" r="0" b="0"/>
+            <wp:docPr id="27" name="Picture 27"/>
+            <wp:cNvGraphicFramePr>
+              <a:graphicFrameLocks xmlns:a="http://schemas.openxmlformats.org/drawingml/2006/main" noChangeAspect="1"/>
+            </wp:cNvGraphicFramePr>
+            <a:graphic xmlns:a="http://schemas.openxmlformats.org/drawingml/2006/main">
+              <a:graphicData uri="http://schemas.openxmlformats.org/drawingml/2006/picture">
+                <pic:pic xmlns:pic="http://schemas.openxmlformats.org/drawingml/2006/picture">
+                  <pic:nvPicPr>
+                    <pic:cNvPr id="1" name=""/>
+                    <pic:cNvPicPr/>
+                  </pic:nvPicPr>
+                  <pic:blipFill>
+                    <a:blip r:embed="rId33"/>
+                    <a:stretch>
+                      <a:fillRect/>
+                    </a:stretch>
+                  </pic:blipFill>
+                  <pic:spPr>
+                    <a:xfrm>
+                      <a:off x="0" y="0"/>
                       <a:ext cx="5943600" cy="707390"/>
                     </a:xfrm>
                     <a:prstGeom prst="rect">
@@ -1976,31 +2061,6 @@
     <w:p>
       <w:pPr>
         <w:rPr>
-          <w:b/>
-          <w:bCs/>
-          <w:lang w:val="vi-VN"/>
-        </w:rPr>
-      </w:pPr>
-    </w:p>
-    <w:p>
-      <w:pPr>
-        <w:rPr>
-          <w:b/>
-          <w:bCs/>
-          <w:lang w:val="vi-VN"/>
-        </w:rPr>
-      </w:pPr>
-    </w:p>
-    <w:p>
-      <w:pPr>
-        <w:rPr>
-          <w:lang w:val="vi-VN"/>
-        </w:rPr>
-      </w:pPr>
-    </w:p>
-    <w:p>
-      <w:pPr>
-        <w:rPr>
           <w:lang w:val="vi-VN"/>
         </w:rPr>
       </w:pPr>
@@ -2026,23 +2086,7 @@
           <w:bCs/>
           <w:lang w:val="vi-VN"/>
         </w:rPr>
-        <w:t xml:space="preserve">State </w:t>
-      </w:r>
-      <w:r>
-        <w:rPr>
-          <w:b/>
-          <w:bCs/>
-          <w:lang w:val="vi-VN"/>
-        </w:rPr>
-        <w:t>pattern</w:t>
-      </w:r>
-      <w:r>
-        <w:rPr>
-          <w:b/>
-          <w:bCs/>
-          <w:lang w:val="vi-VN"/>
-        </w:rPr>
-        <w:t>:</w:t>
+        <w:t>State pattern:</w:t>
       </w:r>
       <w:r>
         <w:rPr>
@@ -2087,23 +2131,7 @@
           <w:bCs/>
           <w:lang w:val="vi-VN"/>
         </w:rPr>
-        <w:t>Strategy</w:t>
-      </w:r>
-      <w:r>
-        <w:rPr>
-          <w:b/>
-          <w:bCs/>
-          <w:lang w:val="vi-VN"/>
-        </w:rPr>
-        <w:t xml:space="preserve"> pattern</w:t>
-      </w:r>
-      <w:r>
-        <w:rPr>
-          <w:b/>
-          <w:bCs/>
-          <w:lang w:val="vi-VN"/>
-        </w:rPr>
-        <w:t>:</w:t>
+        <w:t>Strategy pattern:</w:t>
       </w:r>
       <w:r>
         <w:rPr>
@@ -2125,34 +2153,13 @@
       </w:r>
     </w:p>
     <w:p>
-      <w:pPr>
-        <w:rPr>
-          <w:lang w:val="vi-VN"/>
-        </w:rPr>
-      </w:pPr>
-      <w:r>
-        <w:rPr>
-          <w:b/>
-          <w:bCs/>
-          <w:lang w:val="vi-VN"/>
-        </w:rPr>
-        <w:t>Decorator</w:t>
-      </w:r>
-      <w:r>
-        <w:rPr>
-          <w:b/>
-          <w:bCs/>
-          <w:lang w:val="vi-VN"/>
-        </w:rPr>
-        <w:t xml:space="preserve"> pattern</w:t>
-      </w:r>
-      <w:r>
-        <w:rPr>
-          <w:b/>
-          <w:bCs/>
-          <w:lang w:val="vi-VN"/>
-        </w:rPr>
-        <w:t>:</w:t>
+      <w:r>
+        <w:rPr>
+          <w:b/>
+          <w:bCs/>
+          <w:lang w:val="vi-VN"/>
+        </w:rPr>
+        <w:t>Decorator pattern:</w:t>
       </w:r>
       <w:r>
         <w:rPr>
@@ -2165,6 +2172,10 @@
       </w:r>
     </w:p>
     <w:p/>
+    <w:p>
+      <w:bookmarkStart w:id="0" w:name="_GoBack"/>
+      <w:bookmarkEnd w:id="0"/>
+    </w:p>
     <w:p/>
     <w:p/>
     <w:sectPr>
@@ -2178,8 +2189,8 @@
 </file>
 
 <file path=word/numbering.xml><?xml version="1.0" encoding="utf-8"?>
-<w:numbering xmlns:wpc="http://schemas.microsoft.com/office/word/2010/wordprocessingCanvas" xmlns:cx="http://schemas.microsoft.com/office/drawing/2014/chartex" xmlns:cx1="http://schemas.microsoft.com/office/drawing/2015/9/8/chartex" xmlns:cx2="http://schemas.microsoft.com/office/drawing/2015/10/21/chartex" xmlns:cx3="http://schemas.microsoft.com/office/drawing/2016/5/9/chartex" xmlns:cx4="http://schemas.microsoft.com/office/drawing/2016/5/10/chartex" xmlns:cx5="http://schemas.microsoft.com/office/drawing/2016/5/11/chartex" xmlns:cx6="http://schemas.microsoft.com/office/drawing/2016/5/12/chartex" xmlns:cx7="http://schemas.microsoft.com/office/drawing/2016/5/13/chartex" xmlns:cx8="http://schemas.microsoft.com/office/drawing/2016/5/14/chartex" xmlns:mc="http://schemas.openxmlformats.org/markup-compatibility/2006" xmlns:aink="http://schemas.microsoft.com/office/drawing/2016/ink" xmlns:am3d="http://schemas.microsoft.com/office/drawing/2017/model3d" xmlns:o="urn:schemas-microsoft-com:office:office" xmlns:oel="http://schemas.microsoft.com/office/2019/extlst" xmlns:r="http://schemas.openxmlformats.org/officeDocument/2006/relationships" xmlns:m="http://schemas.openxmlformats.org/officeDocument/2006/math" xmlns:v="urn:schemas-microsoft-com:vml" xmlns:wp14="http://schemas.microsoft.com/office/word/2010/wordprocessingDrawing" xmlns:wp="http://schemas.openxmlformats.org/drawingml/2006/wordprocessingDrawing" xmlns:w10="urn:schemas-microsoft-com:office:word" xmlns:w="http://schemas.openxmlformats.org/wordprocessingml/2006/main" xmlns:w14="http://schemas.microsoft.com/office/word/2010/wordml" xmlns:w15="http://schemas.microsoft.com/office/word/2012/wordml" xmlns:w16cex="http://schemas.microsoft.com/office/word/2018/wordml/cex" xmlns:w16cid="http://schemas.microsoft.com/office/word/2016/wordml/cid" xmlns:w16="http://schemas.microsoft.com/office/word/2018/wordml" xmlns:w16sdtdh="http://schemas.microsoft.com/office/word/2020/wordml/sdtdatahash" xmlns:w16se="http://schemas.microsoft.com/office/word/2015/wordml/symex" xmlns:wpg="http://schemas.microsoft.com/office/word/2010/wordprocessingGroup" xmlns:wpi="http://schemas.microsoft.com/office/word/2010/wordprocessingInk" xmlns:wne="http://schemas.microsoft.com/office/word/2006/wordml" xmlns:wps="http://schemas.microsoft.com/office/word/2010/wordprocessingShape" mc:Ignorable="w14 w15 w16se w16cid w16 w16cex w16sdtdh wp14">
-  <w:abstractNum w:abstractNumId="0" w15:restartNumberingAfterBreak="0">
+<w:numbering xmlns:wpc="http://schemas.microsoft.com/office/word/2010/wordprocessingCanvas" xmlns:mc="http://schemas.openxmlformats.org/markup-compatibility/2006" xmlns:o="urn:schemas-microsoft-com:office:office" xmlns:r="http://schemas.openxmlformats.org/officeDocument/2006/relationships" xmlns:m="http://schemas.openxmlformats.org/officeDocument/2006/math" xmlns:v="urn:schemas-microsoft-com:vml" xmlns:wp14="http://schemas.microsoft.com/office/word/2010/wordprocessingDrawing" xmlns:wp="http://schemas.openxmlformats.org/drawingml/2006/wordprocessingDrawing" xmlns:w10="urn:schemas-microsoft-com:office:word" xmlns:w="http://schemas.openxmlformats.org/wordprocessingml/2006/main" xmlns:w14="http://schemas.microsoft.com/office/word/2010/wordml" xmlns:wpg="http://schemas.microsoft.com/office/word/2010/wordprocessingGroup" xmlns:wpi="http://schemas.microsoft.com/office/word/2010/wordprocessingInk" xmlns:wne="http://schemas.microsoft.com/office/word/2006/wordml" xmlns:wps="http://schemas.microsoft.com/office/word/2010/wordprocessingShape" mc:Ignorable="w14 wp14">
+  <w:abstractNum w:abstractNumId="0">
     <w:nsid w:val="069B0B6E"/>
     <w:multiLevelType w:val="hybridMultilevel"/>
     <w:tmpl w:val="CAB0814A"/>
@@ -2268,7 +2279,7 @@
       </w:pPr>
     </w:lvl>
   </w:abstractNum>
-  <w:abstractNum w:abstractNumId="1" w15:restartNumberingAfterBreak="0">
+  <w:abstractNum w:abstractNumId="1">
     <w:nsid w:val="3E190815"/>
     <w:multiLevelType w:val="hybridMultilevel"/>
     <w:tmpl w:val="6F9AD116"/>
@@ -2354,7 +2365,7 @@
       </w:pPr>
     </w:lvl>
   </w:abstractNum>
-  <w:abstractNum w:abstractNumId="2" w15:restartNumberingAfterBreak="0">
+  <w:abstractNum w:abstractNumId="2">
     <w:nsid w:val="42673B6F"/>
     <w:multiLevelType w:val="hybridMultilevel"/>
     <w:tmpl w:val="F1DACEDA"/>
@@ -2443,7 +2454,7 @@
       </w:pPr>
     </w:lvl>
   </w:abstractNum>
-  <w:abstractNum w:abstractNumId="3" w15:restartNumberingAfterBreak="0">
+  <w:abstractNum w:abstractNumId="3">
     <w:nsid w:val="4C255A61"/>
     <w:multiLevelType w:val="hybridMultilevel"/>
     <w:tmpl w:val="D8F27CDE"/>
@@ -2532,7 +2543,7 @@
       </w:pPr>
     </w:lvl>
   </w:abstractNum>
-  <w:abstractNum w:abstractNumId="4" w15:restartNumberingAfterBreak="0">
+  <w:abstractNum w:abstractNumId="4">
     <w:nsid w:val="6F1C5AD4"/>
     <w:multiLevelType w:val="hybridMultilevel"/>
     <w:tmpl w:val="53DCB98A"/>
@@ -2621,7 +2632,7 @@
       </w:pPr>
     </w:lvl>
   </w:abstractNum>
-  <w:abstractNum w:abstractNumId="5" w15:restartNumberingAfterBreak="0">
+  <w:abstractNum w:abstractNumId="5">
     <w:nsid w:val="77CB73A5"/>
     <w:multiLevelType w:val="hybridMultilevel"/>
     <w:tmpl w:val="079649F8"/>
@@ -2731,29 +2742,29 @@
       </w:rPr>
     </w:lvl>
   </w:abstractNum>
-  <w:num w:numId="1" w16cid:durableId="1886332217">
+  <w:num w:numId="1">
     <w:abstractNumId w:val="5"/>
   </w:num>
-  <w:num w:numId="2" w16cid:durableId="251739360">
+  <w:num w:numId="2">
     <w:abstractNumId w:val="2"/>
   </w:num>
-  <w:num w:numId="3" w16cid:durableId="1743022655">
+  <w:num w:numId="3">
     <w:abstractNumId w:val="1"/>
   </w:num>
-  <w:num w:numId="4" w16cid:durableId="466583410">
+  <w:num w:numId="4">
     <w:abstractNumId w:val="0"/>
   </w:num>
-  <w:num w:numId="5" w16cid:durableId="1183861049">
+  <w:num w:numId="5">
     <w:abstractNumId w:val="4"/>
   </w:num>
-  <w:num w:numId="6" w16cid:durableId="220941483">
+  <w:num w:numId="6">
     <w:abstractNumId w:val="3"/>
   </w:num>
 </w:numbering>
 </file>
 
 <file path=word/styles.xml><?xml version="1.0" encoding="utf-8"?>
-<w:styles xmlns:mc="http://schemas.openxmlformats.org/markup-compatibility/2006" xmlns:r="http://schemas.openxmlformats.org/officeDocument/2006/relationships" xmlns:w="http://schemas.openxmlformats.org/wordprocessingml/2006/main" xmlns:w14="http://schemas.microsoft.com/office/word/2010/wordml" xmlns:w15="http://schemas.microsoft.com/office/word/2012/wordml" xmlns:w16cex="http://schemas.microsoft.com/office/word/2018/wordml/cex" xmlns:w16cid="http://schemas.microsoft.com/office/word/2016/wordml/cid" xmlns:w16="http://schemas.microsoft.com/office/word/2018/wordml" xmlns:w16sdtdh="http://schemas.microsoft.com/office/word/2020/wordml/sdtdatahash" xmlns:w16se="http://schemas.microsoft.com/office/word/2015/wordml/symex" mc:Ignorable="w14 w15 w16se w16cid w16 w16cex w16sdtdh">
+<w:styles xmlns:mc="http://schemas.openxmlformats.org/markup-compatibility/2006" xmlns:r="http://schemas.openxmlformats.org/officeDocument/2006/relationships" xmlns:w="http://schemas.openxmlformats.org/wordprocessingml/2006/main" xmlns:w14="http://schemas.microsoft.com/office/word/2010/wordml" mc:Ignorable="w14">
   <w:docDefaults>
     <w:rPrDefault>
       <w:rPr>
@@ -2771,383 +2782,144 @@
       </w:pPr>
     </w:pPrDefault>
   </w:docDefaults>
-  <w:latentStyles w:defLockedState="0" w:defUIPriority="99" w:defSemiHidden="0" w:defUnhideWhenUsed="0" w:defQFormat="0" w:count="376">
-    <w:lsdException w:name="Normal" w:uiPriority="0" w:qFormat="1"/>
-    <w:lsdException w:name="heading 1" w:uiPriority="9" w:qFormat="1"/>
-    <w:lsdException w:name="heading 2" w:semiHidden="1" w:uiPriority="9" w:unhideWhenUsed="1" w:qFormat="1"/>
-    <w:lsdException w:name="heading 3" w:semiHidden="1" w:uiPriority="9" w:unhideWhenUsed="1" w:qFormat="1"/>
-    <w:lsdException w:name="heading 4" w:semiHidden="1" w:uiPriority="9" w:unhideWhenUsed="1" w:qFormat="1"/>
-    <w:lsdException w:name="heading 5" w:semiHidden="1" w:uiPriority="9" w:unhideWhenUsed="1" w:qFormat="1"/>
-    <w:lsdException w:name="heading 6" w:semiHidden="1" w:uiPriority="9" w:unhideWhenUsed="1" w:qFormat="1"/>
-    <w:lsdException w:name="heading 7" w:semiHidden="1" w:uiPriority="9" w:unhideWhenUsed="1" w:qFormat="1"/>
-    <w:lsdException w:name="heading 8" w:semiHidden="1" w:uiPriority="9" w:unhideWhenUsed="1" w:qFormat="1"/>
-    <w:lsdException w:name="heading 9" w:semiHidden="1" w:uiPriority="9" w:unhideWhenUsed="1" w:qFormat="1"/>
-    <w:lsdException w:name="index 1" w:semiHidden="1" w:unhideWhenUsed="1"/>
-    <w:lsdException w:name="index 2" w:semiHidden="1" w:unhideWhenUsed="1"/>
-    <w:lsdException w:name="index 3" w:semiHidden="1" w:unhideWhenUsed="1"/>
-    <w:lsdException w:name="index 4" w:semiHidden="1" w:unhideWhenUsed="1"/>
-    <w:lsdException w:name="index 5" w:semiHidden="1" w:unhideWhenUsed="1"/>
-    <w:lsdException w:name="index 6" w:semiHidden="1" w:unhideWhenUsed="1"/>
-    <w:lsdException w:name="index 7" w:semiHidden="1" w:unhideWhenUsed="1"/>
-    <w:lsdException w:name="index 8" w:semiHidden="1" w:unhideWhenUsed="1"/>
-    <w:lsdException w:name="index 9" w:semiHidden="1" w:unhideWhenUsed="1"/>
-    <w:lsdException w:name="toc 1" w:semiHidden="1" w:uiPriority="39" w:unhideWhenUsed="1"/>
-    <w:lsdException w:name="toc 2" w:semiHidden="1" w:uiPriority="39" w:unhideWhenUsed="1"/>
-    <w:lsdException w:name="toc 3" w:semiHidden="1" w:uiPriority="39" w:unhideWhenUsed="1"/>
-    <w:lsdException w:name="toc 4" w:semiHidden="1" w:uiPriority="39" w:unhideWhenUsed="1"/>
-    <w:lsdException w:name="toc 5" w:semiHidden="1" w:uiPriority="39" w:unhideWhenUsed="1"/>
-    <w:lsdException w:name="toc 6" w:semiHidden="1" w:uiPriority="39" w:unhideWhenUsed="1"/>
-    <w:lsdException w:name="toc 7" w:semiHidden="1" w:uiPriority="39" w:unhideWhenUsed="1"/>
-    <w:lsdException w:name="toc 8" w:semiHidden="1" w:uiPriority="39" w:unhideWhenUsed="1"/>
-    <w:lsdException w:name="toc 9" w:semiHidden="1" w:uiPriority="39" w:unhideWhenUsed="1"/>
-    <w:lsdException w:name="Normal Indent" w:semiHidden="1" w:unhideWhenUsed="1"/>
-    <w:lsdException w:name="footnote text" w:semiHidden="1" w:unhideWhenUsed="1"/>
-    <w:lsdException w:name="annotation text" w:semiHidden="1" w:unhideWhenUsed="1"/>
-    <w:lsdException w:name="header" w:semiHidden="1" w:unhideWhenUsed="1"/>
-    <w:lsdException w:name="footer" w:semiHidden="1" w:unhideWhenUsed="1"/>
-    <w:lsdException w:name="index heading" w:semiHidden="1" w:unhideWhenUsed="1"/>
-    <w:lsdException w:name="caption" w:semiHidden="1" w:uiPriority="35" w:unhideWhenUsed="1" w:qFormat="1"/>
-    <w:lsdException w:name="table of figures" w:semiHidden="1" w:unhideWhenUsed="1"/>
-    <w:lsdException w:name="envelope address" w:semiHidden="1" w:unhideWhenUsed="1"/>
-    <w:lsdException w:name="envelope return" w:semiHidden="1" w:unhideWhenUsed="1"/>
-    <w:lsdException w:name="footnote reference" w:semiHidden="1" w:unhideWhenUsed="1"/>
-    <w:lsdException w:name="annotation reference" w:semiHidden="1" w:unhideWhenUsed="1"/>
-    <w:lsdException w:name="line number" w:semiHidden="1" w:unhideWhenUsed="1"/>
-    <w:lsdException w:name="page number" w:semiHidden="1" w:unhideWhenUsed="1"/>
-    <w:lsdException w:name="endnote reference" w:semiHidden="1" w:unhideWhenUsed="1"/>
-    <w:lsdException w:name="endnote text" w:semiHidden="1" w:unhideWhenUsed="1"/>
-    <w:lsdException w:name="table of authorities" w:semiHidden="1" w:unhideWhenUsed="1"/>
-    <w:lsdException w:name="macro" w:semiHidden="1" w:unhideWhenUsed="1"/>
-    <w:lsdException w:name="toa heading" w:semiHidden="1" w:unhideWhenUsed="1"/>
-    <w:lsdException w:name="List" w:semiHidden="1" w:unhideWhenUsed="1"/>
-    <w:lsdException w:name="List Bullet" w:semiHidden="1" w:unhideWhenUsed="1"/>
-    <w:lsdException w:name="List Number" w:semiHidden="1" w:unhideWhenUsed="1"/>
-    <w:lsdException w:name="List 2" w:semiHidden="1" w:unhideWhenUsed="1"/>
-    <w:lsdException w:name="List 3" w:semiHidden="1" w:unhideWhenUsed="1"/>
-    <w:lsdException w:name="List 4" w:semiHidden="1" w:unhideWhenUsed="1"/>
-    <w:lsdException w:name="List 5" w:semiHidden="1" w:unhideWhenUsed="1"/>
-    <w:lsdException w:name="List Bullet 2" w:semiHidden="1" w:unhideWhenUsed="1"/>
-    <w:lsdException w:name="List Bullet 3" w:semiHidden="1" w:unhideWhenUsed="1"/>
-    <w:lsdException w:name="List Bullet 4" w:semiHidden="1" w:unhideWhenUsed="1"/>
-    <w:lsdException w:name="List Bullet 5" w:semiHidden="1" w:unhideWhenUsed="1"/>
-    <w:lsdException w:name="List Number 2" w:semiHidden="1" w:unhideWhenUsed="1"/>
-    <w:lsdException w:name="List Number 3" w:semiHidden="1" w:unhideWhenUsed="1"/>
-    <w:lsdException w:name="List Number 4" w:semiHidden="1" w:unhideWhenUsed="1"/>
-    <w:lsdException w:name="List Number 5" w:semiHidden="1" w:unhideWhenUsed="1"/>
-    <w:lsdException w:name="Title" w:uiPriority="10" w:qFormat="1"/>
-    <w:lsdException w:name="Closing" w:semiHidden="1" w:unhideWhenUsed="1"/>
-    <w:lsdException w:name="Signature" w:semiHidden="1" w:unhideWhenUsed="1"/>
-    <w:lsdException w:name="Default Paragraph Font" w:semiHidden="1" w:uiPriority="1" w:unhideWhenUsed="1"/>
-    <w:lsdException w:name="Body Text" w:semiHidden="1" w:unhideWhenUsed="1"/>
-    <w:lsdException w:name="Body Text Indent" w:semiHidden="1" w:unhideWhenUsed="1"/>
-    <w:lsdException w:name="List Continue" w:semiHidden="1" w:unhideWhenUsed="1"/>
-    <w:lsdException w:name="List Continue 2" w:semiHidden="1" w:unhideWhenUsed="1"/>
-    <w:lsdException w:name="List Continue 3" w:semiHidden="1" w:unhideWhenUsed="1"/>
-    <w:lsdException w:name="List Continue 4" w:semiHidden="1" w:unhideWhenUsed="1"/>
-    <w:lsdException w:name="List Continue 5" w:semiHidden="1" w:unhideWhenUsed="1"/>
-    <w:lsdException w:name="Message Header" w:semiHidden="1" w:unhideWhenUsed="1"/>
-    <w:lsdException w:name="Subtitle" w:uiPriority="11" w:qFormat="1"/>
-    <w:lsdException w:name="Salutation" w:semiHidden="1" w:unhideWhenUsed="1"/>
-    <w:lsdException w:name="Date" w:semiHidden="1" w:unhideWhenUsed="1"/>
-    <w:lsdException w:name="Body Text First Indent" w:semiHidden="1" w:unhideWhenUsed="1"/>
-    <w:lsdException w:name="Body Text First Indent 2" w:semiHidden="1" w:unhideWhenUsed="1"/>
-    <w:lsdException w:name="Note Heading" w:semiHidden="1" w:unhideWhenUsed="1"/>
-    <w:lsdException w:name="Body Text 2" w:semiHidden="1" w:unhideWhenUsed="1"/>
-    <w:lsdException w:name="Body Text 3" w:semiHidden="1" w:unhideWhenUsed="1"/>
-    <w:lsdException w:name="Body Text Indent 2" w:semiHidden="1" w:unhideWhenUsed="1"/>
-    <w:lsdException w:name="Body Text Indent 3" w:semiHidden="1" w:unhideWhenUsed="1"/>
-    <w:lsdException w:name="Block Text" w:semiHidden="1" w:unhideWhenUsed="1"/>
-    <w:lsdException w:name="Hyperlink" w:semiHidden="1" w:unhideWhenUsed="1"/>
-    <w:lsdException w:name="FollowedHyperlink" w:semiHidden="1" w:unhideWhenUsed="1"/>
-    <w:lsdException w:name="Strong" w:uiPriority="22" w:qFormat="1"/>
-    <w:lsdException w:name="Emphasis" w:uiPriority="20" w:qFormat="1"/>
-    <w:lsdException w:name="Document Map" w:semiHidden="1" w:unhideWhenUsed="1"/>
-    <w:lsdException w:name="Plain Text" w:semiHidden="1" w:unhideWhenUsed="1"/>
-    <w:lsdException w:name="E-mail Signature" w:semiHidden="1" w:unhideWhenUsed="1"/>
-    <w:lsdException w:name="HTML Top of Form" w:semiHidden="1" w:unhideWhenUsed="1"/>
-    <w:lsdException w:name="HTML Bottom of Form" w:semiHidden="1" w:unhideWhenUsed="1"/>
-    <w:lsdException w:name="Normal (Web)" w:semiHidden="1" w:unhideWhenUsed="1"/>
-    <w:lsdException w:name="HTML Acronym" w:semiHidden="1" w:unhideWhenUsed="1"/>
-    <w:lsdException w:name="HTML Address" w:semiHidden="1" w:unhideWhenUsed="1"/>
-    <w:lsdException w:name="HTML Cite" w:semiHidden="1" w:unhideWhenUsed="1"/>
-    <w:lsdException w:name="HTML Code" w:semiHidden="1" w:unhideWhenUsed="1"/>
-    <w:lsdException w:name="HTML Definition" w:semiHidden="1" w:unhideWhenUsed="1"/>
-    <w:lsdException w:name="HTML Keyboard" w:semiHidden="1" w:unhideWhenUsed="1"/>
-    <w:lsdException w:name="HTML Preformatted" w:semiHidden="1" w:unhideWhenUsed="1"/>
-    <w:lsdException w:name="HTML Sample" w:semiHidden="1" w:unhideWhenUsed="1"/>
-    <w:lsdException w:name="HTML Typewriter" w:semiHidden="1" w:unhideWhenUsed="1"/>
-    <w:lsdException w:name="HTML Variable" w:semiHidden="1" w:unhideWhenUsed="1"/>
-    <w:lsdException w:name="Normal Table" w:semiHidden="1" w:unhideWhenUsed="1"/>
-    <w:lsdException w:name="annotation subject" w:semiHidden="1" w:unhideWhenUsed="1"/>
-    <w:lsdException w:name="No List" w:semiHidden="1" w:unhideWhenUsed="1"/>
-    <w:lsdException w:name="Outline List 1" w:semiHidden="1" w:unhideWhenUsed="1"/>
-    <w:lsdException w:name="Outline List 2" w:semiHidden="1" w:unhideWhenUsed="1"/>
-    <w:lsdException w:name="Outline List 3" w:semiHidden="1" w:unhideWhenUsed="1"/>
-    <w:lsdException w:name="Table Simple 1" w:semiHidden="1" w:unhideWhenUsed="1"/>
-    <w:lsdException w:name="Table Simple 2" w:semiHidden="1" w:unhideWhenUsed="1"/>
-    <w:lsdException w:name="Table Simple 3" w:semiHidden="1" w:unhideWhenUsed="1"/>
-    <w:lsdException w:name="Table Classic 1" w:semiHidden="1" w:unhideWhenUsed="1"/>
-    <w:lsdException w:name="Table Classic 2" w:semiHidden="1" w:unhideWhenUsed="1"/>
-    <w:lsdException w:name="Table Classic 3" w:semiHidden="1" w:unhideWhenUsed="1"/>
-    <w:lsdException w:name="Table Classic 4" w:semiHidden="1" w:unhideWhenUsed="1"/>
-    <w:lsdException w:name="Table Colorful 1" w:semiHidden="1" w:unhideWhenUsed="1"/>
-    <w:lsdException w:name="Table Colorful 2" w:semiHidden="1" w:unhideWhenUsed="1"/>
-    <w:lsdException w:name="Table Colorful 3" w:semiHidden="1" w:unhideWhenUsed="1"/>
-    <w:lsdException w:name="Table Columns 1" w:semiHidden="1" w:unhideWhenUsed="1"/>
-    <w:lsdException w:name="Table Columns 2" w:semiHidden="1" w:unhideWhenUsed="1"/>
-    <w:lsdException w:name="Table Columns 3" w:semiHidden="1" w:unhideWhenUsed="1"/>
-    <w:lsdException w:name="Table Columns 4" w:semiHidden="1" w:unhideWhenUsed="1"/>
-    <w:lsdException w:name="Table Columns 5" w:semiHidden="1" w:unhideWhenUsed="1"/>
-    <w:lsdException w:name="Table Grid 1" w:semiHidden="1" w:unhideWhenUsed="1"/>
-    <w:lsdException w:name="Table Grid 2" w:semiHidden="1" w:unhideWhenUsed="1"/>
-    <w:lsdException w:name="Table Grid 3" w:semiHidden="1" w:unhideWhenUsed="1"/>
-    <w:lsdException w:name="Table Grid 4" w:semiHidden="1" w:unhideWhenUsed="1"/>
-    <w:lsdException w:name="Table Grid 5" w:semiHidden="1" w:unhideWhenUsed="1"/>
-    <w:lsdException w:name="Table Grid 6" w:semiHidden="1" w:unhideWhenUsed="1"/>
-    <w:lsdException w:name="Table Grid 7" w:semiHidden="1" w:unhideWhenUsed="1"/>
-    <w:lsdException w:name="Table Grid 8" w:semiHidden="1" w:unhideWhenUsed="1"/>
-    <w:lsdException w:name="Table List 1" w:semiHidden="1" w:unhideWhenUsed="1"/>
-    <w:lsdException w:name="Table List 2" w:semiHidden="1" w:unhideWhenUsed="1"/>
-    <w:lsdException w:name="Table List 3" w:semiHidden="1" w:unhideWhenUsed="1"/>
-    <w:lsdException w:name="Table List 4" w:semiHidden="1" w:unhideWhenUsed="1"/>
-    <w:lsdException w:name="Table List 5" w:semiHidden="1" w:unhideWhenUsed="1"/>
-    <w:lsdException w:name="Table List 6" w:semiHidden="1" w:unhideWhenUsed="1"/>
-    <w:lsdException w:name="Table List 7" w:semiHidden="1" w:unhideWhenUsed="1"/>
-    <w:lsdException w:name="Table List 8" w:semiHidden="1" w:unhideWhenUsed="1"/>
-    <w:lsdException w:name="Table 3D effects 1" w:semiHidden="1" w:unhideWhenUsed="1"/>
-    <w:lsdException w:name="Table 3D effects 2" w:semiHidden="1" w:unhideWhenUsed="1"/>
-    <w:lsdException w:name="Table 3D effects 3" w:semiHidden="1" w:unhideWhenUsed="1"/>
-    <w:lsdException w:name="Table Contemporary" w:semiHidden="1" w:unhideWhenUsed="1"/>
-    <w:lsdException w:name="Table Elegant" w:semiHidden="1" w:unhideWhenUsed="1"/>
-    <w:lsdException w:name="Table Professional" w:semiHidden="1" w:unhideWhenUsed="1"/>
-    <w:lsdException w:name="Table Subtle 1" w:semiHidden="1" w:unhideWhenUsed="1"/>
-    <w:lsdException w:name="Table Subtle 2" w:semiHidden="1" w:unhideWhenUsed="1"/>
-    <w:lsdException w:name="Table Web 1" w:semiHidden="1" w:unhideWhenUsed="1"/>
-    <w:lsdException w:name="Table Web 2" w:semiHidden="1" w:unhideWhenUsed="1"/>
-    <w:lsdException w:name="Table Web 3" w:semiHidden="1" w:unhideWhenUsed="1"/>
-    <w:lsdException w:name="Balloon Text" w:semiHidden="1" w:unhideWhenUsed="1"/>
-    <w:lsdException w:name="Table Grid" w:uiPriority="59"/>
-    <w:lsdException w:name="Table Theme" w:semiHidden="1" w:unhideWhenUsed="1"/>
-    <w:lsdException w:name="Placeholder Text" w:semiHidden="1"/>
-    <w:lsdException w:name="No Spacing" w:uiPriority="1" w:qFormat="1"/>
-    <w:lsdException w:name="Light Shading" w:uiPriority="60"/>
-    <w:lsdException w:name="Light List" w:uiPriority="61"/>
-    <w:lsdException w:name="Light Grid" w:uiPriority="62"/>
-    <w:lsdException w:name="Medium Shading 1" w:uiPriority="63"/>
-    <w:lsdException w:name="Medium Shading 2" w:uiPriority="64"/>
-    <w:lsdException w:name="Medium List 1" w:uiPriority="65"/>
-    <w:lsdException w:name="Medium List 2" w:uiPriority="66"/>
-    <w:lsdException w:name="Medium Grid 1" w:uiPriority="67"/>
-    <w:lsdException w:name="Medium Grid 2" w:uiPriority="68"/>
-    <w:lsdException w:name="Medium Grid 3" w:uiPriority="69"/>
-    <w:lsdException w:name="Dark List" w:uiPriority="70"/>
-    <w:lsdException w:name="Colorful Shading" w:uiPriority="71"/>
-    <w:lsdException w:name="Colorful List" w:uiPriority="72"/>
-    <w:lsdException w:name="Colorful Grid" w:uiPriority="73"/>
-    <w:lsdException w:name="Light Shading Accent 1" w:uiPriority="60"/>
-    <w:lsdException w:name="Light List Accent 1" w:uiPriority="61"/>
-    <w:lsdException w:name="Light Grid Accent 1" w:uiPriority="62"/>
-    <w:lsdException w:name="Medium Shading 1 Accent 1" w:uiPriority="63"/>
-    <w:lsdException w:name="Medium Shading 2 Accent 1" w:uiPriority="64"/>
-    <w:lsdException w:name="Medium List 1 Accent 1" w:uiPriority="65"/>
-    <w:lsdException w:name="Revision" w:semiHidden="1"/>
-    <w:lsdException w:name="List Paragraph" w:uiPriority="34" w:qFormat="1"/>
-    <w:lsdException w:name="Quote" w:uiPriority="29" w:qFormat="1"/>
-    <w:lsdException w:name="Intense Quote" w:uiPriority="30" w:qFormat="1"/>
-    <w:lsdException w:name="Medium List 2 Accent 1" w:uiPriority="66"/>
-    <w:lsdException w:name="Medium Grid 1 Accent 1" w:uiPriority="67"/>
-    <w:lsdException w:name="Medium Grid 2 Accent 1" w:uiPriority="68"/>
-    <w:lsdException w:name="Medium Grid 3 Accent 1" w:uiPriority="69"/>
-    <w:lsdException w:name="Dark List Accent 1" w:uiPriority="70"/>
-    <w:lsdException w:name="Colorful Shading Accent 1" w:uiPriority="71"/>
-    <w:lsdException w:name="Colorful List Accent 1" w:uiPriority="72"/>
-    <w:lsdException w:name="Colorful Grid Accent 1" w:uiPriority="73"/>
-    <w:lsdException w:name="Light Shading Accent 2" w:uiPriority="60"/>
-    <w:lsdException w:name="Light List Accent 2" w:uiPriority="61"/>
-    <w:lsdException w:name="Light Grid Accent 2" w:uiPriority="62"/>
-    <w:lsdException w:name="Medium Shading 1 Accent 2" w:uiPriority="63"/>
-    <w:lsdException w:name="Medium Shading 2 Accent 2" w:uiPriority="64"/>
-    <w:lsdException w:name="Medium List 1 Accent 2" w:uiPriority="65"/>
-    <w:lsdException w:name="Medium List 2 Accent 2" w:uiPriority="66"/>
-    <w:lsdException w:name="Medium Grid 1 Accent 2" w:uiPriority="67"/>
-    <w:lsdException w:name="Medium Grid 2 Accent 2" w:uiPriority="68"/>
-    <w:lsdException w:name="Medium Grid 3 Accent 2" w:uiPriority="69"/>
-    <w:lsdException w:name="Dark List Accent 2" w:uiPriority="70"/>
-    <w:lsdException w:name="Colorful Shading Accent 2" w:uiPriority="71"/>
-    <w:lsdException w:name="Colorful List Accent 2" w:uiPriority="72"/>
-    <w:lsdException w:name="Colorful Grid Accent 2" w:uiPriority="73"/>
-    <w:lsdException w:name="Light Shading Accent 3" w:uiPriority="60"/>
-    <w:lsdException w:name="Light List Accent 3" w:uiPriority="61"/>
-    <w:lsdException w:name="Light Grid Accent 3" w:uiPriority="62"/>
-    <w:lsdException w:name="Medium Shading 1 Accent 3" w:uiPriority="63"/>
-    <w:lsdException w:name="Medium Shading 2 Accent 3" w:uiPriority="64"/>
-    <w:lsdException w:name="Medium List 1 Accent 3" w:uiPriority="65"/>
-    <w:lsdException w:name="Medium List 2 Accent 3" w:uiPriority="66"/>
-    <w:lsdException w:name="Medium Grid 1 Accent 3" w:uiPriority="67"/>
-    <w:lsdException w:name="Medium Grid 2 Accent 3" w:uiPriority="68"/>
-    <w:lsdException w:name="Medium Grid 3 Accent 3" w:uiPriority="69"/>
-    <w:lsdException w:name="Dark List Accent 3" w:uiPriority="70"/>
-    <w:lsdException w:name="Colorful Shading Accent 3" w:uiPriority="71"/>
-    <w:lsdException w:name="Colorful List Accent 3" w:uiPriority="72"/>
-    <w:lsdException w:name="Colorful Grid Accent 3" w:uiPriority="73"/>
-    <w:lsdException w:name="Light Shading Accent 4" w:uiPriority="60"/>
-    <w:lsdException w:name="Light List Accent 4" w:uiPriority="61"/>
-    <w:lsdException w:name="Light Grid Accent 4" w:uiPriority="62"/>
-    <w:lsdException w:name="Medium Shading 1 Accent 4" w:uiPriority="63"/>
-    <w:lsdException w:name="Medium Shading 2 Accent 4" w:uiPriority="64"/>
-    <w:lsdException w:name="Medium List 1 Accent 4" w:uiPriority="65"/>
-    <w:lsdException w:name="Medium List 2 Accent 4" w:uiPriority="66"/>
-    <w:lsdException w:name="Medium Grid 1 Accent 4" w:uiPriority="67"/>
-    <w:lsdException w:name="Medium Grid 2 Accent 4" w:uiPriority="68"/>
-    <w:lsdException w:name="Medium Grid 3 Accent 4" w:uiPriority="69"/>
-    <w:lsdException w:name="Dark List Accent 4" w:uiPriority="70"/>
-    <w:lsdException w:name="Colorful Shading Accent 4" w:uiPriority="71"/>
-    <w:lsdException w:name="Colorful List Accent 4" w:uiPriority="72"/>
-    <w:lsdException w:name="Colorful Grid Accent 4" w:uiPriority="73"/>
-    <w:lsdException w:name="Light Shading Accent 5" w:uiPriority="60"/>
-    <w:lsdException w:name="Light List Accent 5" w:uiPriority="61"/>
-    <w:lsdException w:name="Light Grid Accent 5" w:uiPriority="62"/>
-    <w:lsdException w:name="Medium Shading 1 Accent 5" w:uiPriority="63"/>
-    <w:lsdException w:name="Medium Shading 2 Accent 5" w:uiPriority="64"/>
-    <w:lsdException w:name="Medium List 1 Accent 5" w:uiPriority="65"/>
-    <w:lsdException w:name="Medium List 2 Accent 5" w:uiPriority="66"/>
-    <w:lsdException w:name="Medium Grid 1 Accent 5" w:uiPriority="67"/>
-    <w:lsdException w:name="Medium Grid 2 Accent 5" w:uiPriority="68"/>
-    <w:lsdException w:name="Medium Grid 3 Accent 5" w:uiPriority="69"/>
-    <w:lsdException w:name="Dark List Accent 5" w:uiPriority="70"/>
-    <w:lsdException w:name="Colorful Shading Accent 5" w:uiPriority="71"/>
-    <w:lsdException w:name="Colorful List Accent 5" w:uiPriority="72"/>
-    <w:lsdException w:name="Colorful Grid Accent 5" w:uiPriority="73"/>
-    <w:lsdException w:name="Light Shading Accent 6" w:uiPriority="60"/>
-    <w:lsdException w:name="Light List Accent 6" w:uiPriority="61"/>
-    <w:lsdException w:name="Light Grid Accent 6" w:uiPriority="62"/>
-    <w:lsdException w:name="Medium Shading 1 Accent 6" w:uiPriority="63"/>
-    <w:lsdException w:name="Medium Shading 2 Accent 6" w:uiPriority="64"/>
-    <w:lsdException w:name="Medium List 1 Accent 6" w:uiPriority="65"/>
-    <w:lsdException w:name="Medium List 2 Accent 6" w:uiPriority="66"/>
-    <w:lsdException w:name="Medium Grid 1 Accent 6" w:uiPriority="67"/>
-    <w:lsdException w:name="Medium Grid 2 Accent 6" w:uiPriority="68"/>
-    <w:lsdException w:name="Medium Grid 3 Accent 6" w:uiPriority="69"/>
-    <w:lsdException w:name="Dark List Accent 6" w:uiPriority="70"/>
-    <w:lsdException w:name="Colorful Shading Accent 6" w:uiPriority="71"/>
-    <w:lsdException w:name="Colorful List Accent 6" w:uiPriority="72"/>
-    <w:lsdException w:name="Colorful Grid Accent 6" w:uiPriority="73"/>
-    <w:lsdException w:name="Subtle Emphasis" w:uiPriority="19" w:qFormat="1"/>
-    <w:lsdException w:name="Intense Emphasis" w:uiPriority="21" w:qFormat="1"/>
-    <w:lsdException w:name="Subtle Reference" w:uiPriority="31" w:qFormat="1"/>
-    <w:lsdException w:name="Intense Reference" w:uiPriority="32" w:qFormat="1"/>
-    <w:lsdException w:name="Book Title" w:uiPriority="33" w:qFormat="1"/>
-    <w:lsdException w:name="Bibliography" w:semiHidden="1" w:uiPriority="37" w:unhideWhenUsed="1"/>
-    <w:lsdException w:name="TOC Heading" w:semiHidden="1" w:uiPriority="39" w:unhideWhenUsed="1" w:qFormat="1"/>
-    <w:lsdException w:name="Plain Table 1" w:uiPriority="41"/>
-    <w:lsdException w:name="Plain Table 2" w:uiPriority="42"/>
-    <w:lsdException w:name="Plain Table 3" w:uiPriority="43"/>
-    <w:lsdException w:name="Plain Table 4" w:uiPriority="44"/>
-    <w:lsdException w:name="Plain Table 5" w:uiPriority="45"/>
-    <w:lsdException w:name="Grid Table Light" w:uiPriority="40"/>
-    <w:lsdException w:name="Grid Table 1 Light" w:uiPriority="46"/>
-    <w:lsdException w:name="Grid Table 2" w:uiPriority="47"/>
-    <w:lsdException w:name="Grid Table 3" w:uiPriority="48"/>
-    <w:lsdException w:name="Grid Table 4" w:uiPriority="49"/>
-    <w:lsdException w:name="Grid Table 5 Dark" w:uiPriority="50"/>
-    <w:lsdException w:name="Grid Table 6 Colorful" w:uiPriority="51"/>
-    <w:lsdException w:name="Grid Table 7 Colorful" w:uiPriority="52"/>
-    <w:lsdException w:name="Grid Table 1 Light Accent 1" w:uiPriority="46"/>
-    <w:lsdException w:name="Grid Table 2 Accent 1" w:uiPriority="47"/>
-    <w:lsdException w:name="Grid Table 3 Accent 1" w:uiPriority="48"/>
-    <w:lsdException w:name="Grid Table 4 Accent 1" w:uiPriority="49"/>
-    <w:lsdException w:name="Grid Table 5 Dark Accent 1" w:uiPriority="50"/>
-    <w:lsdException w:name="Grid Table 6 Colorful Accent 1" w:uiPriority="51"/>
-    <w:lsdException w:name="Grid Table 7 Colorful Accent 1" w:uiPriority="52"/>
-    <w:lsdException w:name="Grid Table 1 Light Accent 2" w:uiPriority="46"/>
-    <w:lsdException w:name="Grid Table 2 Accent 2" w:uiPriority="47"/>
-    <w:lsdException w:name="Grid Table 3 Accent 2" w:uiPriority="48"/>
-    <w:lsdException w:name="Grid Table 4 Accent 2" w:uiPriority="49"/>
-    <w:lsdException w:name="Grid Table 5 Dark Accent 2" w:uiPriority="50"/>
-    <w:lsdException w:name="Grid Table 6 Colorful Accent 2" w:uiPriority="51"/>
-    <w:lsdException w:name="Grid Table 7 Colorful Accent 2" w:uiPriority="52"/>
-    <w:lsdException w:name="Grid Table 1 Light Accent 3" w:uiPriority="46"/>
-    <w:lsdException w:name="Grid Table 2 Accent 3" w:uiPriority="47"/>
-    <w:lsdException w:name="Grid Table 3 Accent 3" w:uiPriority="48"/>
-    <w:lsdException w:name="Grid Table 4 Accent 3" w:uiPriority="49"/>
-    <w:lsdException w:name="Grid Table 5 Dark Accent 3" w:uiPriority="50"/>
-    <w:lsdException w:name="Grid Table 6 Colorful Accent 3" w:uiPriority="51"/>
-    <w:lsdException w:name="Grid Table 7 Colorful Accent 3" w:uiPriority="52"/>
-    <w:lsdException w:name="Grid Table 1 Light Accent 4" w:uiPriority="46"/>
-    <w:lsdException w:name="Grid Table 2 Accent 4" w:uiPriority="47"/>
-    <w:lsdException w:name="Grid Table 3 Accent 4" w:uiPriority="48"/>
-    <w:lsdException w:name="Grid Table 4 Accent 4" w:uiPriority="49"/>
-    <w:lsdException w:name="Grid Table 5 Dark Accent 4" w:uiPriority="50"/>
-    <w:lsdException w:name="Grid Table 6 Colorful Accent 4" w:uiPriority="51"/>
-    <w:lsdException w:name="Grid Table 7 Colorful Accent 4" w:uiPriority="52"/>
-    <w:lsdException w:name="Grid Table 1 Light Accent 5" w:uiPriority="46"/>
-    <w:lsdException w:name="Grid Table 2 Accent 5" w:uiPriority="47"/>
-    <w:lsdException w:name="Grid Table 3 Accent 5" w:uiPriority="48"/>
-    <w:lsdException w:name="Grid Table 4 Accent 5" w:uiPriority="49"/>
-    <w:lsdException w:name="Grid Table 5 Dark Accent 5" w:uiPriority="50"/>
-    <w:lsdException w:name="Grid Table 6 Colorful Accent 5" w:uiPriority="51"/>
-    <w:lsdException w:name="Grid Table 7 Colorful Accent 5" w:uiPriority="52"/>
-    <w:lsdException w:name="Grid Table 1 Light Accent 6" w:uiPriority="46"/>
-    <w:lsdException w:name="Grid Table 2 Accent 6" w:uiPriority="47"/>
-    <w:lsdException w:name="Grid Table 3 Accent 6" w:uiPriority="48"/>
-    <w:lsdException w:name="Grid Table 4 Accent 6" w:uiPriority="49"/>
-    <w:lsdException w:name="Grid Table 5 Dark Accent 6" w:uiPriority="50"/>
-    <w:lsdException w:name="Grid Table 6 Colorful Accent 6" w:uiPriority="51"/>
-    <w:lsdException w:name="Grid Table 7 Colorful Accent 6" w:uiPriority="52"/>
-    <w:lsdException w:name="List Table 1 Light" w:uiPriority="46"/>
-    <w:lsdException w:name="List Table 2" w:uiPriority="47"/>
-    <w:lsdException w:name="List Table 3" w:uiPriority="48"/>
-    <w:lsdException w:name="List Table 4" w:uiPriority="49"/>
-    <w:lsdException w:name="List Table 5 Dark" w:uiPriority="50"/>
-    <w:lsdException w:name="List Table 6 Colorful" w:uiPriority="51"/>
-    <w:lsdException w:name="List Table 7 Colorful" w:uiPriority="52"/>
-    <w:lsdException w:name="List Table 1 Light Accent 1" w:uiPriority="46"/>
-    <w:lsdException w:name="List Table 2 Accent 1" w:uiPriority="47"/>
-    <w:lsdException w:name="List Table 3 Accent 1" w:uiPriority="48"/>
-    <w:lsdException w:name="List Table 4 Accent 1" w:uiPriority="49"/>
-    <w:lsdException w:name="List Table 5 Dark Accent 1" w:uiPriority="50"/>
-    <w:lsdException w:name="List Table 6 Colorful Accent 1" w:uiPriority="51"/>
-    <w:lsdException w:name="List Table 7 Colorful Accent 1" w:uiPriority="52"/>
-    <w:lsdException w:name="List Table 1 Light Accent 2" w:uiPriority="46"/>
-    <w:lsdException w:name="List Table 2 Accent 2" w:uiPriority="47"/>
-    <w:lsdException w:name="List Table 3 Accent 2" w:uiPriority="48"/>
-    <w:lsdException w:name="List Table 4 Accent 2" w:uiPriority="49"/>
-    <w:lsdException w:name="List Table 5 Dark Accent 2" w:uiPriority="50"/>
-    <w:lsdException w:name="List Table 6 Colorful Accent 2" w:uiPriority="51"/>
-    <w:lsdException w:name="List Table 7 Colorful Accent 2" w:uiPriority="52"/>
-    <w:lsdException w:name="List Table 1 Light Accent 3" w:uiPriority="46"/>
-    <w:lsdException w:name="List Table 2 Accent 3" w:uiPriority="47"/>
-    <w:lsdException w:name="List Table 3 Accent 3" w:uiPriority="48"/>
-    <w:lsdException w:name="List Table 4 Accent 3" w:uiPriority="49"/>
-    <w:lsdException w:name="List Table 5 Dark Accent 3" w:uiPriority="50"/>
-    <w:lsdException w:name="List Table 6 Colorful Accent 3" w:uiPriority="51"/>
-    <w:lsdException w:name="List Table 7 Colorful Accent 3" w:uiPriority="52"/>
-    <w:lsdException w:name="List Table 1 Light Accent 4" w:uiPriority="46"/>
-    <w:lsdException w:name="List Table 2 Accent 4" w:uiPriority="47"/>
-    <w:lsdException w:name="List Table 3 Accent 4" w:uiPriority="48"/>
-    <w:lsdException w:name="List Table 4 Accent 4" w:uiPriority="49"/>
-    <w:lsdException w:name="List Table 5 Dark Accent 4" w:uiPriority="50"/>
-    <w:lsdException w:name="List Table 6 Colorful Accent 4" w:uiPriority="51"/>
-    <w:lsdException w:name="List Table 7 Colorful Accent 4" w:uiPriority="52"/>
-    <w:lsdException w:name="List Table 1 Light Accent 5" w:uiPriority="46"/>
-    <w:lsdException w:name="List Table 2 Accent 5" w:uiPriority="47"/>
-    <w:lsdException w:name="List Table 3 Accent 5" w:uiPriority="48"/>
-    <w:lsdException w:name="List Table 4 Accent 5" w:uiPriority="49"/>
-    <w:lsdException w:name="List Table 5 Dark Accent 5" w:uiPriority="50"/>
-    <w:lsdException w:name="List Table 6 Colorful Accent 5" w:uiPriority="51"/>
-    <w:lsdException w:name="List Table 7 Colorful Accent 5" w:uiPriority="52"/>
-    <w:lsdException w:name="List Table 1 Light Accent 6" w:uiPriority="46"/>
-    <w:lsdException w:name="List Table 2 Accent 6" w:uiPriority="47"/>
-    <w:lsdException w:name="List Table 3 Accent 6" w:uiPriority="48"/>
-    <w:lsdException w:name="List Table 4 Accent 6" w:uiPriority="49"/>
-    <w:lsdException w:name="List Table 5 Dark Accent 6" w:uiPriority="50"/>
-    <w:lsdException w:name="List Table 6 Colorful Accent 6" w:uiPriority="51"/>
-    <w:lsdException w:name="List Table 7 Colorful Accent 6" w:uiPriority="52"/>
-    <w:lsdException w:name="Mention" w:semiHidden="1" w:unhideWhenUsed="1"/>
-    <w:lsdException w:name="Smart Hyperlink" w:semiHidden="1" w:unhideWhenUsed="1"/>
-    <w:lsdException w:name="Hashtag" w:semiHidden="1" w:unhideWhenUsed="1"/>
-    <w:lsdException w:name="Unresolved Mention" w:semiHidden="1" w:unhideWhenUsed="1"/>
-    <w:lsdException w:name="Smart Link" w:semiHidden="1" w:unhideWhenUsed="1"/>
+  <w:latentStyles w:defLockedState="0" w:defUIPriority="99" w:defSemiHidden="1" w:defUnhideWhenUsed="1" w:defQFormat="0" w:count="267">
+    <w:lsdException w:name="Normal" w:semiHidden="0" w:uiPriority="0" w:unhideWhenUsed="0" w:qFormat="1"/>
+    <w:lsdException w:name="heading 1" w:semiHidden="0" w:uiPriority="9" w:unhideWhenUsed="0" w:qFormat="1"/>
+    <w:lsdException w:name="heading 2" w:uiPriority="9" w:qFormat="1"/>
+    <w:lsdException w:name="heading 3" w:uiPriority="9" w:qFormat="1"/>
+    <w:lsdException w:name="heading 4" w:uiPriority="9" w:qFormat="1"/>
+    <w:lsdException w:name="heading 5" w:uiPriority="9" w:qFormat="1"/>
+    <w:lsdException w:name="heading 6" w:uiPriority="9" w:qFormat="1"/>
+    <w:lsdException w:name="heading 7" w:uiPriority="9" w:qFormat="1"/>
+    <w:lsdException w:name="heading 8" w:uiPriority="9" w:qFormat="1"/>
+    <w:lsdException w:name="heading 9" w:uiPriority="9" w:qFormat="1"/>
+    <w:lsdException w:name="toc 1" w:uiPriority="39"/>
+    <w:lsdException w:name="toc 2" w:uiPriority="39"/>
+    <w:lsdException w:name="toc 3" w:uiPriority="39"/>
+    <w:lsdException w:name="toc 4" w:uiPriority="39"/>
+    <w:lsdException w:name="toc 5" w:uiPriority="39"/>
+    <w:lsdException w:name="toc 6" w:uiPriority="39"/>
+    <w:lsdException w:name="toc 7" w:uiPriority="39"/>
+    <w:lsdException w:name="toc 8" w:uiPriority="39"/>
+    <w:lsdException w:name="toc 9" w:uiPriority="39"/>
+    <w:lsdException w:name="caption" w:uiPriority="35" w:qFormat="1"/>
+    <w:lsdException w:name="Title" w:semiHidden="0" w:uiPriority="10" w:unhideWhenUsed="0" w:qFormat="1"/>
+    <w:lsdException w:name="Default Paragraph Font" w:uiPriority="1"/>
+    <w:lsdException w:name="Subtitle" w:semiHidden="0" w:uiPriority="11" w:unhideWhenUsed="0" w:qFormat="1"/>
+    <w:lsdException w:name="Strong" w:semiHidden="0" w:uiPriority="22" w:unhideWhenUsed="0" w:qFormat="1"/>
+    <w:lsdException w:name="Emphasis" w:semiHidden="0" w:uiPriority="20" w:unhideWhenUsed="0" w:qFormat="1"/>
+    <w:lsdException w:name="Table Grid" w:semiHidden="0" w:uiPriority="59" w:unhideWhenUsed="0"/>
+    <w:lsdException w:name="Placeholder Text" w:unhideWhenUsed="0"/>
+    <w:lsdException w:name="No Spacing" w:semiHidden="0" w:uiPriority="1" w:unhideWhenUsed="0" w:qFormat="1"/>
+    <w:lsdException w:name="Light Shading" w:semiHidden="0" w:uiPriority="60" w:unhideWhenUsed="0"/>
+    <w:lsdException w:name="Light List" w:semiHidden="0" w:uiPriority="61" w:unhideWhenUsed="0"/>
+    <w:lsdException w:name="Light Grid" w:semiHidden="0" w:uiPriority="62" w:unhideWhenUsed="0"/>
+    <w:lsdException w:name="Medium Shading 1" w:semiHidden="0" w:uiPriority="63" w:unhideWhenUsed="0"/>
+    <w:lsdException w:name="Medium Shading 2" w:semiHidden="0" w:uiPriority="64" w:unhideWhenUsed="0"/>
+    <w:lsdException w:name="Medium List 1" w:semiHidden="0" w:uiPriority="65" w:unhideWhenUsed="0"/>
+    <w:lsdException w:name="Medium List 2" w:semiHidden="0" w:uiPriority="66" w:unhideWhenUsed="0"/>
+    <w:lsdException w:name="Medium Grid 1" w:semiHidden="0" w:uiPriority="67" w:unhideWhenUsed="0"/>
+    <w:lsdException w:name="Medium Grid 2" w:semiHidden="0" w:uiPriority="68" w:unhideWhenUsed="0"/>
+    <w:lsdException w:name="Medium Grid 3" w:semiHidden="0" w:uiPriority="69" w:unhideWhenUsed="0"/>
+    <w:lsdException w:name="Dark List" w:semiHidden="0" w:uiPriority="70" w:unhideWhenUsed="0"/>
+    <w:lsdException w:name="Colorful Shading" w:semiHidden="0" w:uiPriority="71" w:unhideWhenUsed="0"/>
+    <w:lsdException w:name="Colorful List" w:semiHidden="0" w:uiPriority="72" w:unhideWhenUsed="0"/>
+    <w:lsdException w:name="Colorful Grid" w:semiHidden="0" w:uiPriority="73" w:unhideWhenUsed="0"/>
+    <w:lsdException w:name="Light Shading Accent 1" w:semiHidden="0" w:uiPriority="60" w:unhideWhenUsed="0"/>
+    <w:lsdException w:name="Light List Accent 1" w:semiHidden="0" w:uiPriority="61" w:unhideWhenUsed="0"/>
+    <w:lsdException w:name="Light Grid Accent 1" w:semiHidden="0" w:uiPriority="62" w:unhideWhenUsed="0"/>
+    <w:lsdException w:name="Medium Shading 1 Accent 1" w:semiHidden="0" w:uiPriority="63" w:unhideWhenUsed="0"/>
+    <w:lsdException w:name="Medium Shading 2 Accent 1" w:semiHidden="0" w:uiPriority="64" w:unhideWhenUsed="0"/>
+    <w:lsdException w:name="Medium List 1 Accent 1" w:semiHidden="0" w:uiPriority="65" w:unhideWhenUsed="0"/>
+    <w:lsdException w:name="Revision" w:unhideWhenUsed="0"/>
+    <w:lsdException w:name="List Paragraph" w:semiHidden="0" w:uiPriority="34" w:unhideWhenUsed="0" w:qFormat="1"/>
+    <w:lsdException w:name="Quote" w:semiHidden="0" w:uiPriority="29" w:unhideWhenUsed="0" w:qFormat="1"/>
+    <w:lsdException w:name="Intense Quote" w:semiHidden="0" w:uiPriority="30" w:unhideWhenUsed="0" w:qFormat="1"/>
+    <w:lsdException w:name="Medium List 2 Accent 1" w:semiHidden="0" w:uiPriority="66" w:unhideWhenUsed="0"/>
+    <w:lsdException w:name="Medium Grid 1 Accent 1" w:semiHidden="0" w:uiPriority="67" w:unhideWhenUsed="0"/>
+    <w:lsdException w:name="Medium Grid 2 Accent 1" w:semiHidden="0" w:uiPriority="68" w:unhideWhenUsed="0"/>
+    <w:lsdException w:name="Medium Grid 3 Accent 1" w:semiHidden="0" w:uiPriority="69" w:unhideWhenUsed="0"/>
+    <w:lsdException w:name="Dark List Accent 1" w:semiHidden="0" w:uiPriority="70" w:unhideWhenUsed="0"/>
+    <w:lsdException w:name="Colorful Shading Accent 1" w:semiHidden="0" w:uiPriority="71" w:unhideWhenUsed="0"/>
+    <w:lsdException w:name="Colorful List Accent 1" w:semiHidden="0" w:uiPriority="72" w:unhideWhenUsed="0"/>
+    <w:lsdException w:name="Colorful Grid Accent 1" w:semiHidden="0" w:uiPriority="73" w:unhideWhenUsed="0"/>
+    <w:lsdException w:name="Light Shading Accent 2" w:semiHidden="0" w:uiPriority="60" w:unhideWhenUsed="0"/>
+    <w:lsdException w:name="Light List Accent 2" w:semiHidden="0" w:uiPriority="61" w:unhideWhenUsed="0"/>
+    <w:lsdException w:name="Light Grid Accent 2" w:semiHidden="0" w:uiPriority="62" w:unhideWhenUsed="0"/>
+    <w:lsdException w:name="Medium Shading 1 Accent 2" w:semiHidden="0" w:uiPriority="63" w:unhideWhenUsed="0"/>
+    <w:lsdException w:name="Medium Shading 2 Accent 2" w:semiHidden="0" w:uiPriority="64" w:unhideWhenUsed="0"/>
+    <w:lsdException w:name="Medium List 1 Accent 2" w:semiHidden="0" w:uiPriority="65" w:unhideWhenUsed="0"/>
+    <w:lsdException w:name="Medium List 2 Accent 2" w:semiHidden="0" w:uiPriority="66" w:unhideWhenUsed="0"/>
+    <w:lsdException w:name="Medium Grid 1 Accent 2" w:semiHidden="0" w:uiPriority="67" w:unhideWhenUsed="0"/>
+    <w:lsdException w:name="Medium Grid 2 Accent 2" w:semiHidden="0" w:uiPriority="68" w:unhideWhenUsed="0"/>
+    <w:lsdException w:name="Medium Grid 3 Accent 2" w:semiHidden="0" w:uiPriority="69" w:unhideWhenUsed="0"/>
+    <w:lsdException w:name="Dark List Accent 2" w:semiHidden="0" w:uiPriority="70" w:unhideWhenUsed="0"/>
+    <w:lsdException w:name="Colorful Shading Accent 2" w:semiHidden="0" w:uiPriority="71" w:unhideWhenUsed="0"/>
+    <w:lsdException w:name="Colorful List Accent 2" w:semiHidden="0" w:uiPriority="72" w:unhideWhenUsed="0"/>
+    <w:lsdException w:name="Colorful Grid Accent 2" w:semiHidden="0" w:uiPriority="73" w:unhideWhenUsed="0"/>
+    <w:lsdException w:name="Light Shading Accent 3" w:semiHidden="0" w:uiPriority="60" w:unhideWhenUsed="0"/>
+    <w:lsdException w:name="Light List Accent 3" w:semiHidden="0" w:uiPriority="61" w:unhideWhenUsed="0"/>
+    <w:lsdException w:name="Light Grid Accent 3" w:semiHidden="0" w:uiPriority="62" w:unhideWhenUsed="0"/>
+    <w:lsdException w:name="Medium Shading 1 Accent 3" w:semiHidden="0" w:uiPriority="63" w:unhideWhenUsed="0"/>
+    <w:lsdException w:name="Medium Shading 2 Accent 3" w:semiHidden="0" w:uiPriority="64" w:unhideWhenUsed="0"/>
+    <w:lsdException w:name="Medium List 1 Accent 3" w:semiHidden="0" w:uiPriority="65" w:unhideWhenUsed="0"/>
+    <w:lsdException w:name="Medium List 2 Accent 3" w:semiHidden="0" w:uiPriority="66" w:unhideWhenUsed="0"/>
+    <w:lsdException w:name="Medium Grid 1 Accent 3" w:semiHidden="0" w:uiPriority="67" w:unhideWhenUsed="0"/>
+    <w:lsdException w:name="Medium Grid 2 Accent 3" w:semiHidden="0" w:uiPriority="68" w:unhideWhenUsed="0"/>
+    <w:lsdException w:name="Medium Grid 3 Accent 3" w:semiHidden="0" w:uiPriority="69" w:unhideWhenUsed="0"/>
+    <w:lsdException w:name="Dark List Accent 3" w:semiHidden="0" w:uiPriority="70" w:unhideWhenUsed="0"/>
+    <w:lsdException w:name="Colorful Shading Accent 3" w:semiHidden="0" w:uiPriority="71" w:unhideWhenUsed="0"/>
+    <w:lsdException w:name="Colorful List Accent 3" w:semiHidden="0" w:uiPriority="72" w:unhideWhenUsed="0"/>
+    <w:lsdException w:name="Colorful Grid Accent 3" w:semiHidden="0" w:uiPriority="73" w:unhideWhenUsed="0"/>
+    <w:lsdException w:name="Light Shading Accent 4" w:semiHidden="0" w:uiPriority="60" w:unhideWhenUsed="0"/>
+    <w:lsdException w:name="Light List Accent 4" w:semiHidden="0" w:uiPriority="61" w:unhideWhenUsed="0"/>
+    <w:lsdException w:name="Light Grid Accent 4" w:semiHidden="0" w:uiPriority="62" w:unhideWhenUsed="0"/>
+    <w:lsdException w:name="Medium Shading 1 Accent 4" w:semiHidden="0" w:uiPriority="63" w:unhideWhenUsed="0"/>
+    <w:lsdException w:name="Medium Shading 2 Accent 4" w:semiHidden="0" w:uiPriority="64" w:unhideWhenUsed="0"/>
+    <w:lsdException w:name="Medium List 1 Accent 4" w:semiHidden="0" w:uiPriority="65" w:unhideWhenUsed="0"/>
+    <w:lsdException w:name="Medium List 2 Accent 4" w:semiHidden="0" w:uiPriority="66" w:unhideWhenUsed="0"/>
+    <w:lsdException w:name="Medium Grid 1 Accent 4" w:semiHidden="0" w:uiPriority="67" w:unhideWhenUsed="0"/>
+    <w:lsdException w:name="Medium Grid 2 Accent 4" w:semiHidden="0" w:uiPriority="68" w:unhideWhenUsed="0"/>
+    <w:lsdException w:name="Medium Grid 3 Accent 4" w:semiHidden="0" w:uiPriority="69" w:unhideWhenUsed="0"/>
+    <w:lsdException w:name="Dark List Accent 4" w:semiHidden="0" w:uiPriority="70" w:unhideWhenUsed="0"/>
+    <w:lsdException w:name="Colorful Shading Accent 4" w:semiHidden="0" w:uiPriority="71" w:unhideWhenUsed="0"/>
+    <w:lsdException w:name="Colorful List Accent 4" w:semiHidden="0" w:uiPriority="72" w:unhideWhenUsed="0"/>
+    <w:lsdException w:name="Colorful Grid Accent 4" w:semiHidden="0" w:uiPriority="73" w:unhideWhenUsed="0"/>
+    <w:lsdException w:name="Light Shading Accent 5" w:semiHidden="0" w:uiPriority="60" w:unhideWhenUsed="0"/>
+    <w:lsdException w:name="Light List Accent 5" w:semiHidden="0" w:uiPriority="61" w:unhideWhenUsed="0"/>
+    <w:lsdException w:name="Light Grid Accent 5" w:semiHidden="0" w:uiPriority="62" w:unhideWhenUsed="0"/>
+    <w:lsdException w:name="Medium Shading 1 Accent 5" w:semiHidden="0" w:uiPriority="63" w:unhideWhenUsed="0"/>
+    <w:lsdException w:name="Medium Shading 2 Accent 5" w:semiHidden="0" w:uiPriority="64" w:unhideWhenUsed="0"/>
+    <w:lsdException w:name="Medium List 1 Accent 5" w:semiHidden="0" w:uiPriority="65" w:unhideWhenUsed="0"/>
+    <w:lsdException w:name="Medium List 2 Accent 5" w:semiHidden="0" w:uiPriority="66" w:unhideWhenUsed="0"/>
+    <w:lsdException w:name="Medium Grid 1 Accent 5" w:semiHidden="0" w:uiPriority="67" w:unhideWhenUsed="0"/>
+    <w:lsdException w:name="Medium Grid 2 Accent 5" w:semiHidden="0" w:uiPriority="68" w:unhideWhenUsed="0"/>
+    <w:lsdException w:name="Medium Grid 3 Accent 5" w:semiHidden="0" w:uiPriority="69" w:unhideWhenUsed="0"/>
+    <w:lsdException w:name="Dark List Accent 5" w:semiHidden="0" w:uiPriority="70" w:unhideWhenUsed="0"/>
+    <w:lsdException w:name="Colorful Shading Accent 5" w:semiHidden="0" w:uiPriority="71" w:unhideWhenUsed="0"/>
+    <w:lsdException w:name="Colorful List Accent 5" w:semiHidden="0" w:uiPriority="72" w:unhideWhenUsed="0"/>
+    <w:lsdException w:name="Colorful Grid Accent 5" w:semiHidden="0" w:uiPriority="73" w:unhideWhenUsed="0"/>
+    <w:lsdException w:name="Light Shading Accent 6" w:semiHidden="0" w:uiPriority="60" w:unhideWhenUsed="0"/>
+    <w:lsdException w:name="Light List Accent 6" w:semiHidden="0" w:uiPriority="61" w:unhideWhenUsed="0"/>
+    <w:lsdException w:name="Light Grid Accent 6" w:semiHidden="0" w:uiPriority="62" w:unhideWhenUsed="0"/>
+    <w:lsdException w:name="Medium Shading 1 Accent 6" w:semiHidden="0" w:uiPriority="63" w:unhideWhenUsed="0"/>
+    <w:lsdException w:name="Medium Shading 2 Accent 6" w:semiHidden="0" w:uiPriority="64" w:unhideWhenUsed="0"/>
+    <w:lsdException w:name="Medium List 1 Accent 6" w:semiHidden="0" w:uiPriority="65" w:unhideWhenUsed="0"/>
+    <w:lsdException w:name="Medium List 2 Accent 6" w:semiHidden="0" w:uiPriority="66" w:unhideWhenUsed="0"/>
+    <w:lsdException w:name="Medium Grid 1 Accent 6" w:semiHidden="0" w:uiPriority="67" w:unhideWhenUsed="0"/>
+    <w:lsdException w:name="Medium Grid 2 Accent 6" w:semiHidden="0" w:uiPriority="68" w:unhideWhenUsed="0"/>
+    <w:lsdException w:name="Medium Grid 3 Accent 6" w:semiHidden="0" w:uiPriority="69" w:unhideWhenUsed="0"/>
+    <w:lsdException w:name="Dark List Accent 6" w:semiHidden="0" w:uiPriority="70" w:unhideWhenUsed="0"/>
+    <w:lsdException w:name="Colorful Shading Accent 6" w:semiHidden="0" w:uiPriority="71" w:unhideWhenUsed="0"/>
+    <w:lsdException w:name="Colorful List Accent 6" w:semiHidden="0" w:uiPriority="72" w:unhideWhenUsed="0"/>
+    <w:lsdException w:name="Colorful Grid Accent 6" w:semiHidden="0" w:uiPriority="73" w:unhideWhenUsed="0"/>
+    <w:lsdException w:name="Subtle Emphasis" w:semiHidden="0" w:uiPriority="19" w:unhideWhenUsed="0" w:qFormat="1"/>
+    <w:lsdException w:name="Intense Emphasis" w:semiHidden="0" w:uiPriority="21" w:unhideWhenUsed="0" w:qFormat="1"/>
+    <w:lsdException w:name="Subtle Reference" w:semiHidden="0" w:uiPriority="31" w:unhideWhenUsed="0" w:qFormat="1"/>
+    <w:lsdException w:name="Intense Reference" w:semiHidden="0" w:uiPriority="32" w:unhideWhenUsed="0" w:qFormat="1"/>
+    <w:lsdException w:name="Book Title" w:semiHidden="0" w:uiPriority="33" w:unhideWhenUsed="0" w:qFormat="1"/>
+    <w:lsdException w:name="Bibliography" w:uiPriority="37"/>
+    <w:lsdException w:name="TOC Heading" w:uiPriority="39" w:qFormat="1"/>
   </w:latentStyles>
   <w:style w:type="paragraph" w:default="1" w:styleId="Normal">
     <w:name w:val="Normal"/>
@@ -3355,6 +3127,7 @@
   <w:style w:type="character" w:default="1" w:styleId="DefaultParagraphFont">
     <w:name w:val="Default Paragraph Font"/>
     <w:uiPriority w:val="1"/>
+    <w:semiHidden/>
     <w:unhideWhenUsed/>
   </w:style>
   <w:style w:type="table" w:default="1" w:styleId="TableNormal">
@@ -3667,6 +3440,784 @@
       <w:smallCaps/>
       <w:color w:val="365F91" w:themeColor="accent1" w:themeShade="BF"/>
       <w:spacing w:val="5"/>
+    </w:rPr>
+  </w:style>
+  <w:style w:type="paragraph" w:styleId="NormalWeb">
+    <w:name w:val="Normal (Web)"/>
+    <w:basedOn w:val="Normal"/>
+    <w:uiPriority w:val="99"/>
+    <w:semiHidden/>
+    <w:unhideWhenUsed/>
+    <w:rsid w:val="009E18CA"/>
+    <w:pPr>
+      <w:spacing w:before="100" w:beforeAutospacing="1" w:after="100" w:afterAutospacing="1" w:line="240" w:lineRule="auto"/>
+    </w:pPr>
+    <w:rPr>
+      <w:rFonts w:ascii="Times New Roman" w:eastAsia="Times New Roman" w:hAnsi="Times New Roman" w:cs="Times New Roman"/>
+      <w:kern w:val="0"/>
+      <w:sz w:val="24"/>
+      <w:szCs w:val="24"/>
+      <w14:ligatures w14:val="none"/>
+    </w:rPr>
+  </w:style>
+  <w:style w:type="paragraph" w:styleId="BalloonText">
+    <w:name w:val="Balloon Text"/>
+    <w:basedOn w:val="Normal"/>
+    <w:link w:val="BalloonTextChar"/>
+    <w:uiPriority w:val="99"/>
+    <w:semiHidden/>
+    <w:unhideWhenUsed/>
+    <w:rsid w:val="0078649F"/>
+    <w:pPr>
+      <w:spacing w:after="0" w:line="240" w:lineRule="auto"/>
+    </w:pPr>
+    <w:rPr>
+      <w:rFonts w:ascii="Tahoma" w:hAnsi="Tahoma" w:cs="Tahoma"/>
+      <w:sz w:val="16"/>
+      <w:szCs w:val="16"/>
+    </w:rPr>
+  </w:style>
+  <w:style w:type="character" w:customStyle="1" w:styleId="BalloonTextChar">
+    <w:name w:val="Balloon Text Char"/>
+    <w:basedOn w:val="DefaultParagraphFont"/>
+    <w:link w:val="BalloonText"/>
+    <w:uiPriority w:val="99"/>
+    <w:semiHidden/>
+    <w:rsid w:val="0078649F"/>
+    <w:rPr>
+      <w:rFonts w:ascii="Tahoma" w:hAnsi="Tahoma" w:cs="Tahoma"/>
+      <w:sz w:val="16"/>
+      <w:szCs w:val="16"/>
+    </w:rPr>
+  </w:style>
+</w:styles>
+</file>
+
+<file path=word/stylesWithEffects.xml><?xml version="1.0" encoding="utf-8"?>
+<w:styles xmlns:wpc="http://schemas.microsoft.com/office/word/2010/wordprocessingCanvas" xmlns:mc="http://schemas.openxmlformats.org/markup-compatibility/2006" xmlns:o="urn:schemas-microsoft-com:office:office" xmlns:r="http://schemas.openxmlformats.org/officeDocument/2006/relationships" xmlns:m="http://schemas.openxmlformats.org/officeDocument/2006/math" xmlns:v="urn:schemas-microsoft-com:vml" xmlns:wp14="http://schemas.microsoft.com/office/word/2010/wordprocessingDrawing" xmlns:wp="http://schemas.openxmlformats.org/drawingml/2006/wordprocessingDrawing" xmlns:w10="urn:schemas-microsoft-com:office:word" xmlns:w="http://schemas.openxmlformats.org/wordprocessingml/2006/main" xmlns:w14="http://schemas.microsoft.com/office/word/2010/wordml" xmlns:wpg="http://schemas.microsoft.com/office/word/2010/wordprocessingGroup" xmlns:wpi="http://schemas.microsoft.com/office/word/2010/wordprocessingInk" xmlns:wne="http://schemas.microsoft.com/office/word/2006/wordml" xmlns:wps="http://schemas.microsoft.com/office/word/2010/wordprocessingShape" mc:Ignorable="w14 wp14">
+  <w:docDefaults>
+    <w:rPrDefault>
+      <w:rPr>
+        <w:rFonts w:asciiTheme="minorHAnsi" w:eastAsiaTheme="minorHAnsi" w:hAnsiTheme="minorHAnsi" w:cstheme="minorBidi"/>
+        <w:kern w:val="2"/>
+        <w:sz w:val="22"/>
+        <w:szCs w:val="22"/>
+        <w:lang w:val="en-US" w:eastAsia="en-US" w:bidi="ar-SA"/>
+        <w14:ligatures w14:val="standardContextual"/>
+      </w:rPr>
+    </w:rPrDefault>
+    <w:pPrDefault>
+      <w:pPr>
+        <w:spacing w:after="200" w:line="276" w:lineRule="auto"/>
+      </w:pPr>
+    </w:pPrDefault>
+  </w:docDefaults>
+  <w:latentStyles w:defLockedState="0" w:defUIPriority="99" w:defSemiHidden="1" w:defUnhideWhenUsed="1" w:defQFormat="0" w:count="267">
+    <w:lsdException w:name="Normal" w:semiHidden="0" w:uiPriority="0" w:unhideWhenUsed="0" w:qFormat="1"/>
+    <w:lsdException w:name="heading 1" w:semiHidden="0" w:uiPriority="9" w:unhideWhenUsed="0" w:qFormat="1"/>
+    <w:lsdException w:name="heading 2" w:uiPriority="9" w:qFormat="1"/>
+    <w:lsdException w:name="heading 3" w:uiPriority="9" w:qFormat="1"/>
+    <w:lsdException w:name="heading 4" w:uiPriority="9" w:qFormat="1"/>
+    <w:lsdException w:name="heading 5" w:uiPriority="9" w:qFormat="1"/>
+    <w:lsdException w:name="heading 6" w:uiPriority="9" w:qFormat="1"/>
+    <w:lsdException w:name="heading 7" w:uiPriority="9" w:qFormat="1"/>
+    <w:lsdException w:name="heading 8" w:uiPriority="9" w:qFormat="1"/>
+    <w:lsdException w:name="heading 9" w:uiPriority="9" w:qFormat="1"/>
+    <w:lsdException w:name="toc 1" w:uiPriority="39"/>
+    <w:lsdException w:name="toc 2" w:uiPriority="39"/>
+    <w:lsdException w:name="toc 3" w:uiPriority="39"/>
+    <w:lsdException w:name="toc 4" w:uiPriority="39"/>
+    <w:lsdException w:name="toc 5" w:uiPriority="39"/>
+    <w:lsdException w:name="toc 6" w:uiPriority="39"/>
+    <w:lsdException w:name="toc 7" w:uiPriority="39"/>
+    <w:lsdException w:name="toc 8" w:uiPriority="39"/>
+    <w:lsdException w:name="toc 9" w:uiPriority="39"/>
+    <w:lsdException w:name="caption" w:uiPriority="35" w:qFormat="1"/>
+    <w:lsdException w:name="Title" w:semiHidden="0" w:uiPriority="10" w:unhideWhenUsed="0" w:qFormat="1"/>
+    <w:lsdException w:name="Default Paragraph Font" w:uiPriority="1"/>
+    <w:lsdException w:name="Subtitle" w:semiHidden="0" w:uiPriority="11" w:unhideWhenUsed="0" w:qFormat="1"/>
+    <w:lsdException w:name="Strong" w:semiHidden="0" w:uiPriority="22" w:unhideWhenUsed="0" w:qFormat="1"/>
+    <w:lsdException w:name="Emphasis" w:semiHidden="0" w:uiPriority="20" w:unhideWhenUsed="0" w:qFormat="1"/>
+    <w:lsdException w:name="Table Grid" w:semiHidden="0" w:uiPriority="59" w:unhideWhenUsed="0"/>
+    <w:lsdException w:name="Placeholder Text" w:unhideWhenUsed="0"/>
+    <w:lsdException w:name="No Spacing" w:semiHidden="0" w:uiPriority="1" w:unhideWhenUsed="0" w:qFormat="1"/>
+    <w:lsdException w:name="Light Shading" w:semiHidden="0" w:uiPriority="60" w:unhideWhenUsed="0"/>
+    <w:lsdException w:name="Light List" w:semiHidden="0" w:uiPriority="61" w:unhideWhenUsed="0"/>
+    <w:lsdException w:name="Light Grid" w:semiHidden="0" w:uiPriority="62" w:unhideWhenUsed="0"/>
+    <w:lsdException w:name="Medium Shading 1" w:semiHidden="0" w:uiPriority="63" w:unhideWhenUsed="0"/>
+    <w:lsdException w:name="Medium Shading 2" w:semiHidden="0" w:uiPriority="64" w:unhideWhenUsed="0"/>
+    <w:lsdException w:name="Medium List 1" w:semiHidden="0" w:uiPriority="65" w:unhideWhenUsed="0"/>
+    <w:lsdException w:name="Medium List 2" w:semiHidden="0" w:uiPriority="66" w:unhideWhenUsed="0"/>
+    <w:lsdException w:name="Medium Grid 1" w:semiHidden="0" w:uiPriority="67" w:unhideWhenUsed="0"/>
+    <w:lsdException w:name="Medium Grid 2" w:semiHidden="0" w:uiPriority="68" w:unhideWhenUsed="0"/>
+    <w:lsdException w:name="Medium Grid 3" w:semiHidden="0" w:uiPriority="69" w:unhideWhenUsed="0"/>
+    <w:lsdException w:name="Dark List" w:semiHidden="0" w:uiPriority="70" w:unhideWhenUsed="0"/>
+    <w:lsdException w:name="Colorful Shading" w:semiHidden="0" w:uiPriority="71" w:unhideWhenUsed="0"/>
+    <w:lsdException w:name="Colorful List" w:semiHidden="0" w:uiPriority="72" w:unhideWhenUsed="0"/>
+    <w:lsdException w:name="Colorful Grid" w:semiHidden="0" w:uiPriority="73" w:unhideWhenUsed="0"/>
+    <w:lsdException w:name="Light Shading Accent 1" w:semiHidden="0" w:uiPriority="60" w:unhideWhenUsed="0"/>
+    <w:lsdException w:name="Light List Accent 1" w:semiHidden="0" w:uiPriority="61" w:unhideWhenUsed="0"/>
+    <w:lsdException w:name="Light Grid Accent 1" w:semiHidden="0" w:uiPriority="62" w:unhideWhenUsed="0"/>
+    <w:lsdException w:name="Medium Shading 1 Accent 1" w:semiHidden="0" w:uiPriority="63" w:unhideWhenUsed="0"/>
+    <w:lsdException w:name="Medium Shading 2 Accent 1" w:semiHidden="0" w:uiPriority="64" w:unhideWhenUsed="0"/>
+    <w:lsdException w:name="Medium List 1 Accent 1" w:semiHidden="0" w:uiPriority="65" w:unhideWhenUsed="0"/>
+    <w:lsdException w:name="Revision" w:unhideWhenUsed="0"/>
+    <w:lsdException w:name="List Paragraph" w:semiHidden="0" w:uiPriority="34" w:unhideWhenUsed="0" w:qFormat="1"/>
+    <w:lsdException w:name="Quote" w:semiHidden="0" w:uiPriority="29" w:unhideWhenUsed="0" w:qFormat="1"/>
+    <w:lsdException w:name="Intense Quote" w:semiHidden="0" w:uiPriority="30" w:unhideWhenUsed="0" w:qFormat="1"/>
+    <w:lsdException w:name="Medium List 2 Accent 1" w:semiHidden="0" w:uiPriority="66" w:unhideWhenUsed="0"/>
+    <w:lsdException w:name="Medium Grid 1 Accent 1" w:semiHidden="0" w:uiPriority="67" w:unhideWhenUsed="0"/>
+    <w:lsdException w:name="Medium Grid 2 Accent 1" w:semiHidden="0" w:uiPriority="68" w:unhideWhenUsed="0"/>
+    <w:lsdException w:name="Medium Grid 3 Accent 1" w:semiHidden="0" w:uiPriority="69" w:unhideWhenUsed="0"/>
+    <w:lsdException w:name="Dark List Accent 1" w:semiHidden="0" w:uiPriority="70" w:unhideWhenUsed="0"/>
+    <w:lsdException w:name="Colorful Shading Accent 1" w:semiHidden="0" w:uiPriority="71" w:unhideWhenUsed="0"/>
+    <w:lsdException w:name="Colorful List Accent 1" w:semiHidden="0" w:uiPriority="72" w:unhideWhenUsed="0"/>
+    <w:lsdException w:name="Colorful Grid Accent 1" w:semiHidden="0" w:uiPriority="73" w:unhideWhenUsed="0"/>
+    <w:lsdException w:name="Light Shading Accent 2" w:semiHidden="0" w:uiPriority="60" w:unhideWhenUsed="0"/>
+    <w:lsdException w:name="Light List Accent 2" w:semiHidden="0" w:uiPriority="61" w:unhideWhenUsed="0"/>
+    <w:lsdException w:name="Light Grid Accent 2" w:semiHidden="0" w:uiPriority="62" w:unhideWhenUsed="0"/>
+    <w:lsdException w:name="Medium Shading 1 Accent 2" w:semiHidden="0" w:uiPriority="63" w:unhideWhenUsed="0"/>
+    <w:lsdException w:name="Medium Shading 2 Accent 2" w:semiHidden="0" w:uiPriority="64" w:unhideWhenUsed="0"/>
+    <w:lsdException w:name="Medium List 1 Accent 2" w:semiHidden="0" w:uiPriority="65" w:unhideWhenUsed="0"/>
+    <w:lsdException w:name="Medium List 2 Accent 2" w:semiHidden="0" w:uiPriority="66" w:unhideWhenUsed="0"/>
+    <w:lsdException w:name="Medium Grid 1 Accent 2" w:semiHidden="0" w:uiPriority="67" w:unhideWhenUsed="0"/>
+    <w:lsdException w:name="Medium Grid 2 Accent 2" w:semiHidden="0" w:uiPriority="68" w:unhideWhenUsed="0"/>
+    <w:lsdException w:name="Medium Grid 3 Accent 2" w:semiHidden="0" w:uiPriority="69" w:unhideWhenUsed="0"/>
+    <w:lsdException w:name="Dark List Accent 2" w:semiHidden="0" w:uiPriority="70" w:unhideWhenUsed="0"/>
+    <w:lsdException w:name="Colorful Shading Accent 2" w:semiHidden="0" w:uiPriority="71" w:unhideWhenUsed="0"/>
+    <w:lsdException w:name="Colorful List Accent 2" w:semiHidden="0" w:uiPriority="72" w:unhideWhenUsed="0"/>
+    <w:lsdException w:name="Colorful Grid Accent 2" w:semiHidden="0" w:uiPriority="73" w:unhideWhenUsed="0"/>
+    <w:lsdException w:name="Light Shading Accent 3" w:semiHidden="0" w:uiPriority="60" w:unhideWhenUsed="0"/>
+    <w:lsdException w:name="Light List Accent 3" w:semiHidden="0" w:uiPriority="61" w:unhideWhenUsed="0"/>
+    <w:lsdException w:name="Light Grid Accent 3" w:semiHidden="0" w:uiPriority="62" w:unhideWhenUsed="0"/>
+    <w:lsdException w:name="Medium Shading 1 Accent 3" w:semiHidden="0" w:uiPriority="63" w:unhideWhenUsed="0"/>
+    <w:lsdException w:name="Medium Shading 2 Accent 3" w:semiHidden="0" w:uiPriority="64" w:unhideWhenUsed="0"/>
+    <w:lsdException w:name="Medium List 1 Accent 3" w:semiHidden="0" w:uiPriority="65" w:unhideWhenUsed="0"/>
+    <w:lsdException w:name="Medium List 2 Accent 3" w:semiHidden="0" w:uiPriority="66" w:unhideWhenUsed="0"/>
+    <w:lsdException w:name="Medium Grid 1 Accent 3" w:semiHidden="0" w:uiPriority="67" w:unhideWhenUsed="0"/>
+    <w:lsdException w:name="Medium Grid 2 Accent 3" w:semiHidden="0" w:uiPriority="68" w:unhideWhenUsed="0"/>
+    <w:lsdException w:name="Medium Grid 3 Accent 3" w:semiHidden="0" w:uiPriority="69" w:unhideWhenUsed="0"/>
+    <w:lsdException w:name="Dark List Accent 3" w:semiHidden="0" w:uiPriority="70" w:unhideWhenUsed="0"/>
+    <w:lsdException w:name="Colorful Shading Accent 3" w:semiHidden="0" w:uiPriority="71" w:unhideWhenUsed="0"/>
+    <w:lsdException w:name="Colorful List Accent 3" w:semiHidden="0" w:uiPriority="72" w:unhideWhenUsed="0"/>
+    <w:lsdException w:name="Colorful Grid Accent 3" w:semiHidden="0" w:uiPriority="73" w:unhideWhenUsed="0"/>
+    <w:lsdException w:name="Light Shading Accent 4" w:semiHidden="0" w:uiPriority="60" w:unhideWhenUsed="0"/>
+    <w:lsdException w:name="Light List Accent 4" w:semiHidden="0" w:uiPriority="61" w:unhideWhenUsed="0"/>
+    <w:lsdException w:name="Light Grid Accent 4" w:semiHidden="0" w:uiPriority="62" w:unhideWhenUsed="0"/>
+    <w:lsdException w:name="Medium Shading 1 Accent 4" w:semiHidden="0" w:uiPriority="63" w:unhideWhenUsed="0"/>
+    <w:lsdException w:name="Medium Shading 2 Accent 4" w:semiHidden="0" w:uiPriority="64" w:unhideWhenUsed="0"/>
+    <w:lsdException w:name="Medium List 1 Accent 4" w:semiHidden="0" w:uiPriority="65" w:unhideWhenUsed="0"/>
+    <w:lsdException w:name="Medium List 2 Accent 4" w:semiHidden="0" w:uiPriority="66" w:unhideWhenUsed="0"/>
+    <w:lsdException w:name="Medium Grid 1 Accent 4" w:semiHidden="0" w:uiPriority="67" w:unhideWhenUsed="0"/>
+    <w:lsdException w:name="Medium Grid 2 Accent 4" w:semiHidden="0" w:uiPriority="68" w:unhideWhenUsed="0"/>
+    <w:lsdException w:name="Medium Grid 3 Accent 4" w:semiHidden="0" w:uiPriority="69" w:unhideWhenUsed="0"/>
+    <w:lsdException w:name="Dark List Accent 4" w:semiHidden="0" w:uiPriority="70" w:unhideWhenUsed="0"/>
+    <w:lsdException w:name="Colorful Shading Accent 4" w:semiHidden="0" w:uiPriority="71" w:unhideWhenUsed="0"/>
+    <w:lsdException w:name="Colorful List Accent 4" w:semiHidden="0" w:uiPriority="72" w:unhideWhenUsed="0"/>
+    <w:lsdException w:name="Colorful Grid Accent 4" w:semiHidden="0" w:uiPriority="73" w:unhideWhenUsed="0"/>
+    <w:lsdException w:name="Light Shading Accent 5" w:semiHidden="0" w:uiPriority="60" w:unhideWhenUsed="0"/>
+    <w:lsdException w:name="Light List Accent 5" w:semiHidden="0" w:uiPriority="61" w:unhideWhenUsed="0"/>
+    <w:lsdException w:name="Light Grid Accent 5" w:semiHidden="0" w:uiPriority="62" w:unhideWhenUsed="0"/>
+    <w:lsdException w:name="Medium Shading 1 Accent 5" w:semiHidden="0" w:uiPriority="63" w:unhideWhenUsed="0"/>
+    <w:lsdException w:name="Medium Shading 2 Accent 5" w:semiHidden="0" w:uiPriority="64" w:unhideWhenUsed="0"/>
+    <w:lsdException w:name="Medium List 1 Accent 5" w:semiHidden="0" w:uiPriority="65" w:unhideWhenUsed="0"/>
+    <w:lsdException w:name="Medium List 2 Accent 5" w:semiHidden="0" w:uiPriority="66" w:unhideWhenUsed="0"/>
+    <w:lsdException w:name="Medium Grid 1 Accent 5" w:semiHidden="0" w:uiPriority="67" w:unhideWhenUsed="0"/>
+    <w:lsdException w:name="Medium Grid 2 Accent 5" w:semiHidden="0" w:uiPriority="68" w:unhideWhenUsed="0"/>
+    <w:lsdException w:name="Medium Grid 3 Accent 5" w:semiHidden="0" w:uiPriority="69" w:unhideWhenUsed="0"/>
+    <w:lsdException w:name="Dark List Accent 5" w:semiHidden="0" w:uiPriority="70" w:unhideWhenUsed="0"/>
+    <w:lsdException w:name="Colorful Shading Accent 5" w:semiHidden="0" w:uiPriority="71" w:unhideWhenUsed="0"/>
+    <w:lsdException w:name="Colorful List Accent 5" w:semiHidden="0" w:uiPriority="72" w:unhideWhenUsed="0"/>
+    <w:lsdException w:name="Colorful Grid Accent 5" w:semiHidden="0" w:uiPriority="73" w:unhideWhenUsed="0"/>
+    <w:lsdException w:name="Light Shading Accent 6" w:semiHidden="0" w:uiPriority="60" w:unhideWhenUsed="0"/>
+    <w:lsdException w:name="Light List Accent 6" w:semiHidden="0" w:uiPriority="61" w:unhideWhenUsed="0"/>
+    <w:lsdException w:name="Light Grid Accent 6" w:semiHidden="0" w:uiPriority="62" w:unhideWhenUsed="0"/>
+    <w:lsdException w:name="Medium Shading 1 Accent 6" w:semiHidden="0" w:uiPriority="63" w:unhideWhenUsed="0"/>
+    <w:lsdException w:name="Medium Shading 2 Accent 6" w:semiHidden="0" w:uiPriority="64" w:unhideWhenUsed="0"/>
+    <w:lsdException w:name="Medium List 1 Accent 6" w:semiHidden="0" w:uiPriority="65" w:unhideWhenUsed="0"/>
+    <w:lsdException w:name="Medium List 2 Accent 6" w:semiHidden="0" w:uiPriority="66" w:unhideWhenUsed="0"/>
+    <w:lsdException w:name="Medium Grid 1 Accent 6" w:semiHidden="0" w:uiPriority="67" w:unhideWhenUsed="0"/>
+    <w:lsdException w:name="Medium Grid 2 Accent 6" w:semiHidden="0" w:uiPriority="68" w:unhideWhenUsed="0"/>
+    <w:lsdException w:name="Medium Grid 3 Accent 6" w:semiHidden="0" w:uiPriority="69" w:unhideWhenUsed="0"/>
+    <w:lsdException w:name="Dark List Accent 6" w:semiHidden="0" w:uiPriority="70" w:unhideWhenUsed="0"/>
+    <w:lsdException w:name="Colorful Shading Accent 6" w:semiHidden="0" w:uiPriority="71" w:unhideWhenUsed="0"/>
+    <w:lsdException w:name="Colorful List Accent 6" w:semiHidden="0" w:uiPriority="72" w:unhideWhenUsed="0"/>
+    <w:lsdException w:name="Colorful Grid Accent 6" w:semiHidden="0" w:uiPriority="73" w:unhideWhenUsed="0"/>
+    <w:lsdException w:name="Subtle Emphasis" w:semiHidden="0" w:uiPriority="19" w:unhideWhenUsed="0" w:qFormat="1"/>
+    <w:lsdException w:name="Intense Emphasis" w:semiHidden="0" w:uiPriority="21" w:unhideWhenUsed="0" w:qFormat="1"/>
+    <w:lsdException w:name="Subtle Reference" w:semiHidden="0" w:uiPriority="31" w:unhideWhenUsed="0" w:qFormat="1"/>
+    <w:lsdException w:name="Intense Reference" w:semiHidden="0" w:uiPriority="32" w:unhideWhenUsed="0" w:qFormat="1"/>
+    <w:lsdException w:name="Book Title" w:semiHidden="0" w:uiPriority="33" w:unhideWhenUsed="0" w:qFormat="1"/>
+    <w:lsdException w:name="Bibliography" w:uiPriority="37"/>
+    <w:lsdException w:name="TOC Heading" w:uiPriority="39" w:qFormat="1"/>
+  </w:latentStyles>
+  <w:style w:type="paragraph" w:default="1" w:styleId="Normal">
+    <w:name w:val="Normal"/>
+    <w:qFormat/>
+  </w:style>
+  <w:style w:type="paragraph" w:styleId="Heading1">
+    <w:name w:val="heading 1"/>
+    <w:basedOn w:val="Normal"/>
+    <w:next w:val="Normal"/>
+    <w:link w:val="Heading1Char"/>
+    <w:uiPriority w:val="9"/>
+    <w:qFormat/>
+    <w:rsid w:val="00FB2C7F"/>
+    <w:pPr>
+      <w:keepNext/>
+      <w:keepLines/>
+      <w:spacing w:before="360" w:after="80"/>
+      <w:outlineLvl w:val="0"/>
+    </w:pPr>
+    <w:rPr>
+      <w:rFonts w:asciiTheme="majorHAnsi" w:eastAsiaTheme="majorEastAsia" w:hAnsiTheme="majorHAnsi" w:cstheme="majorBidi"/>
+      <w:color w:val="365F91" w:themeColor="accent1" w:themeShade="BF"/>
+      <w:sz w:val="40"/>
+      <w:szCs w:val="40"/>
+    </w:rPr>
+  </w:style>
+  <w:style w:type="paragraph" w:styleId="Heading2">
+    <w:name w:val="heading 2"/>
+    <w:basedOn w:val="Normal"/>
+    <w:next w:val="Normal"/>
+    <w:link w:val="Heading2Char"/>
+    <w:uiPriority w:val="9"/>
+    <w:semiHidden/>
+    <w:unhideWhenUsed/>
+    <w:qFormat/>
+    <w:rsid w:val="00FB2C7F"/>
+    <w:pPr>
+      <w:keepNext/>
+      <w:keepLines/>
+      <w:spacing w:before="160" w:after="80"/>
+      <w:outlineLvl w:val="1"/>
+    </w:pPr>
+    <w:rPr>
+      <w:rFonts w:asciiTheme="majorHAnsi" w:eastAsiaTheme="majorEastAsia" w:hAnsiTheme="majorHAnsi" w:cstheme="majorBidi"/>
+      <w:color w:val="365F91" w:themeColor="accent1" w:themeShade="BF"/>
+      <w:sz w:val="32"/>
+      <w:szCs w:val="32"/>
+    </w:rPr>
+  </w:style>
+  <w:style w:type="paragraph" w:styleId="Heading3">
+    <w:name w:val="heading 3"/>
+    <w:basedOn w:val="Normal"/>
+    <w:next w:val="Normal"/>
+    <w:link w:val="Heading3Char"/>
+    <w:uiPriority w:val="9"/>
+    <w:semiHidden/>
+    <w:unhideWhenUsed/>
+    <w:qFormat/>
+    <w:rsid w:val="00FB2C7F"/>
+    <w:pPr>
+      <w:keepNext/>
+      <w:keepLines/>
+      <w:spacing w:before="160" w:after="80"/>
+      <w:outlineLvl w:val="2"/>
+    </w:pPr>
+    <w:rPr>
+      <w:rFonts w:eastAsiaTheme="majorEastAsia" w:cstheme="majorBidi"/>
+      <w:color w:val="365F91" w:themeColor="accent1" w:themeShade="BF"/>
+      <w:sz w:val="28"/>
+      <w:szCs w:val="28"/>
+    </w:rPr>
+  </w:style>
+  <w:style w:type="paragraph" w:styleId="Heading4">
+    <w:name w:val="heading 4"/>
+    <w:basedOn w:val="Normal"/>
+    <w:next w:val="Normal"/>
+    <w:link w:val="Heading4Char"/>
+    <w:uiPriority w:val="9"/>
+    <w:semiHidden/>
+    <w:unhideWhenUsed/>
+    <w:qFormat/>
+    <w:rsid w:val="00FB2C7F"/>
+    <w:pPr>
+      <w:keepNext/>
+      <w:keepLines/>
+      <w:spacing w:before="80" w:after="40"/>
+      <w:outlineLvl w:val="3"/>
+    </w:pPr>
+    <w:rPr>
+      <w:rFonts w:eastAsiaTheme="majorEastAsia" w:cstheme="majorBidi"/>
+      <w:i/>
+      <w:iCs/>
+      <w:color w:val="365F91" w:themeColor="accent1" w:themeShade="BF"/>
+    </w:rPr>
+  </w:style>
+  <w:style w:type="paragraph" w:styleId="Heading5">
+    <w:name w:val="heading 5"/>
+    <w:basedOn w:val="Normal"/>
+    <w:next w:val="Normal"/>
+    <w:link w:val="Heading5Char"/>
+    <w:uiPriority w:val="9"/>
+    <w:semiHidden/>
+    <w:unhideWhenUsed/>
+    <w:qFormat/>
+    <w:rsid w:val="00FB2C7F"/>
+    <w:pPr>
+      <w:keepNext/>
+      <w:keepLines/>
+      <w:spacing w:before="80" w:after="40"/>
+      <w:outlineLvl w:val="4"/>
+    </w:pPr>
+    <w:rPr>
+      <w:rFonts w:eastAsiaTheme="majorEastAsia" w:cstheme="majorBidi"/>
+      <w:color w:val="365F91" w:themeColor="accent1" w:themeShade="BF"/>
+    </w:rPr>
+  </w:style>
+  <w:style w:type="paragraph" w:styleId="Heading6">
+    <w:name w:val="heading 6"/>
+    <w:basedOn w:val="Normal"/>
+    <w:next w:val="Normal"/>
+    <w:link w:val="Heading6Char"/>
+    <w:uiPriority w:val="9"/>
+    <w:semiHidden/>
+    <w:unhideWhenUsed/>
+    <w:qFormat/>
+    <w:rsid w:val="00FB2C7F"/>
+    <w:pPr>
+      <w:keepNext/>
+      <w:keepLines/>
+      <w:spacing w:before="40" w:after="0"/>
+      <w:outlineLvl w:val="5"/>
+    </w:pPr>
+    <w:rPr>
+      <w:rFonts w:eastAsiaTheme="majorEastAsia" w:cstheme="majorBidi"/>
+      <w:i/>
+      <w:iCs/>
+      <w:color w:val="595959" w:themeColor="text1" w:themeTint="A6"/>
+    </w:rPr>
+  </w:style>
+  <w:style w:type="paragraph" w:styleId="Heading7">
+    <w:name w:val="heading 7"/>
+    <w:basedOn w:val="Normal"/>
+    <w:next w:val="Normal"/>
+    <w:link w:val="Heading7Char"/>
+    <w:uiPriority w:val="9"/>
+    <w:semiHidden/>
+    <w:unhideWhenUsed/>
+    <w:qFormat/>
+    <w:rsid w:val="00FB2C7F"/>
+    <w:pPr>
+      <w:keepNext/>
+      <w:keepLines/>
+      <w:spacing w:before="40" w:after="0"/>
+      <w:outlineLvl w:val="6"/>
+    </w:pPr>
+    <w:rPr>
+      <w:rFonts w:eastAsiaTheme="majorEastAsia" w:cstheme="majorBidi"/>
+      <w:color w:val="595959" w:themeColor="text1" w:themeTint="A6"/>
+    </w:rPr>
+  </w:style>
+  <w:style w:type="paragraph" w:styleId="Heading8">
+    <w:name w:val="heading 8"/>
+    <w:basedOn w:val="Normal"/>
+    <w:next w:val="Normal"/>
+    <w:link w:val="Heading8Char"/>
+    <w:uiPriority w:val="9"/>
+    <w:semiHidden/>
+    <w:unhideWhenUsed/>
+    <w:qFormat/>
+    <w:rsid w:val="00FB2C7F"/>
+    <w:pPr>
+      <w:keepNext/>
+      <w:keepLines/>
+      <w:spacing w:after="0"/>
+      <w:outlineLvl w:val="7"/>
+    </w:pPr>
+    <w:rPr>
+      <w:rFonts w:eastAsiaTheme="majorEastAsia" w:cstheme="majorBidi"/>
+      <w:i/>
+      <w:iCs/>
+      <w:color w:val="272727" w:themeColor="text1" w:themeTint="D8"/>
+    </w:rPr>
+  </w:style>
+  <w:style w:type="paragraph" w:styleId="Heading9">
+    <w:name w:val="heading 9"/>
+    <w:basedOn w:val="Normal"/>
+    <w:next w:val="Normal"/>
+    <w:link w:val="Heading9Char"/>
+    <w:uiPriority w:val="9"/>
+    <w:semiHidden/>
+    <w:unhideWhenUsed/>
+    <w:qFormat/>
+    <w:rsid w:val="00FB2C7F"/>
+    <w:pPr>
+      <w:keepNext/>
+      <w:keepLines/>
+      <w:spacing w:after="0"/>
+      <w:outlineLvl w:val="8"/>
+    </w:pPr>
+    <w:rPr>
+      <w:rFonts w:eastAsiaTheme="majorEastAsia" w:cstheme="majorBidi"/>
+      <w:color w:val="272727" w:themeColor="text1" w:themeTint="D8"/>
+    </w:rPr>
+  </w:style>
+  <w:style w:type="character" w:default="1" w:styleId="DefaultParagraphFont">
+    <w:name w:val="Default Paragraph Font"/>
+    <w:uiPriority w:val="1"/>
+    <w:semiHidden/>
+    <w:unhideWhenUsed/>
+  </w:style>
+  <w:style w:type="table" w:default="1" w:styleId="TableNormal">
+    <w:name w:val="Normal Table"/>
+    <w:uiPriority w:val="99"/>
+    <w:semiHidden/>
+    <w:unhideWhenUsed/>
+    <w:tblPr>
+      <w:tblInd w:w="0" w:type="dxa"/>
+      <w:tblCellMar>
+        <w:top w:w="0" w:type="dxa"/>
+        <w:left w:w="108" w:type="dxa"/>
+        <w:bottom w:w="0" w:type="dxa"/>
+        <w:right w:w="108" w:type="dxa"/>
+      </w:tblCellMar>
+    </w:tblPr>
+  </w:style>
+  <w:style w:type="numbering" w:default="1" w:styleId="NoList">
+    <w:name w:val="No List"/>
+    <w:uiPriority w:val="99"/>
+    <w:semiHidden/>
+    <w:unhideWhenUsed/>
+  </w:style>
+  <w:style w:type="character" w:customStyle="1" w:styleId="Heading1Char">
+    <w:name w:val="Heading 1 Char"/>
+    <w:basedOn w:val="DefaultParagraphFont"/>
+    <w:link w:val="Heading1"/>
+    <w:uiPriority w:val="9"/>
+    <w:rsid w:val="00FB2C7F"/>
+    <w:rPr>
+      <w:rFonts w:asciiTheme="majorHAnsi" w:eastAsiaTheme="majorEastAsia" w:hAnsiTheme="majorHAnsi" w:cstheme="majorBidi"/>
+      <w:color w:val="365F91" w:themeColor="accent1" w:themeShade="BF"/>
+      <w:sz w:val="40"/>
+      <w:szCs w:val="40"/>
+    </w:rPr>
+  </w:style>
+  <w:style w:type="character" w:customStyle="1" w:styleId="Heading2Char">
+    <w:name w:val="Heading 2 Char"/>
+    <w:basedOn w:val="DefaultParagraphFont"/>
+    <w:link w:val="Heading2"/>
+    <w:uiPriority w:val="9"/>
+    <w:semiHidden/>
+    <w:rsid w:val="00FB2C7F"/>
+    <w:rPr>
+      <w:rFonts w:asciiTheme="majorHAnsi" w:eastAsiaTheme="majorEastAsia" w:hAnsiTheme="majorHAnsi" w:cstheme="majorBidi"/>
+      <w:color w:val="365F91" w:themeColor="accent1" w:themeShade="BF"/>
+      <w:sz w:val="32"/>
+      <w:szCs w:val="32"/>
+    </w:rPr>
+  </w:style>
+  <w:style w:type="character" w:customStyle="1" w:styleId="Heading3Char">
+    <w:name w:val="Heading 3 Char"/>
+    <w:basedOn w:val="DefaultParagraphFont"/>
+    <w:link w:val="Heading3"/>
+    <w:uiPriority w:val="9"/>
+    <w:semiHidden/>
+    <w:rsid w:val="00FB2C7F"/>
+    <w:rPr>
+      <w:rFonts w:eastAsiaTheme="majorEastAsia" w:cstheme="majorBidi"/>
+      <w:color w:val="365F91" w:themeColor="accent1" w:themeShade="BF"/>
+      <w:sz w:val="28"/>
+      <w:szCs w:val="28"/>
+    </w:rPr>
+  </w:style>
+  <w:style w:type="character" w:customStyle="1" w:styleId="Heading4Char">
+    <w:name w:val="Heading 4 Char"/>
+    <w:basedOn w:val="DefaultParagraphFont"/>
+    <w:link w:val="Heading4"/>
+    <w:uiPriority w:val="9"/>
+    <w:semiHidden/>
+    <w:rsid w:val="00FB2C7F"/>
+    <w:rPr>
+      <w:rFonts w:eastAsiaTheme="majorEastAsia" w:cstheme="majorBidi"/>
+      <w:i/>
+      <w:iCs/>
+      <w:color w:val="365F91" w:themeColor="accent1" w:themeShade="BF"/>
+    </w:rPr>
+  </w:style>
+  <w:style w:type="character" w:customStyle="1" w:styleId="Heading5Char">
+    <w:name w:val="Heading 5 Char"/>
+    <w:basedOn w:val="DefaultParagraphFont"/>
+    <w:link w:val="Heading5"/>
+    <w:uiPriority w:val="9"/>
+    <w:semiHidden/>
+    <w:rsid w:val="00FB2C7F"/>
+    <w:rPr>
+      <w:rFonts w:eastAsiaTheme="majorEastAsia" w:cstheme="majorBidi"/>
+      <w:color w:val="365F91" w:themeColor="accent1" w:themeShade="BF"/>
+    </w:rPr>
+  </w:style>
+  <w:style w:type="character" w:customStyle="1" w:styleId="Heading6Char">
+    <w:name w:val="Heading 6 Char"/>
+    <w:basedOn w:val="DefaultParagraphFont"/>
+    <w:link w:val="Heading6"/>
+    <w:uiPriority w:val="9"/>
+    <w:semiHidden/>
+    <w:rsid w:val="00FB2C7F"/>
+    <w:rPr>
+      <w:rFonts w:eastAsiaTheme="majorEastAsia" w:cstheme="majorBidi"/>
+      <w:i/>
+      <w:iCs/>
+      <w:color w:val="595959" w:themeColor="text1" w:themeTint="A6"/>
+    </w:rPr>
+  </w:style>
+  <w:style w:type="character" w:customStyle="1" w:styleId="Heading7Char">
+    <w:name w:val="Heading 7 Char"/>
+    <w:basedOn w:val="DefaultParagraphFont"/>
+    <w:link w:val="Heading7"/>
+    <w:uiPriority w:val="9"/>
+    <w:semiHidden/>
+    <w:rsid w:val="00FB2C7F"/>
+    <w:rPr>
+      <w:rFonts w:eastAsiaTheme="majorEastAsia" w:cstheme="majorBidi"/>
+      <w:color w:val="595959" w:themeColor="text1" w:themeTint="A6"/>
+    </w:rPr>
+  </w:style>
+  <w:style w:type="character" w:customStyle="1" w:styleId="Heading8Char">
+    <w:name w:val="Heading 8 Char"/>
+    <w:basedOn w:val="DefaultParagraphFont"/>
+    <w:link w:val="Heading8"/>
+    <w:uiPriority w:val="9"/>
+    <w:semiHidden/>
+    <w:rsid w:val="00FB2C7F"/>
+    <w:rPr>
+      <w:rFonts w:eastAsiaTheme="majorEastAsia" w:cstheme="majorBidi"/>
+      <w:i/>
+      <w:iCs/>
+      <w:color w:val="272727" w:themeColor="text1" w:themeTint="D8"/>
+    </w:rPr>
+  </w:style>
+  <w:style w:type="character" w:customStyle="1" w:styleId="Heading9Char">
+    <w:name w:val="Heading 9 Char"/>
+    <w:basedOn w:val="DefaultParagraphFont"/>
+    <w:link w:val="Heading9"/>
+    <w:uiPriority w:val="9"/>
+    <w:semiHidden/>
+    <w:rsid w:val="00FB2C7F"/>
+    <w:rPr>
+      <w:rFonts w:eastAsiaTheme="majorEastAsia" w:cstheme="majorBidi"/>
+      <w:color w:val="272727" w:themeColor="text1" w:themeTint="D8"/>
+    </w:rPr>
+  </w:style>
+  <w:style w:type="paragraph" w:styleId="Title">
+    <w:name w:val="Title"/>
+    <w:basedOn w:val="Normal"/>
+    <w:next w:val="Normal"/>
+    <w:link w:val="TitleChar"/>
+    <w:uiPriority w:val="10"/>
+    <w:qFormat/>
+    <w:rsid w:val="00FB2C7F"/>
+    <w:pPr>
+      <w:spacing w:after="80" w:line="240" w:lineRule="auto"/>
+      <w:contextualSpacing/>
+    </w:pPr>
+    <w:rPr>
+      <w:rFonts w:asciiTheme="majorHAnsi" w:eastAsiaTheme="majorEastAsia" w:hAnsiTheme="majorHAnsi" w:cstheme="majorBidi"/>
+      <w:spacing w:val="-10"/>
+      <w:kern w:val="28"/>
+      <w:sz w:val="56"/>
+      <w:szCs w:val="56"/>
+    </w:rPr>
+  </w:style>
+  <w:style w:type="character" w:customStyle="1" w:styleId="TitleChar">
+    <w:name w:val="Title Char"/>
+    <w:basedOn w:val="DefaultParagraphFont"/>
+    <w:link w:val="Title"/>
+    <w:uiPriority w:val="10"/>
+    <w:rsid w:val="00FB2C7F"/>
+    <w:rPr>
+      <w:rFonts w:asciiTheme="majorHAnsi" w:eastAsiaTheme="majorEastAsia" w:hAnsiTheme="majorHAnsi" w:cstheme="majorBidi"/>
+      <w:spacing w:val="-10"/>
+      <w:kern w:val="28"/>
+      <w:sz w:val="56"/>
+      <w:szCs w:val="56"/>
+    </w:rPr>
+  </w:style>
+  <w:style w:type="paragraph" w:styleId="Subtitle">
+    <w:name w:val="Subtitle"/>
+    <w:basedOn w:val="Normal"/>
+    <w:next w:val="Normal"/>
+    <w:link w:val="SubtitleChar"/>
+    <w:uiPriority w:val="11"/>
+    <w:qFormat/>
+    <w:rsid w:val="00FB2C7F"/>
+    <w:pPr>
+      <w:numPr>
+        <w:ilvl w:val="1"/>
+      </w:numPr>
+      <w:spacing w:after="160"/>
+    </w:pPr>
+    <w:rPr>
+      <w:rFonts w:eastAsiaTheme="majorEastAsia" w:cstheme="majorBidi"/>
+      <w:color w:val="595959" w:themeColor="text1" w:themeTint="A6"/>
+      <w:spacing w:val="15"/>
+      <w:sz w:val="28"/>
+      <w:szCs w:val="28"/>
+    </w:rPr>
+  </w:style>
+  <w:style w:type="character" w:customStyle="1" w:styleId="SubtitleChar">
+    <w:name w:val="Subtitle Char"/>
+    <w:basedOn w:val="DefaultParagraphFont"/>
+    <w:link w:val="Subtitle"/>
+    <w:uiPriority w:val="11"/>
+    <w:rsid w:val="00FB2C7F"/>
+    <w:rPr>
+      <w:rFonts w:eastAsiaTheme="majorEastAsia" w:cstheme="majorBidi"/>
+      <w:color w:val="595959" w:themeColor="text1" w:themeTint="A6"/>
+      <w:spacing w:val="15"/>
+      <w:sz w:val="28"/>
+      <w:szCs w:val="28"/>
+    </w:rPr>
+  </w:style>
+  <w:style w:type="paragraph" w:styleId="Quote">
+    <w:name w:val="Quote"/>
+    <w:basedOn w:val="Normal"/>
+    <w:next w:val="Normal"/>
+    <w:link w:val="QuoteChar"/>
+    <w:uiPriority w:val="29"/>
+    <w:qFormat/>
+    <w:rsid w:val="00FB2C7F"/>
+    <w:pPr>
+      <w:spacing w:before="160" w:after="160"/>
+      <w:jc w:val="center"/>
+    </w:pPr>
+    <w:rPr>
+      <w:i/>
+      <w:iCs/>
+      <w:color w:val="404040" w:themeColor="text1" w:themeTint="BF"/>
+    </w:rPr>
+  </w:style>
+  <w:style w:type="character" w:customStyle="1" w:styleId="QuoteChar">
+    <w:name w:val="Quote Char"/>
+    <w:basedOn w:val="DefaultParagraphFont"/>
+    <w:link w:val="Quote"/>
+    <w:uiPriority w:val="29"/>
+    <w:rsid w:val="00FB2C7F"/>
+    <w:rPr>
+      <w:i/>
+      <w:iCs/>
+      <w:color w:val="404040" w:themeColor="text1" w:themeTint="BF"/>
+    </w:rPr>
+  </w:style>
+  <w:style w:type="paragraph" w:styleId="ListParagraph">
+    <w:name w:val="List Paragraph"/>
+    <w:basedOn w:val="Normal"/>
+    <w:uiPriority w:val="34"/>
+    <w:qFormat/>
+    <w:rsid w:val="00FB2C7F"/>
+    <w:pPr>
+      <w:ind w:left="720"/>
+      <w:contextualSpacing/>
+    </w:pPr>
+  </w:style>
+  <w:style w:type="character" w:styleId="IntenseEmphasis">
+    <w:name w:val="Intense Emphasis"/>
+    <w:basedOn w:val="DefaultParagraphFont"/>
+    <w:uiPriority w:val="21"/>
+    <w:qFormat/>
+    <w:rsid w:val="00FB2C7F"/>
+    <w:rPr>
+      <w:i/>
+      <w:iCs/>
+      <w:color w:val="365F91" w:themeColor="accent1" w:themeShade="BF"/>
+    </w:rPr>
+  </w:style>
+  <w:style w:type="paragraph" w:styleId="IntenseQuote">
+    <w:name w:val="Intense Quote"/>
+    <w:basedOn w:val="Normal"/>
+    <w:next w:val="Normal"/>
+    <w:link w:val="IntenseQuoteChar"/>
+    <w:uiPriority w:val="30"/>
+    <w:qFormat/>
+    <w:rsid w:val="00FB2C7F"/>
+    <w:pPr>
+      <w:pBdr>
+        <w:top w:val="single" w:sz="4" w:space="10" w:color="365F91" w:themeColor="accent1" w:themeShade="BF"/>
+        <w:bottom w:val="single" w:sz="4" w:space="10" w:color="365F91" w:themeColor="accent1" w:themeShade="BF"/>
+      </w:pBdr>
+      <w:spacing w:before="360" w:after="360"/>
+      <w:ind w:left="864" w:right="864"/>
+      <w:jc w:val="center"/>
+    </w:pPr>
+    <w:rPr>
+      <w:i/>
+      <w:iCs/>
+      <w:color w:val="365F91" w:themeColor="accent1" w:themeShade="BF"/>
+    </w:rPr>
+  </w:style>
+  <w:style w:type="character" w:customStyle="1" w:styleId="IntenseQuoteChar">
+    <w:name w:val="Intense Quote Char"/>
+    <w:basedOn w:val="DefaultParagraphFont"/>
+    <w:link w:val="IntenseQuote"/>
+    <w:uiPriority w:val="30"/>
+    <w:rsid w:val="00FB2C7F"/>
+    <w:rPr>
+      <w:i/>
+      <w:iCs/>
+      <w:color w:val="365F91" w:themeColor="accent1" w:themeShade="BF"/>
+    </w:rPr>
+  </w:style>
+  <w:style w:type="character" w:styleId="IntenseReference">
+    <w:name w:val="Intense Reference"/>
+    <w:basedOn w:val="DefaultParagraphFont"/>
+    <w:uiPriority w:val="32"/>
+    <w:qFormat/>
+    <w:rsid w:val="00FB2C7F"/>
+    <w:rPr>
+      <w:b/>
+      <w:bCs/>
+      <w:smallCaps/>
+      <w:color w:val="365F91" w:themeColor="accent1" w:themeShade="BF"/>
+      <w:spacing w:val="5"/>
+    </w:rPr>
+  </w:style>
+  <w:style w:type="paragraph" w:styleId="NormalWeb">
+    <w:name w:val="Normal (Web)"/>
+    <w:basedOn w:val="Normal"/>
+    <w:uiPriority w:val="99"/>
+    <w:semiHidden/>
+    <w:unhideWhenUsed/>
+    <w:rsid w:val="009E18CA"/>
+    <w:pPr>
+      <w:spacing w:before="100" w:beforeAutospacing="1" w:after="100" w:afterAutospacing="1" w:line="240" w:lineRule="auto"/>
+    </w:pPr>
+    <w:rPr>
+      <w:rFonts w:ascii="Times New Roman" w:eastAsia="Times New Roman" w:hAnsi="Times New Roman" w:cs="Times New Roman"/>
+      <w:kern w:val="0"/>
+      <w:sz w:val="24"/>
+      <w:szCs w:val="24"/>
+      <w14:ligatures w14:val="none"/>
+    </w:rPr>
+  </w:style>
+  <w:style w:type="paragraph" w:styleId="BalloonText">
+    <w:name w:val="Balloon Text"/>
+    <w:basedOn w:val="Normal"/>
+    <w:link w:val="BalloonTextChar"/>
+    <w:uiPriority w:val="99"/>
+    <w:semiHidden/>
+    <w:unhideWhenUsed/>
+    <w:rsid w:val="0078649F"/>
+    <w:pPr>
+      <w:spacing w:after="0" w:line="240" w:lineRule="auto"/>
+    </w:pPr>
+    <w:rPr>
+      <w:rFonts w:ascii="Tahoma" w:hAnsi="Tahoma" w:cs="Tahoma"/>
+      <w:sz w:val="16"/>
+      <w:szCs w:val="16"/>
+    </w:rPr>
+  </w:style>
+  <w:style w:type="character" w:customStyle="1" w:styleId="BalloonTextChar">
+    <w:name w:val="Balloon Text Char"/>
+    <w:basedOn w:val="DefaultParagraphFont"/>
+    <w:link w:val="BalloonText"/>
+    <w:uiPriority w:val="99"/>
+    <w:semiHidden/>
+    <w:rsid w:val="0078649F"/>
+    <w:rPr>
+      <w:rFonts w:ascii="Tahoma" w:hAnsi="Tahoma" w:cs="Tahoma"/>
+      <w:sz w:val="16"/>
+      <w:szCs w:val="16"/>
     </w:rPr>
   </w:style>
 </w:styles>

</xml_diff>